<commit_message>
docs: expand course report and capture rust agent workflow
</commit_message>
<xml_diff>
--- a/Rust课程大作业实验报告.docx
+++ b/Rust课程大作业实验报告.docx
@@ -131,15 +131,18 @@
       </w:tblPr>
       <w:tblGrid>
         <w:gridCol w:w="2100"/>
-        <w:gridCol w:w="6200"/>
+        <w:gridCol w:w="2521"/>
+        <w:gridCol w:w="3679"/>
+        <w:gridCol w:w="942"/>
       </w:tblGrid>
       <w:tr>
+        <w:trPr>
+          <w:gridAfter w:val="1"/>
+          <w:wAfter w:w="942" w:type="dxa"/>
+        </w:trPr>
         <w:tc>
           <w:tcPr>
             <w:tcW w:w="2100" w:type="dxa"/>
-            <w:tcBorders>
-              <w:bottom w:val="single" w:sz="4" w:space="0" w:color="auto"/>
-            </w:tcBorders>
             <w:shd w:val="clear" w:color="auto" w:fill="E6E6E6"/>
             <w:vAlign w:val="center"/>
           </w:tcPr>
@@ -163,7 +166,8 @@
         <w:tc>
           <w:tcPr>
             <w:tcW w:w="6200" w:type="dxa"/>
-            <w:shd w:val="clear" w:color="auto" w:fill="auto"/>
+            <w:gridSpan w:val="2"/>
+            <w:shd w:val="clear" w:color="auto" w:fill="FFFFCC"/>
             <w:vAlign w:val="center"/>
           </w:tcPr>
           <w:p>
@@ -173,6 +177,65 @@
             </w:pPr>
             <w:r>
               <w:t>Rust 程序设计</w:t>
+            </w:r>
+          </w:p>
+        </w:tc>
+      </w:tr>
+      <w:tr>
+        <w:tblPrEx>
+          <w:tblBorders>
+            <w:top w:val="none" w:sz="0" w:space="0" w:color="auto"/>
+            <w:left w:val="none" w:sz="0" w:space="0" w:color="auto"/>
+            <w:bottom w:val="none" w:sz="0" w:space="0" w:color="auto"/>
+            <w:right w:val="none" w:sz="0" w:space="0" w:color="auto"/>
+            <w:insideH w:val="none" w:sz="0" w:space="0" w:color="auto"/>
+            <w:insideV w:val="none" w:sz="0" w:space="0" w:color="auto"/>
+          </w:tblBorders>
+          <w:tblCellMar>
+            <w:top w:w="0" w:type="dxa"/>
+            <w:left w:w="108" w:type="dxa"/>
+            <w:bottom w:w="0" w:type="dxa"/>
+            <w:right w:w="108" w:type="dxa"/>
+          </w:tblCellMar>
+        </w:tblPrEx>
+        <w:tc>
+          <w:tcPr>
+            <w:tcW w:w="4621" w:type="dxa"/>
+            <w:gridSpan w:val="2"/>
+            <w:vAlign w:val="center"/>
+          </w:tcPr>
+          <w:p>
+            <w:pPr>
+              <w:ind w:left="420"/>
+              <w:jc w:val="left"/>
+            </w:pPr>
+            <w:r>
+              <w:rPr>
+                <w:rFonts w:hint="eastAsia"/>
+              </w:rPr>
+              <w:t>项目类型</w:t>
+            </w:r>
+          </w:p>
+        </w:tc>
+        <w:tc>
+          <w:tcPr>
+            <w:tcW w:w="4621" w:type="dxa"/>
+            <w:gridSpan w:val="2"/>
+            <w:vAlign w:val="center"/>
+          </w:tcPr>
+          <w:p>
+            <w:pPr>
+              <w:ind w:left="420"/>
+              <w:jc w:val="left"/>
+            </w:pPr>
+            <w:r>
+              <w:rPr>
+                <w:rFonts w:hint="eastAsia"/>
+              </w:rPr>
+              <w:t>课程大作业</w:t>
+            </w:r>
+            <w:r>
+              <w:t xml:space="preserve"> / 软件系统开发</w:t>
             </w:r>
           </w:p>
         </w:tc>
@@ -182,197 +245,121 @@
       <w:tblPr>
         <w:tblStyle w:val="a"/>
         <w:tblW w:w="0" w:type="auto"/>
-        <w:tblInd w:w="12" w:type="dxa"/>
-        <w:tblBorders>
-          <w:top w:val="single" w:sz="4" w:space="0" w:color="auto"/>
-          <w:left w:val="single" w:sz="4" w:space="0" w:color="auto"/>
-          <w:bottom w:val="single" w:sz="4" w:space="0" w:color="auto"/>
-          <w:right w:val="single" w:sz="4" w:space="0" w:color="auto"/>
-          <w:insideH w:val="single" w:sz="4" w:space="0" w:color="auto"/>
-          <w:insideV w:val="single" w:sz="4" w:space="0" w:color="auto"/>
-        </w:tblBorders>
         <w:tblLayout w:type="fixed"/>
-        <w:tblCellMar>
-          <w:top w:w="80" w:type="dxa"/>
-          <w:left w:w="120" w:type="dxa"/>
-          <w:bottom w:w="80" w:type="dxa"/>
-          <w:right w:w="120" w:type="dxa"/>
-        </w:tblCellMar>
         <w:tblLook w:val="0000" w:firstRow="0" w:lastRow="0" w:firstColumn="0" w:lastColumn="0" w:noHBand="0" w:noVBand="0"/>
       </w:tblPr>
       <w:tblGrid>
-        <w:gridCol w:w="2100"/>
-        <w:gridCol w:w="6200"/>
+        <w:gridCol w:w="4621"/>
+        <w:gridCol w:w="4621"/>
       </w:tblGrid>
       <w:tr>
-        <w:tc>
-          <w:tcPr>
-            <w:tcW w:w="2100" w:type="dxa"/>
-            <w:tcBorders>
-              <w:bottom w:val="single" w:sz="4" w:space="0" w:color="auto"/>
-            </w:tcBorders>
-            <w:shd w:val="clear" w:color="auto" w:fill="E6E6E6"/>
-            <w:vAlign w:val="center"/>
-          </w:tcPr>
-          <w:p>
-            <w:pPr>
-              <w:ind w:left="420"/>
-              <w:jc w:val="center"/>
-              <w:rPr>
-                <w:b/>
-              </w:rPr>
-            </w:pPr>
-            <w:r>
-              <w:rPr>
-                <w:rFonts w:hint="eastAsia"/>
-                <w:b/>
-              </w:rPr>
-              <w:t>项目类型</w:t>
-            </w:r>
-          </w:p>
-        </w:tc>
-        <w:tc>
-          <w:tcPr>
-            <w:tcW w:w="6200" w:type="dxa"/>
-            <w:tcBorders>
-              <w:bottom w:val="single" w:sz="4" w:space="0" w:color="auto"/>
-            </w:tcBorders>
-            <w:shd w:val="clear" w:color="auto" w:fill="auto"/>
-            <w:vAlign w:val="center"/>
-          </w:tcPr>
-          <w:p>
-            <w:pPr>
-              <w:ind w:left="420"/>
-              <w:jc w:val="left"/>
-            </w:pPr>
-            <w:r>
-              <w:rPr>
-                <w:rFonts w:hint="eastAsia"/>
-              </w:rPr>
-              <w:t>课程大作业</w:t>
-            </w:r>
-            <w:r>
-              <w:t xml:space="preserve"> / 软件系统开发</w:t>
+        <w:tblPrEx>
+          <w:tblCellMar>
+            <w:top w:w="0" w:type="dxa"/>
+            <w:bottom w:w="0" w:type="dxa"/>
+          </w:tblCellMar>
+        </w:tblPrEx>
+        <w:tc>
+          <w:tcPr>
+            <w:tcW w:w="4621" w:type="dxa"/>
+            <w:vAlign w:val="center"/>
+          </w:tcPr>
+          <w:p>
+            <w:pPr>
+              <w:ind w:left="420"/>
+              <w:jc w:val="left"/>
+            </w:pPr>
+            <w:r>
+              <w:rPr>
+                <w:rFonts w:hint="eastAsia"/>
+              </w:rPr>
+              <w:t>团队成员</w:t>
+            </w:r>
+          </w:p>
+        </w:tc>
+        <w:tc>
+          <w:tcPr>
+            <w:tcW w:w="4621" w:type="dxa"/>
+            <w:vAlign w:val="center"/>
+          </w:tcPr>
+          <w:p>
+            <w:pPr>
+              <w:ind w:left="420"/>
+              <w:jc w:val="left"/>
+            </w:pPr>
+            <w:r>
+              <w:rPr>
+                <w:rFonts w:hint="eastAsia"/>
+              </w:rPr>
+              <w:t>【待填写：姓名】</w:t>
             </w:r>
           </w:p>
         </w:tc>
       </w:tr>
       <w:tr>
-        <w:tc>
-          <w:tcPr>
-            <w:tcW w:w="2100" w:type="dxa"/>
-            <w:tcBorders>
-              <w:bottom w:val="single" w:sz="4" w:space="0" w:color="auto"/>
-            </w:tcBorders>
-            <w:shd w:val="clear" w:color="auto" w:fill="E6E6E6"/>
-            <w:vAlign w:val="center"/>
-          </w:tcPr>
-          <w:p>
-            <w:pPr>
-              <w:ind w:left="420"/>
-              <w:jc w:val="center"/>
-              <w:rPr>
-                <w:b/>
-              </w:rPr>
-            </w:pPr>
-            <w:r>
-              <w:rPr>
-                <w:rFonts w:hint="eastAsia"/>
-                <w:b/>
-              </w:rPr>
-              <w:t>团队成员</w:t>
-            </w:r>
-          </w:p>
-        </w:tc>
-        <w:tc>
-          <w:tcPr>
-            <w:tcW w:w="6200" w:type="dxa"/>
-            <w:tcBorders>
-              <w:bottom w:val="single" w:sz="4" w:space="0" w:color="auto"/>
-            </w:tcBorders>
-            <w:shd w:val="clear" w:color="auto" w:fill="FFFFCC"/>
-            <w:vAlign w:val="center"/>
-          </w:tcPr>
-          <w:p>
-            <w:pPr>
-              <w:ind w:left="420"/>
-              <w:jc w:val="left"/>
-            </w:pPr>
-            <w:r>
-              <w:rPr>
-                <w:rFonts w:hint="eastAsia"/>
-              </w:rPr>
-              <w:t>【待填写：姓名】</w:t>
+        <w:tblPrEx>
+          <w:tblCellMar>
+            <w:top w:w="0" w:type="dxa"/>
+            <w:bottom w:w="0" w:type="dxa"/>
+          </w:tblCellMar>
+        </w:tblPrEx>
+        <w:tc>
+          <w:tcPr>
+            <w:tcW w:w="4621" w:type="dxa"/>
+            <w:vAlign w:val="center"/>
+          </w:tcPr>
+          <w:p>
+            <w:pPr>
+              <w:ind w:left="420"/>
+              <w:jc w:val="left"/>
+            </w:pPr>
+            <w:r>
+              <w:rPr>
+                <w:rFonts w:hint="eastAsia"/>
+              </w:rPr>
+              <w:t>学号</w:t>
+            </w:r>
+          </w:p>
+        </w:tc>
+        <w:tc>
+          <w:tcPr>
+            <w:tcW w:w="4621" w:type="dxa"/>
+            <w:vAlign w:val="center"/>
+          </w:tcPr>
+          <w:p>
+            <w:pPr>
+              <w:ind w:left="420"/>
+              <w:jc w:val="left"/>
+            </w:pPr>
+            <w:r>
+              <w:rPr>
+                <w:rFonts w:hint="eastAsia"/>
+              </w:rPr>
+              <w:t>【待填写：学号】</w:t>
             </w:r>
           </w:p>
         </w:tc>
       </w:tr>
       <w:tr>
-        <w:tc>
-          <w:tcPr>
-            <w:tcW w:w="2100" w:type="dxa"/>
-            <w:tcBorders>
-              <w:bottom w:val="single" w:sz="4" w:space="0" w:color="auto"/>
-            </w:tcBorders>
-            <w:shd w:val="clear" w:color="auto" w:fill="E6E6E6"/>
-            <w:vAlign w:val="center"/>
-          </w:tcPr>
-          <w:p>
-            <w:pPr>
-              <w:ind w:left="420"/>
-              <w:jc w:val="center"/>
-              <w:rPr>
-                <w:b/>
-              </w:rPr>
-            </w:pPr>
-            <w:r>
-              <w:rPr>
-                <w:rFonts w:hint="eastAsia"/>
-                <w:b/>
-              </w:rPr>
-              <w:t>学号</w:t>
-            </w:r>
-          </w:p>
-        </w:tc>
-        <w:tc>
-          <w:tcPr>
-            <w:tcW w:w="6200" w:type="dxa"/>
-            <w:shd w:val="clear" w:color="auto" w:fill="FFFFCC"/>
-            <w:vAlign w:val="center"/>
-          </w:tcPr>
-          <w:p>
-            <w:pPr>
-              <w:ind w:left="420"/>
-              <w:jc w:val="left"/>
-            </w:pPr>
-            <w:r>
-              <w:rPr>
-                <w:rFonts w:hint="eastAsia"/>
-              </w:rPr>
-              <w:t>【待填写：学号】</w:t>
-            </w:r>
-          </w:p>
-        </w:tc>
-      </w:tr>
-      <w:tr>
-        <w:tc>
-          <w:tcPr>
-            <w:tcW w:w="2100" w:type="dxa"/>
-            <w:shd w:val="clear" w:color="auto" w:fill="E6E6E6"/>
-            <w:vAlign w:val="center"/>
-          </w:tcPr>
-          <w:p>
-            <w:pPr>
-              <w:ind w:left="420"/>
-              <w:jc w:val="center"/>
-              <w:rPr>
-                <w:b/>
-              </w:rPr>
-            </w:pPr>
-            <w:r>
-              <w:rPr>
-                <w:rFonts w:hint="eastAsia"/>
-                <w:b/>
+        <w:tblPrEx>
+          <w:tblCellMar>
+            <w:top w:w="0" w:type="dxa"/>
+            <w:bottom w:w="0" w:type="dxa"/>
+          </w:tblCellMar>
+        </w:tblPrEx>
+        <w:tc>
+          <w:tcPr>
+            <w:tcW w:w="4621" w:type="dxa"/>
+            <w:vAlign w:val="center"/>
+          </w:tcPr>
+          <w:p>
+            <w:pPr>
+              <w:ind w:left="420"/>
+              <w:jc w:val="left"/>
+            </w:pPr>
+            <w:r>
+              <w:rPr>
+                <w:rFonts w:hint="eastAsia"/>
               </w:rPr>
               <w:t>完成日期</w:t>
             </w:r>
@@ -380,8 +367,7 @@
         </w:tc>
         <w:tc>
           <w:tcPr>
-            <w:tcW w:w="6200" w:type="dxa"/>
-            <w:shd w:val="clear" w:color="auto" w:fill="auto"/>
+            <w:tcW w:w="4621" w:type="dxa"/>
             <w:vAlign w:val="center"/>
           </w:tcPr>
           <w:p>
@@ -461,7 +447,7 @@
           <w:rFonts w:hint="eastAsia"/>
         </w:rPr>
       </w:pPr>
-      <w:bookmarkStart w:id="0" w:name="_Toc234967174"/>
+      <w:bookmarkStart w:id="0" w:name="_Toc235221971"/>
       <w:r>
         <w:rPr>
           <w:rFonts w:hint="eastAsia"/>
@@ -488,15 +474,24 @@
     <w:p>
       <w:pPr>
         <w:ind w:left="420"/>
-      </w:pPr>
-      <w:r>
         <w:rPr>
           <w:rFonts w:hint="eastAsia"/>
         </w:rPr>
+      </w:pPr>
+      <w:r>
+        <w:rPr>
+          <w:rFonts w:hint="eastAsia"/>
+        </w:rPr>
         <w:t>实现过程中重点解决了</w:t>
       </w:r>
       <w:r>
-        <w:t xml:space="preserve"> Agent 只回答不执行、工具调用后提前结束、重复调用陷入循环、长文件读取被截断、Todo 仅展示不驱动任务、跨会话状态边界不清晰等问题。系统采用模块化架构和事件驱动 UI，将 LLM 通信、消息协议、工具注册、状态管理和界面渲染分离。当前工程包含 26 个 Rust 源文件、约 5240 行 Rust 代码；cargo test 共执行 11 项测试，全部通过。实验结果表明，该系统已经具备完整的“理解请求—制定计划—调用工具—观察结果—继续决策—验证完成—总结输出”闭环。</w:t>
+        <w:t xml:space="preserve"> Agent 只回答不执行、工具调用后提前结束、重复调用陷入循环、长文件读取被截断、Todo 仅展示不驱动任务、跨会话状态边界不清晰、Skill 清单与真实文件不一致等问题。系统采用模块化架构和事件驱动 UI，将 LLM 通信、消息协议、工具注册、状态管理和界面渲染分离。当前工程包含 25 个 Rust 源文件、约 5675 行 Rust 代码；cargo test 共执行 13 项测试，全部通过，cargo clippy 在警告视为错误的模式下通过。实验结果表明，该系统已经具备完整的</w:t>
+      </w:r>
+      <w:r>
+        <w:rPr>
+          <w:rFonts w:hint="eastAsia"/>
+        </w:rPr>
+        <w:t>“理解请求—制定计划—调用工具—观察结果—继续决策—验证完成—总结输出”闭环。</w:t>
       </w:r>
     </w:p>
     <w:p>
@@ -532,7 +527,7 @@
           <w:rFonts w:hint="eastAsia"/>
         </w:rPr>
       </w:pPr>
-      <w:bookmarkStart w:id="1" w:name="_Toc234967175"/>
+      <w:bookmarkStart w:id="1" w:name="_Toc235221972"/>
       <w:r>
         <w:rPr>
           <w:rFonts w:hint="eastAsia"/>
@@ -558,7 +553,7 @@
         <w:fldChar w:fldCharType="begin"/>
       </w:r>
       <w:r>
-        <w:instrText xml:space="preserve"> TOC \o "1-3" </w:instrText>
+        <w:instrText xml:space="preserve"> TOC \o "1-2" </w:instrText>
       </w:r>
       <w:r>
         <w:fldChar w:fldCharType="separate"/>
@@ -585,7 +580,7 @@
         <w:rPr>
           <w:noProof/>
         </w:rPr>
-        <w:instrText xml:space="preserve"> PAGEREF _Toc234967174 \h </w:instrText>
+        <w:instrText xml:space="preserve"> PAGEREF _Toc235221971 \h </w:instrText>
       </w:r>
       <w:r>
         <w:rPr>
@@ -646,7 +641,7 @@
         <w:rPr>
           <w:noProof/>
         </w:rPr>
-        <w:instrText xml:space="preserve"> PAGEREF _Toc234967175 \h </w:instrText>
+        <w:instrText xml:space="preserve"> PAGEREF _Toc235221972 \h </w:instrText>
       </w:r>
       <w:r>
         <w:rPr>
@@ -707,7 +702,7 @@
         <w:rPr>
           <w:noProof/>
         </w:rPr>
-        <w:instrText xml:space="preserve"> PAGEREF _Toc234967176 \h </w:instrText>
+        <w:instrText xml:space="preserve"> PAGEREF _Toc235221973 \h </w:instrText>
       </w:r>
       <w:r>
         <w:rPr>
@@ -768,7 +763,7 @@
         <w:rPr>
           <w:noProof/>
         </w:rPr>
-        <w:instrText xml:space="preserve"> PAGEREF _Toc234967177 \h </w:instrText>
+        <w:instrText xml:space="preserve"> PAGEREF _Toc235221974 \h </w:instrText>
       </w:r>
       <w:r>
         <w:rPr>
@@ -829,7 +824,7 @@
         <w:rPr>
           <w:noProof/>
         </w:rPr>
-        <w:instrText xml:space="preserve"> PAGEREF _Toc234967178 \h </w:instrText>
+        <w:instrText xml:space="preserve"> PAGEREF _Toc235221975 \h </w:instrText>
       </w:r>
       <w:r>
         <w:rPr>
@@ -887,7 +882,7 @@
         <w:rPr>
           <w:noProof/>
         </w:rPr>
-        <w:instrText xml:space="preserve"> PAGEREF _Toc234967179 \h </w:instrText>
+        <w:instrText xml:space="preserve"> PAGEREF _Toc235221976 \h </w:instrText>
       </w:r>
       <w:r>
         <w:rPr>
@@ -945,7 +940,7 @@
         <w:rPr>
           <w:noProof/>
         </w:rPr>
-        <w:instrText xml:space="preserve"> PAGEREF _Toc234967180 \h </w:instrText>
+        <w:instrText xml:space="preserve"> PAGEREF _Toc235221977 \h </w:instrText>
       </w:r>
       <w:r>
         <w:rPr>
@@ -1003,7 +998,7 @@
         <w:rPr>
           <w:noProof/>
         </w:rPr>
-        <w:instrText xml:space="preserve"> PAGEREF _Toc234967181 \h </w:instrText>
+        <w:instrText xml:space="preserve"> PAGEREF _Toc235221978 \h </w:instrText>
       </w:r>
       <w:r>
         <w:rPr>
@@ -1065,7 +1060,7 @@
         <w:rPr>
           <w:noProof/>
         </w:rPr>
-        <w:instrText xml:space="preserve"> PAGEREF _Toc234967182 \h </w:instrText>
+        <w:instrText xml:space="preserve"> PAGEREF _Toc235221979 \h </w:instrText>
       </w:r>
       <w:r>
         <w:rPr>
@@ -1123,7 +1118,7 @@
         <w:rPr>
           <w:noProof/>
         </w:rPr>
-        <w:instrText xml:space="preserve"> PAGEREF _Toc234967183 \h </w:instrText>
+        <w:instrText xml:space="preserve"> PAGEREF _Toc235221980 \h </w:instrText>
       </w:r>
       <w:r>
         <w:rPr>
@@ -1181,7 +1176,7 @@
         <w:rPr>
           <w:noProof/>
         </w:rPr>
-        <w:instrText xml:space="preserve"> PAGEREF _Toc234967184 \h </w:instrText>
+        <w:instrText xml:space="preserve"> PAGEREF _Toc235221981 \h </w:instrText>
       </w:r>
       <w:r>
         <w:rPr>
@@ -1239,7 +1234,7 @@
         <w:rPr>
           <w:noProof/>
         </w:rPr>
-        <w:instrText xml:space="preserve"> PAGEREF _Toc234967185 \h </w:instrText>
+        <w:instrText xml:space="preserve"> PAGEREF _Toc235221982 \h </w:instrText>
       </w:r>
       <w:r>
         <w:rPr>
@@ -1297,7 +1292,7 @@
         <w:rPr>
           <w:noProof/>
         </w:rPr>
-        <w:instrText xml:space="preserve"> PAGEREF _Toc234967186 \h </w:instrText>
+        <w:instrText xml:space="preserve"> PAGEREF _Toc235221983 \h </w:instrText>
       </w:r>
       <w:r>
         <w:rPr>
@@ -1355,7 +1350,7 @@
         <w:rPr>
           <w:noProof/>
         </w:rPr>
-        <w:instrText xml:space="preserve"> PAGEREF _Toc234967187 \h </w:instrText>
+        <w:instrText xml:space="preserve"> PAGEREF _Toc235221984 \h </w:instrText>
       </w:r>
       <w:r>
         <w:rPr>
@@ -1413,7 +1408,7 @@
         <w:rPr>
           <w:noProof/>
         </w:rPr>
-        <w:instrText xml:space="preserve"> PAGEREF _Toc234967188 \h </w:instrText>
+        <w:instrText xml:space="preserve"> PAGEREF _Toc235221985 \h </w:instrText>
       </w:r>
       <w:r>
         <w:rPr>
@@ -1471,7 +1466,7 @@
         <w:rPr>
           <w:noProof/>
         </w:rPr>
-        <w:instrText xml:space="preserve"> PAGEREF _Toc234967189 \h </w:instrText>
+        <w:instrText xml:space="preserve"> PAGEREF _Toc235221986 \h </w:instrText>
       </w:r>
       <w:r>
         <w:rPr>
@@ -1529,7 +1524,7 @@
         <w:rPr>
           <w:noProof/>
         </w:rPr>
-        <w:instrText xml:space="preserve"> PAGEREF _Toc234967190 \h </w:instrText>
+        <w:instrText xml:space="preserve"> PAGEREF _Toc235221987 \h </w:instrText>
       </w:r>
       <w:r>
         <w:rPr>
@@ -1587,7 +1582,7 @@
         <w:rPr>
           <w:noProof/>
         </w:rPr>
-        <w:instrText xml:space="preserve"> PAGEREF _Toc234967191 \h </w:instrText>
+        <w:instrText xml:space="preserve"> PAGEREF _Toc235221988 \h </w:instrText>
       </w:r>
       <w:r>
         <w:rPr>
@@ -1648,7 +1643,7 @@
         <w:rPr>
           <w:noProof/>
         </w:rPr>
-        <w:instrText xml:space="preserve"> PAGEREF _Toc234967192 \h </w:instrText>
+        <w:instrText xml:space="preserve"> PAGEREF _Toc235221989 \h </w:instrText>
       </w:r>
       <w:r>
         <w:rPr>
@@ -1706,7 +1701,7 @@
         <w:rPr>
           <w:noProof/>
         </w:rPr>
-        <w:instrText xml:space="preserve"> PAGEREF _Toc234967193 \h </w:instrText>
+        <w:instrText xml:space="preserve"> PAGEREF _Toc235221990 \h </w:instrText>
       </w:r>
       <w:r>
         <w:rPr>
@@ -1764,7 +1759,7 @@
         <w:rPr>
           <w:noProof/>
         </w:rPr>
-        <w:instrText xml:space="preserve"> PAGEREF _Toc234967194 \h </w:instrText>
+        <w:instrText xml:space="preserve"> PAGEREF _Toc235221991 \h </w:instrText>
       </w:r>
       <w:r>
         <w:rPr>
@@ -1781,7 +1776,7 @@
         <w:rPr>
           <w:noProof/>
         </w:rPr>
-        <w:t>11</w:t>
+        <w:t>12</w:t>
       </w:r>
       <w:r>
         <w:rPr>
@@ -1822,7 +1817,7 @@
         <w:rPr>
           <w:noProof/>
         </w:rPr>
-        <w:instrText xml:space="preserve"> PAGEREF _Toc234967195 \h </w:instrText>
+        <w:instrText xml:space="preserve"> PAGEREF _Toc235221992 \h </w:instrText>
       </w:r>
       <w:r>
         <w:rPr>
@@ -1880,7 +1875,65 @@
         <w:rPr>
           <w:noProof/>
         </w:rPr>
-        <w:instrText xml:space="preserve"> PAGEREF _Toc234967196 \h </w:instrText>
+        <w:instrText xml:space="preserve"> PAGEREF _Toc235221993 \h </w:instrText>
+      </w:r>
+      <w:r>
+        <w:rPr>
+          <w:noProof/>
+        </w:rPr>
+      </w:r>
+      <w:r>
+        <w:rPr>
+          <w:noProof/>
+        </w:rPr>
+        <w:fldChar w:fldCharType="separate"/>
+      </w:r>
+      <w:r>
+        <w:rPr>
+          <w:noProof/>
+        </w:rPr>
+        <w:t>13</w:t>
+      </w:r>
+      <w:r>
+        <w:rPr>
+          <w:noProof/>
+        </w:rPr>
+        <w:fldChar w:fldCharType="end"/>
+      </w:r>
+    </w:p>
+    <w:p>
+      <w:pPr>
+        <w:pStyle w:val="TOC2"/>
+        <w:tabs>
+          <w:tab w:val="right" w:leader="dot" w:pos="9016"/>
+        </w:tabs>
+        <w:rPr>
+          <w:noProof/>
+        </w:rPr>
+      </w:pPr>
+      <w:r>
+        <w:rPr>
+          <w:noProof/>
+        </w:rPr>
+        <w:t>5.5 开发过程、困难与知识总结</w:t>
+      </w:r>
+      <w:r>
+        <w:rPr>
+          <w:noProof/>
+        </w:rPr>
+        <w:tab/>
+      </w:r>
+      <w:r>
+        <w:rPr>
+          <w:noProof/>
+        </w:rPr>
+        <w:fldChar w:fldCharType="begin"/>
+      </w:r>
+      <w:r>
+        <w:rPr>
+          <w:noProof/>
+        </w:rPr>
+        <w:instrText xml:space="preserve"> PAGEREF _Toc235221994 \h </w:instrText>
       </w:r>
       <w:r>
         <w:rPr>
@@ -1941,7 +1994,7 @@
         <w:rPr>
           <w:noProof/>
         </w:rPr>
-        <w:instrText xml:space="preserve"> PAGEREF _Toc234967197 \h </w:instrText>
+        <w:instrText xml:space="preserve"> PAGEREF _Toc235221995 \h </w:instrText>
       </w:r>
       <w:r>
         <w:rPr>
@@ -1958,7 +2011,7 @@
         <w:rPr>
           <w:noProof/>
         </w:rPr>
-        <w:t>13</w:t>
+        <w:t>15</w:t>
       </w:r>
       <w:r>
         <w:rPr>
@@ -1999,7 +2052,7 @@
         <w:rPr>
           <w:noProof/>
         </w:rPr>
-        <w:instrText xml:space="preserve"> PAGEREF _Toc234967198 \h </w:instrText>
+        <w:instrText xml:space="preserve"> PAGEREF _Toc235221996 \h </w:instrText>
       </w:r>
       <w:r>
         <w:rPr>
@@ -2016,7 +2069,7 @@
         <w:rPr>
           <w:noProof/>
         </w:rPr>
-        <w:t>13</w:t>
+        <w:t>15</w:t>
       </w:r>
       <w:r>
         <w:rPr>
@@ -2057,7 +2110,7 @@
         <w:rPr>
           <w:noProof/>
         </w:rPr>
-        <w:instrText xml:space="preserve"> PAGEREF _Toc234967199 \h </w:instrText>
+        <w:instrText xml:space="preserve"> PAGEREF _Toc235221997 \h </w:instrText>
       </w:r>
       <w:r>
         <w:rPr>
@@ -2074,7 +2127,7 @@
         <w:rPr>
           <w:noProof/>
         </w:rPr>
-        <w:t>14</w:t>
+        <w:t>15</w:t>
       </w:r>
       <w:r>
         <w:rPr>
@@ -2118,7 +2171,7 @@
         <w:rPr>
           <w:noProof/>
         </w:rPr>
-        <w:instrText xml:space="preserve"> PAGEREF _Toc234967200 \h </w:instrText>
+        <w:instrText xml:space="preserve"> PAGEREF _Toc235221998 \h </w:instrText>
       </w:r>
       <w:r>
         <w:rPr>
@@ -2135,7 +2188,7 @@
         <w:rPr>
           <w:noProof/>
         </w:rPr>
-        <w:t>14</w:t>
+        <w:t>16</w:t>
       </w:r>
       <w:r>
         <w:rPr>
@@ -2179,7 +2232,7 @@
         <w:rPr>
           <w:noProof/>
         </w:rPr>
-        <w:instrText xml:space="preserve"> PAGEREF _Toc234967201 \h </w:instrText>
+        <w:instrText xml:space="preserve"> PAGEREF _Toc235221999 \h </w:instrText>
       </w:r>
       <w:r>
         <w:rPr>
@@ -2196,7 +2249,7 @@
         <w:rPr>
           <w:noProof/>
         </w:rPr>
-        <w:t>14</w:t>
+        <w:t>16</w:t>
       </w:r>
       <w:r>
         <w:rPr>
@@ -2240,7 +2293,7 @@
         <w:rPr>
           <w:noProof/>
         </w:rPr>
-        <w:instrText xml:space="preserve"> PAGEREF _Toc234967202 \h </w:instrText>
+        <w:instrText xml:space="preserve"> PAGEREF _Toc235222000 \h </w:instrText>
       </w:r>
       <w:r>
         <w:rPr>
@@ -2257,7 +2310,7 @@
         <w:rPr>
           <w:noProof/>
         </w:rPr>
-        <w:t>16</w:t>
+        <w:t>17</w:t>
       </w:r>
       <w:r>
         <w:rPr>
@@ -2301,7 +2354,7 @@
         <w:rPr>
           <w:noProof/>
         </w:rPr>
-        <w:instrText xml:space="preserve"> PAGEREF _Toc234967203 \h </w:instrText>
+        <w:instrText xml:space="preserve"> PAGEREF _Toc235222001 \h </w:instrText>
       </w:r>
       <w:r>
         <w:rPr>
@@ -2318,7 +2371,7 @@
         <w:rPr>
           <w:noProof/>
         </w:rPr>
-        <w:t>16</w:t>
+        <w:t>18</w:t>
       </w:r>
       <w:r>
         <w:rPr>
@@ -2333,15 +2386,6 @@
       </w:pPr>
       <w:r>
         <w:fldChar w:fldCharType="end"/>
-      </w:r>
-    </w:p>
-    <w:p>
-      <w:pPr>
-        <w:spacing w:after="0" w:line="240" w:lineRule="auto"/>
-        <w:ind w:left="420"/>
-      </w:pPr>
-      <w:r>
-        <w:br w:type="page"/>
       </w:r>
     </w:p>
     <w:p>
@@ -2351,7 +2395,7 @@
         <w:ind w:left="420"/>
         <w:jc w:val="left"/>
       </w:pPr>
-      <w:bookmarkStart w:id="2" w:name="_Toc234967176"/>
+      <w:bookmarkStart w:id="2" w:name="_Toc235221973"/>
       <w:r>
         <w:lastRenderedPageBreak/>
         <w:t>1 项目名称</w:t>
@@ -2462,7 +2506,7 @@
         <w:ind w:left="420"/>
         <w:jc w:val="left"/>
       </w:pPr>
-      <w:bookmarkStart w:id="3" w:name="_Toc234967177"/>
+      <w:bookmarkStart w:id="3" w:name="_Toc235221974"/>
       <w:r>
         <w:t>2 团队成员与分工</w:t>
       </w:r>
@@ -2513,6 +2557,7 @@
       </w:tblGrid>
       <w:tr>
         <w:trPr>
+          <w:cantSplit/>
           <w:tblHeader/>
         </w:trPr>
         <w:tc>
@@ -2652,6 +2697,9 @@
         <w:gridCol w:w="4700"/>
       </w:tblGrid>
       <w:tr>
+        <w:trPr>
+          <w:cantSplit/>
+        </w:trPr>
         <w:tc>
           <w:tcPr>
             <w:tcW w:w="720" w:type="dxa"/>
@@ -2757,6 +2805,9 @@
         </w:tc>
       </w:tr>
       <w:tr>
+        <w:trPr>
+          <w:cantSplit/>
+        </w:trPr>
         <w:tc>
           <w:tcPr>
             <w:tcW w:w="720" w:type="dxa"/>
@@ -2855,6 +2906,9 @@
         </w:tc>
       </w:tr>
       <w:tr>
+        <w:trPr>
+          <w:cantSplit/>
+        </w:trPr>
         <w:tc>
           <w:tcPr>
             <w:tcW w:w="720" w:type="dxa"/>
@@ -2953,6 +3007,9 @@
         </w:tc>
       </w:tr>
       <w:tr>
+        <w:trPr>
+          <w:cantSplit/>
+        </w:trPr>
         <w:tc>
           <w:tcPr>
             <w:tcW w:w="720" w:type="dxa"/>
@@ -3060,7 +3117,7 @@
         <w:ind w:left="420"/>
         <w:jc w:val="left"/>
       </w:pPr>
-      <w:bookmarkStart w:id="4" w:name="_Toc234967178"/>
+      <w:bookmarkStart w:id="4" w:name="_Toc235221975"/>
       <w:r>
         <w:t>3 项目背景与目标</w:t>
       </w:r>
@@ -3073,7 +3130,7 @@
         <w:ind w:left="420"/>
         <w:jc w:val="left"/>
       </w:pPr>
-      <w:bookmarkStart w:id="5" w:name="_Toc234967179"/>
+      <w:bookmarkStart w:id="5" w:name="_Toc235221976"/>
       <w:r>
         <w:t>3.1 项目背景</w:t>
       </w:r>
@@ -3115,7 +3172,7 @@
         <w:ind w:left="420"/>
         <w:jc w:val="left"/>
       </w:pPr>
-      <w:bookmarkStart w:id="6" w:name="_Toc234967180"/>
+      <w:bookmarkStart w:id="6" w:name="_Toc235221977"/>
       <w:r>
         <w:t>3.2 项目目标</w:t>
       </w:r>
@@ -3224,7 +3281,7 @@
         <w:ind w:left="420"/>
         <w:jc w:val="left"/>
       </w:pPr>
-      <w:bookmarkStart w:id="7" w:name="_Toc234967181"/>
+      <w:bookmarkStart w:id="7" w:name="_Toc235221978"/>
       <w:r>
         <w:t>3.3 预期功能与验收标准</w:t>
       </w:r>
@@ -3708,7 +3765,7 @@
               <w:rPr>
                 <w:sz w:val="18"/>
               </w:rPr>
-              <w:t xml:space="preserve"> RAG 外部资料源和 MCP 工具桥接</w:t>
+              <w:t xml:space="preserve"> RAG 外部资料源、文件化 Skill 和动态 MCP 工具桥接</w:t>
             </w:r>
           </w:p>
         </w:tc>
@@ -3731,7 +3788,7 @@
                 <w:rFonts w:hint="eastAsia"/>
                 <w:sz w:val="18"/>
               </w:rPr>
-              <w:t>已实现基础版</w:t>
+              <w:t>已实现</w:t>
             </w:r>
           </w:p>
         </w:tc>
@@ -3821,7 +3878,7 @@
         <w:ind w:left="420"/>
         <w:jc w:val="left"/>
       </w:pPr>
-      <w:bookmarkStart w:id="8" w:name="_Toc234967182"/>
+      <w:bookmarkStart w:id="8" w:name="_Toc235221979"/>
       <w:r>
         <w:t>4 系统设计与实现思路</w:t>
       </w:r>
@@ -3834,7 +3891,7 @@
         <w:ind w:left="420"/>
         <w:jc w:val="left"/>
       </w:pPr>
-      <w:bookmarkStart w:id="9" w:name="_Toc234967183"/>
+      <w:bookmarkStart w:id="9" w:name="_Toc235221980"/>
       <w:r>
         <w:t>4.1 技术选型</w:t>
       </w:r>
@@ -3852,6 +3909,7 @@
           <w:insideH w:val="single" w:sz="4" w:space="0" w:color="auto"/>
           <w:insideV w:val="single" w:sz="4" w:space="0" w:color="auto"/>
         </w:tblBorders>
+        <w:shd w:val="clear" w:color="auto" w:fill="E6E6E6"/>
         <w:tblLayout w:type="fixed"/>
         <w:tblCellMar>
           <w:top w:w="80" w:type="dxa"/>
@@ -3959,33 +4017,24 @@
         <w:tblStyle w:val="a"/>
         <w:tblW w:w="0" w:type="auto"/>
         <w:tblInd w:w="12" w:type="dxa"/>
-        <w:tblBorders>
-          <w:top w:val="single" w:sz="4" w:space="0" w:color="auto"/>
-          <w:left w:val="single" w:sz="4" w:space="0" w:color="auto"/>
-          <w:bottom w:val="single" w:sz="4" w:space="0" w:color="auto"/>
-          <w:right w:val="single" w:sz="4" w:space="0" w:color="auto"/>
-          <w:insideH w:val="single" w:sz="4" w:space="0" w:color="auto"/>
-          <w:insideV w:val="single" w:sz="4" w:space="0" w:color="auto"/>
-        </w:tblBorders>
         <w:tblLayout w:type="fixed"/>
-        <w:tblCellMar>
-          <w:top w:w="80" w:type="dxa"/>
-          <w:left w:w="120" w:type="dxa"/>
-          <w:bottom w:w="80" w:type="dxa"/>
-          <w:right w:w="120" w:type="dxa"/>
-        </w:tblCellMar>
         <w:tblLook w:val="0000" w:firstRow="0" w:lastRow="0" w:firstColumn="0" w:lastColumn="0" w:noHBand="0" w:noVBand="0"/>
       </w:tblPr>
       <w:tblGrid>
-        <w:gridCol w:w="2000"/>
-        <w:gridCol w:w="2200"/>
-        <w:gridCol w:w="4820"/>
+        <w:gridCol w:w="3080"/>
+        <w:gridCol w:w="3081"/>
+        <w:gridCol w:w="3081"/>
       </w:tblGrid>
       <w:tr>
-        <w:tc>
-          <w:tcPr>
-            <w:tcW w:w="2000" w:type="dxa"/>
-            <w:shd w:val="clear" w:color="auto" w:fill="auto"/>
+        <w:tblPrEx>
+          <w:tblCellMar>
+            <w:top w:w="0" w:type="dxa"/>
+            <w:bottom w:w="0" w:type="dxa"/>
+          </w:tblCellMar>
+        </w:tblPrEx>
+        <w:tc>
+          <w:tcPr>
+            <w:tcW w:w="3080" w:type="dxa"/>
             <w:vAlign w:val="center"/>
           </w:tcPr>
           <w:p>
@@ -4006,8 +4055,7 @@
         </w:tc>
         <w:tc>
           <w:tcPr>
-            <w:tcW w:w="2200" w:type="dxa"/>
-            <w:shd w:val="clear" w:color="auto" w:fill="auto"/>
+            <w:tcW w:w="3081" w:type="dxa"/>
             <w:vAlign w:val="center"/>
           </w:tcPr>
           <w:p>
@@ -4029,8 +4077,7 @@
         </w:tc>
         <w:tc>
           <w:tcPr>
-            <w:tcW w:w="4820" w:type="dxa"/>
-            <w:shd w:val="clear" w:color="auto" w:fill="auto"/>
+            <w:tcW w:w="3081" w:type="dxa"/>
             <w:vAlign w:val="center"/>
           </w:tcPr>
           <w:p>
@@ -4052,10 +4099,15 @@
         </w:tc>
       </w:tr>
       <w:tr>
-        <w:tc>
-          <w:tcPr>
-            <w:tcW w:w="2000" w:type="dxa"/>
-            <w:shd w:val="clear" w:color="auto" w:fill="auto"/>
+        <w:tblPrEx>
+          <w:tblCellMar>
+            <w:top w:w="0" w:type="dxa"/>
+            <w:bottom w:w="0" w:type="dxa"/>
+          </w:tblCellMar>
+        </w:tblPrEx>
+        <w:tc>
+          <w:tcPr>
+            <w:tcW w:w="3080" w:type="dxa"/>
             <w:vAlign w:val="center"/>
           </w:tcPr>
           <w:p>
@@ -4076,8 +4128,7 @@
         </w:tc>
         <w:tc>
           <w:tcPr>
-            <w:tcW w:w="2200" w:type="dxa"/>
-            <w:shd w:val="clear" w:color="auto" w:fill="auto"/>
+            <w:tcW w:w="3081" w:type="dxa"/>
             <w:vAlign w:val="center"/>
           </w:tcPr>
           <w:p>
@@ -4099,8 +4150,7 @@
         </w:tc>
         <w:tc>
           <w:tcPr>
-            <w:tcW w:w="4820" w:type="dxa"/>
-            <w:shd w:val="clear" w:color="auto" w:fill="auto"/>
+            <w:tcW w:w="3081" w:type="dxa"/>
             <w:vAlign w:val="center"/>
           </w:tcPr>
           <w:p>
@@ -4128,10 +4178,15 @@
         </w:tc>
       </w:tr>
       <w:tr>
-        <w:tc>
-          <w:tcPr>
-            <w:tcW w:w="2000" w:type="dxa"/>
-            <w:shd w:val="clear" w:color="auto" w:fill="auto"/>
+        <w:tblPrEx>
+          <w:tblCellMar>
+            <w:top w:w="0" w:type="dxa"/>
+            <w:bottom w:w="0" w:type="dxa"/>
+          </w:tblCellMar>
+        </w:tblPrEx>
+        <w:tc>
+          <w:tcPr>
+            <w:tcW w:w="3080" w:type="dxa"/>
             <w:vAlign w:val="center"/>
           </w:tcPr>
           <w:p>
@@ -4152,8 +4207,7 @@
         </w:tc>
         <w:tc>
           <w:tcPr>
-            <w:tcW w:w="2200" w:type="dxa"/>
-            <w:shd w:val="clear" w:color="auto" w:fill="auto"/>
+            <w:tcW w:w="3081" w:type="dxa"/>
             <w:vAlign w:val="center"/>
           </w:tcPr>
           <w:p>
@@ -4174,8 +4228,7 @@
         </w:tc>
         <w:tc>
           <w:tcPr>
-            <w:tcW w:w="4820" w:type="dxa"/>
-            <w:shd w:val="clear" w:color="auto" w:fill="auto"/>
+            <w:tcW w:w="3081" w:type="dxa"/>
             <w:vAlign w:val="center"/>
           </w:tcPr>
           <w:p>
@@ -4203,54 +4256,57 @@
         </w:tc>
       </w:tr>
       <w:tr>
-        <w:tc>
-          <w:tcPr>
-            <w:tcW w:w="2000" w:type="dxa"/>
-            <w:shd w:val="clear" w:color="auto" w:fill="auto"/>
-            <w:vAlign w:val="center"/>
-          </w:tcPr>
-          <w:p>
-            <w:pPr>
-              <w:ind w:left="420"/>
-              <w:jc w:val="left"/>
-              <w:rPr>
-                <w:sz w:val="18"/>
-              </w:rPr>
-            </w:pPr>
-            <w:r>
-              <w:rPr>
-                <w:sz w:val="18"/>
-              </w:rPr>
-              <w:t>Serde / serde_json</w:t>
-            </w:r>
-          </w:p>
-        </w:tc>
-        <w:tc>
-          <w:tcPr>
-            <w:tcW w:w="2200" w:type="dxa"/>
-            <w:shd w:val="clear" w:color="auto" w:fill="auto"/>
-            <w:vAlign w:val="center"/>
-          </w:tcPr>
-          <w:p>
-            <w:pPr>
-              <w:ind w:left="420"/>
-              <w:jc w:val="left"/>
-              <w:rPr>
-                <w:sz w:val="18"/>
-              </w:rPr>
-            </w:pPr>
-            <w:r>
-              <w:rPr>
-                <w:sz w:val="18"/>
-              </w:rPr>
-              <w:t>JSON 序列化</w:t>
-            </w:r>
-          </w:p>
-        </w:tc>
-        <w:tc>
-          <w:tcPr>
-            <w:tcW w:w="4820" w:type="dxa"/>
-            <w:shd w:val="clear" w:color="auto" w:fill="auto"/>
+        <w:tblPrEx>
+          <w:tblCellMar>
+            <w:top w:w="0" w:type="dxa"/>
+            <w:bottom w:w="0" w:type="dxa"/>
+          </w:tblCellMar>
+        </w:tblPrEx>
+        <w:tc>
+          <w:tcPr>
+            <w:tcW w:w="3080" w:type="dxa"/>
+            <w:vAlign w:val="center"/>
+          </w:tcPr>
+          <w:p>
+            <w:pPr>
+              <w:ind w:left="420"/>
+              <w:jc w:val="left"/>
+              <w:rPr>
+                <w:sz w:val="18"/>
+              </w:rPr>
+            </w:pPr>
+            <w:r>
+              <w:rPr>
+                <w:sz w:val="18"/>
+              </w:rPr>
+              <w:t>Serde / serde_json / serde_yaml</w:t>
+            </w:r>
+          </w:p>
+        </w:tc>
+        <w:tc>
+          <w:tcPr>
+            <w:tcW w:w="3081" w:type="dxa"/>
+            <w:vAlign w:val="center"/>
+          </w:tcPr>
+          <w:p>
+            <w:pPr>
+              <w:ind w:left="420"/>
+              <w:jc w:val="left"/>
+              <w:rPr>
+                <w:sz w:val="18"/>
+              </w:rPr>
+            </w:pPr>
+            <w:r>
+              <w:rPr>
+                <w:sz w:val="18"/>
+              </w:rPr>
+              <w:t>JSON 与 YAML 序列化</w:t>
+            </w:r>
+          </w:p>
+        </w:tc>
+        <w:tc>
+          <w:tcPr>
+            <w:tcW w:w="3081" w:type="dxa"/>
             <w:vAlign w:val="center"/>
           </w:tcPr>
           <w:p>
@@ -4272,16 +4328,21 @@
               <w:rPr>
                 <w:sz w:val="18"/>
               </w:rPr>
-              <w:t>Memory、RAG 和 MCP 数据结构</w:t>
+              <w:t>Memory、RAG、MCP 和文件化 Skill frontmatter</w:t>
             </w:r>
           </w:p>
         </w:tc>
       </w:tr>
       <w:tr>
-        <w:tc>
-          <w:tcPr>
-            <w:tcW w:w="2000" w:type="dxa"/>
-            <w:shd w:val="clear" w:color="auto" w:fill="auto"/>
+        <w:tblPrEx>
+          <w:tblCellMar>
+            <w:top w:w="0" w:type="dxa"/>
+            <w:bottom w:w="0" w:type="dxa"/>
+          </w:tblCellMar>
+        </w:tblPrEx>
+        <w:tc>
+          <w:tcPr>
+            <w:tcW w:w="3080" w:type="dxa"/>
             <w:vAlign w:val="center"/>
           </w:tcPr>
           <w:p>
@@ -4302,8 +4363,7 @@
         </w:tc>
         <w:tc>
           <w:tcPr>
-            <w:tcW w:w="2200" w:type="dxa"/>
-            <w:shd w:val="clear" w:color="auto" w:fill="auto"/>
+            <w:tcW w:w="3081" w:type="dxa"/>
             <w:vAlign w:val="center"/>
           </w:tcPr>
           <w:p>
@@ -4325,8 +4385,7 @@
         </w:tc>
         <w:tc>
           <w:tcPr>
-            <w:tcW w:w="4820" w:type="dxa"/>
-            <w:shd w:val="clear" w:color="auto" w:fill="auto"/>
+            <w:tcW w:w="3081" w:type="dxa"/>
             <w:vAlign w:val="center"/>
           </w:tcPr>
           <w:p>
@@ -4354,10 +4413,93 @@
         </w:tc>
       </w:tr>
       <w:tr>
-        <w:tc>
-          <w:tcPr>
-            <w:tcW w:w="2000" w:type="dxa"/>
-            <w:shd w:val="clear" w:color="auto" w:fill="auto"/>
+        <w:tblPrEx>
+          <w:tblCellMar>
+            <w:top w:w="0" w:type="dxa"/>
+            <w:bottom w:w="0" w:type="dxa"/>
+          </w:tblCellMar>
+        </w:tblPrEx>
+        <w:tc>
+          <w:tcPr>
+            <w:tcW w:w="3080" w:type="dxa"/>
+            <w:vAlign w:val="center"/>
+          </w:tcPr>
+          <w:p>
+            <w:pPr>
+              <w:ind w:left="420"/>
+              <w:jc w:val="left"/>
+              <w:rPr>
+                <w:sz w:val="18"/>
+              </w:rPr>
+            </w:pPr>
+            <w:r>
+              <w:rPr>
+                <w:sz w:val="18"/>
+              </w:rPr>
+              <w:t>rmcp</w:t>
+            </w:r>
+          </w:p>
+        </w:tc>
+        <w:tc>
+          <w:tcPr>
+            <w:tcW w:w="3081" w:type="dxa"/>
+            <w:vAlign w:val="center"/>
+          </w:tcPr>
+          <w:p>
+            <w:pPr>
+              <w:ind w:left="420"/>
+              <w:jc w:val="left"/>
+              <w:rPr>
+                <w:sz w:val="18"/>
+              </w:rPr>
+            </w:pPr>
+            <w:r>
+              <w:rPr>
+                <w:sz w:val="18"/>
+              </w:rPr>
+              <w:t>MCP 协议桥接</w:t>
+            </w:r>
+          </w:p>
+        </w:tc>
+        <w:tc>
+          <w:tcPr>
+            <w:tcW w:w="3081" w:type="dxa"/>
+            <w:vAlign w:val="center"/>
+          </w:tcPr>
+          <w:p>
+            <w:pPr>
+              <w:ind w:left="420"/>
+              <w:jc w:val="left"/>
+              <w:rPr>
+                <w:sz w:val="18"/>
+              </w:rPr>
+            </w:pPr>
+            <w:r>
+              <w:rPr>
+                <w:rFonts w:hint="eastAsia"/>
+                <w:sz w:val="18"/>
+              </w:rPr>
+              <w:t>通过官方</w:t>
+            </w:r>
+            <w:r>
+              <w:rPr>
+                <w:sz w:val="18"/>
+              </w:rPr>
+              <w:t xml:space="preserve"> SDK 建立持久 stdio 连接、发现和调用外部工具</w:t>
+            </w:r>
+          </w:p>
+        </w:tc>
+      </w:tr>
+      <w:tr>
+        <w:tblPrEx>
+          <w:tblCellMar>
+            <w:top w:w="0" w:type="dxa"/>
+            <w:bottom w:w="0" w:type="dxa"/>
+          </w:tblCellMar>
+        </w:tblPrEx>
+        <w:tc>
+          <w:tcPr>
+            <w:tcW w:w="3080" w:type="dxa"/>
             <w:vAlign w:val="center"/>
           </w:tcPr>
           <w:p>
@@ -4378,8 +4520,7 @@
         </w:tc>
         <w:tc>
           <w:tcPr>
-            <w:tcW w:w="2200" w:type="dxa"/>
-            <w:shd w:val="clear" w:color="auto" w:fill="auto"/>
+            <w:tcW w:w="3081" w:type="dxa"/>
             <w:vAlign w:val="center"/>
           </w:tcPr>
           <w:p>
@@ -4401,8 +4542,7 @@
         </w:tc>
         <w:tc>
           <w:tcPr>
-            <w:tcW w:w="4820" w:type="dxa"/>
-            <w:shd w:val="clear" w:color="auto" w:fill="auto"/>
+            <w:tcW w:w="3081" w:type="dxa"/>
             <w:vAlign w:val="center"/>
           </w:tcPr>
           <w:p>
@@ -4452,7 +4592,7 @@
         <w:ind w:left="420"/>
         <w:jc w:val="left"/>
       </w:pPr>
-      <w:bookmarkStart w:id="10" w:name="_Toc234967184"/>
+      <w:bookmarkStart w:id="10" w:name="_Toc235221981"/>
       <w:r>
         <w:lastRenderedPageBreak/>
         <w:t>4.2 总体架构</w:t>
@@ -4937,7 +5077,7 @@
         <w:ind w:left="420"/>
         <w:jc w:val="left"/>
       </w:pPr>
-      <w:bookmarkStart w:id="11" w:name="_Toc234967185"/>
+      <w:bookmarkStart w:id="11" w:name="_Toc235221982"/>
       <w:r>
         <w:t>4.3 目录与模块职责</w:t>
       </w:r>
@@ -5476,7 +5616,7 @@
         <w:ind w:left="420"/>
         <w:jc w:val="left"/>
       </w:pPr>
-      <w:bookmarkStart w:id="12" w:name="_Toc234967186"/>
+      <w:bookmarkStart w:id="12" w:name="_Toc235221983"/>
       <w:r>
         <w:t>4.4 核心数据结构</w:t>
       </w:r>
@@ -5845,7 +5985,7 @@
         <w:ind w:left="420"/>
         <w:jc w:val="left"/>
       </w:pPr>
-      <w:bookmarkStart w:id="13" w:name="_Toc234967187"/>
+      <w:bookmarkStart w:id="13" w:name="_Toc235221984"/>
       <w:r>
         <w:t>4.5 Agent 核心执行算法</w:t>
       </w:r>
@@ -6455,7 +6595,7 @@
         <w:ind w:left="420"/>
         <w:jc w:val="left"/>
       </w:pPr>
-      <w:bookmarkStart w:id="14" w:name="_Toc234967188"/>
+      <w:bookmarkStart w:id="14" w:name="_Toc235221985"/>
       <w:r>
         <w:t>4.6 工具注册与安全边界</w:t>
       </w:r>
@@ -6561,7 +6701,7 @@
         <w:ind w:left="420"/>
         <w:jc w:val="left"/>
       </w:pPr>
-      <w:bookmarkStart w:id="15" w:name="_Toc234967189"/>
+      <w:bookmarkStart w:id="15" w:name="_Toc235221986"/>
       <w:r>
         <w:t>4.7 Memory、Todo、Skill 与 Sub-Agent</w:t>
       </w:r>
@@ -6580,7 +6720,7 @@
         <w:ind w:left="420"/>
       </w:pPr>
       <w:r>
-        <w:t>Skill 通过额外 system prompt 切换 Rust 教师、代码审查和规划等模式。Sub-Agent 具有独立消息历史、角色提示词、工具白名单和最大轮次；主 Agent 可以派遣 rust_teacher、reviewer、planner、researcher，子代理完成后只返回总结，避免把大量中间工具结果塞入主上下文。</w:t>
+        <w:t>Skill 通过 `.agents/skills/*/SKILL.md` 文件发现，解析 YAML frontmatter 得到真实清单，再由 `skill_load` 按需加载完整正文；`skill_list` 专门用于回答 Skill 数量和目录问题，避免模型依据提示词猜测。当前包含 code-review、rust-teacher、task-planner 和 rust-agent-project。Sub-Agent 具有独立消息历史、角色提示词、工具白名单和最大轮次；主 Agent 可以派遣 rust_teacher、reviewer、planner、researcher，子代理完成后只返回总结，避免把大量中间工具结果塞入主上下文。</w:t>
       </w:r>
     </w:p>
     <w:p>
@@ -6590,7 +6730,7 @@
         <w:ind w:left="420"/>
         <w:jc w:val="left"/>
       </w:pPr>
-      <w:bookmarkStart w:id="16" w:name="_Toc234967190"/>
+      <w:bookmarkStart w:id="16" w:name="_Toc235221987"/>
       <w:r>
         <w:t>4.8 RAG、MCP 与 Web Search</w:t>
       </w:r>
@@ -6601,7 +6741,7 @@
         <w:ind w:left="420"/>
       </w:pPr>
       <w:r>
-        <w:t>RAG 面向用户添加的外部资料源，而不是默认检索 Agent 自身代码。用户可配置外部课程资料、笔记或参考代码文件夹，按需建立索引并检索。MCP 模块通过 JSON-RPC 与外部 Server 交互，为系统提供统一的外部工具桥接。Web Search 优先调用 Brave Search API；未配置 BRAVE_SEARCH_API_KEY 时自动回退到 DuckDuckGo Lite，降低使用门槛。</w:t>
+        <w:t>RAG 面向用户添加的外部资料源，而不是默认检索 Agent 自身代码。用户可配置外部课程资料、笔记或参考代码文件夹，按需建立索引并检索。MCP 模块使用官方 `rmcp` SDK 建立持久 stdio 连接，完成初始化后调用 `tools/list`，把远程工具动态映射为 `mcp__server__tool`，再以普通 Function Calling 工具交给模型。Web Search 优先调用 Brave Search API；未配置 BRAVE_SEARCH_API_KEY 时自动回退到 DuckDuckGo Lite，降低使用门槛。</w:t>
       </w:r>
     </w:p>
     <w:p>
@@ -6611,7 +6751,7 @@
         <w:ind w:left="420"/>
         <w:jc w:val="left"/>
       </w:pPr>
-      <w:bookmarkStart w:id="17" w:name="_Toc234967191"/>
+      <w:bookmarkStart w:id="17" w:name="_Toc235221988"/>
       <w:r>
         <w:t>4.9 CLI/TUI 共享事件模型</w:t>
       </w:r>
@@ -6622,11 +6762,17 @@
         <w:ind w:left="420"/>
       </w:pPr>
       <w:r>
-        <w:t xml:space="preserve">Agent 不直接打印终端，而是返回 AgentTurnResult，并在执行过程中通过 observer 发出 AgentEvent。CLI 将事件转换为普通文本；TUI 则把同一事件渲染为用户、思考、Agent、工具、错误等不同区块。这样既保留了简单可靠的 CLI，也避免 TUI 复制 Agent 逻辑。TUI </w:t>
-      </w:r>
-      <w:r>
         <w:lastRenderedPageBreak/>
-        <w:t>采用左侧对话执行流、右侧会话/Todo 状态、底部输入框的布局，支持 PgUp/PgDown、方向键、Home/End 滚动和 Markdown 渲染。</w:t>
+        <w:t>Agent 不直接打印终端，而是返回 AgentTurnResult，并在执行过程中通过 observer 发出 AgentEvent。CLI 将事件转换为普通文本；TUI 则由 Tokio 后台任务执行 Agent，通过 mpsc 接收同一事件流，把它渲染为用户、思考、Agent、工具、错误和运行时快照等区块。这样既保留了简单可靠的 CLI，也避免 TUI 复制 Agent 逻辑。TUI 采用左侧对话执行流、右侧真实会话状态、底部输入框的布局，支持 PgUp/PgDown、方向键、Home/End 滚动</w:t>
+      </w:r>
+      <w:r>
+        <w:rPr>
+          <w:rFonts w:hint="eastAsia"/>
+        </w:rPr>
+        <w:t>和</w:t>
+      </w:r>
+      <w:r>
+        <w:t xml:space="preserve"> Markdown 渲染。</w:t>
       </w:r>
     </w:p>
     <w:p>
@@ -6636,7 +6782,7 @@
         <w:ind w:left="420"/>
         <w:jc w:val="left"/>
       </w:pPr>
-      <w:bookmarkStart w:id="18" w:name="_Toc234967192"/>
+      <w:bookmarkStart w:id="18" w:name="_Toc235221989"/>
       <w:r>
         <w:t>5 实验结果</w:t>
       </w:r>
@@ -6649,7 +6795,7 @@
         <w:ind w:left="420"/>
         <w:jc w:val="left"/>
       </w:pPr>
-      <w:bookmarkStart w:id="19" w:name="_Toc234967193"/>
+      <w:bookmarkStart w:id="19" w:name="_Toc235221990"/>
       <w:r>
         <w:t>5.1 编译与自动化测试</w:t>
       </w:r>
@@ -6667,7 +6813,7 @@
         <w:t>实验环境为</w:t>
       </w:r>
       <w:r>
-        <w:t xml:space="preserve"> Windows PowerShell，使用 Rust 2024 Edition。2026 年 7 月 14 日执行格式化、静态检查和单元测试，结果如下。</w:t>
+        <w:t xml:space="preserve"> Windows PowerShell，使用 Rust 2024 Edition。2026 年 7 月 17 日执行格式化、类型检查、Clippy 静态检查、单元测试和 Git 差异检查，结果如下。</w:t>
       </w:r>
     </w:p>
     <w:tbl>
@@ -6846,7 +6992,7 @@
               <w:rPr>
                 <w:sz w:val="19"/>
               </w:rPr>
-              <w:t>cargo fmt</w:t>
+              <w:t>cargo fmt --all -- --check</w:t>
             </w:r>
           </w:p>
         </w:tc>
@@ -6964,7 +7110,7 @@
                 <w:rFonts w:hint="eastAsia"/>
                 <w:sz w:val="19"/>
               </w:rPr>
-              <w:t>单元测试</w:t>
+              <w:t>静态检查</w:t>
             </w:r>
           </w:p>
         </w:tc>
@@ -6986,7 +7132,7 @@
               <w:rPr>
                 <w:sz w:val="19"/>
               </w:rPr>
-              <w:t>cargo test</w:t>
+              <w:t>cargo clippy --all-targets -- -D warnings</w:t>
             </w:r>
           </w:p>
         </w:tc>
@@ -7006,9 +7152,10 @@
             </w:pPr>
             <w:r>
               <w:rPr>
+                <w:rFonts w:hint="eastAsia"/>
                 <w:sz w:val="19"/>
               </w:rPr>
-              <w:t>11 passed; 0 failed</w:t>
+              <w:t>通过</w:t>
             </w:r>
           </w:p>
         </w:tc>
@@ -7033,7 +7180,7 @@
                 <w:rFonts w:hint="eastAsia"/>
                 <w:sz w:val="19"/>
               </w:rPr>
-              <w:t>工程规模</w:t>
+              <w:t>单元测试</w:t>
             </w:r>
           </w:p>
         </w:tc>
@@ -7053,16 +7200,9 @@
             </w:pPr>
             <w:r>
               <w:rPr>
-                <w:rFonts w:hint="eastAsia"/>
                 <w:sz w:val="19"/>
               </w:rPr>
-              <w:t>统计</w:t>
-            </w:r>
-            <w:r>
-              <w:rPr>
-                <w:sz w:val="19"/>
-              </w:rPr>
-              <w:t xml:space="preserve"> src/**/*.rs</w:t>
+              <w:t>cargo test</w:t>
             </w:r>
           </w:p>
         </w:tc>
@@ -7084,7 +7224,83 @@
               <w:rPr>
                 <w:sz w:val="19"/>
               </w:rPr>
-              <w:t>26 个 Rust 文件，约 5240 行</w:t>
+              <w:t>13 passed; 0 failed</w:t>
+            </w:r>
+          </w:p>
+        </w:tc>
+      </w:tr>
+      <w:tr>
+        <w:tc>
+          <w:tcPr>
+            <w:tcW w:w="2100" w:type="dxa"/>
+            <w:shd w:val="clear" w:color="auto" w:fill="auto"/>
+            <w:vAlign w:val="center"/>
+          </w:tcPr>
+          <w:p>
+            <w:pPr>
+              <w:ind w:left="420"/>
+              <w:jc w:val="left"/>
+              <w:rPr>
+                <w:sz w:val="19"/>
+              </w:rPr>
+            </w:pPr>
+            <w:r>
+              <w:rPr>
+                <w:rFonts w:hint="eastAsia"/>
+                <w:sz w:val="19"/>
+              </w:rPr>
+              <w:t>工程规模</w:t>
+            </w:r>
+          </w:p>
+        </w:tc>
+        <w:tc>
+          <w:tcPr>
+            <w:tcW w:w="3700" w:type="dxa"/>
+            <w:shd w:val="clear" w:color="auto" w:fill="auto"/>
+            <w:vAlign w:val="center"/>
+          </w:tcPr>
+          <w:p>
+            <w:pPr>
+              <w:ind w:left="420"/>
+              <w:jc w:val="left"/>
+              <w:rPr>
+                <w:sz w:val="19"/>
+              </w:rPr>
+            </w:pPr>
+            <w:r>
+              <w:rPr>
+                <w:rFonts w:hint="eastAsia"/>
+                <w:sz w:val="19"/>
+              </w:rPr>
+              <w:t>统计</w:t>
+            </w:r>
+            <w:r>
+              <w:rPr>
+                <w:sz w:val="19"/>
+              </w:rPr>
+              <w:t xml:space="preserve"> src/**/*.rs</w:t>
+            </w:r>
+          </w:p>
+        </w:tc>
+        <w:tc>
+          <w:tcPr>
+            <w:tcW w:w="3220" w:type="dxa"/>
+            <w:shd w:val="clear" w:color="auto" w:fill="auto"/>
+            <w:vAlign w:val="center"/>
+          </w:tcPr>
+          <w:p>
+            <w:pPr>
+              <w:ind w:left="420"/>
+              <w:jc w:val="left"/>
+              <w:rPr>
+                <w:sz w:val="19"/>
+              </w:rPr>
+            </w:pPr>
+            <w:r>
+              <w:rPr>
+                <w:sz w:val="19"/>
+              </w:rPr>
+              <w:t>25 个 Rust 文件，约 5675 行</w:t>
             </w:r>
           </w:p>
         </w:tc>
@@ -7134,7 +7350,7 @@
                 <w:rFonts w:ascii="Consolas" w:hAnsi="Consolas"/>
                 <w:sz w:val="18"/>
               </w:rPr>
-              <w:t>running 11 tests</w:t>
+              <w:t>running 13 tests</w:t>
             </w:r>
           </w:p>
           <w:p>
@@ -7151,7 +7367,7 @@
                 <w:rFonts w:ascii="Consolas" w:hAnsi="Consolas"/>
                 <w:sz w:val="18"/>
               </w:rPr>
-              <w:t>test result: ok. 11 passed; 0 failed; 0 ignored; 0 measured; 0 filtered out</w:t>
+              <w:t>test result: ok. 13 passed; 0 failed; 0 ignored; 0 measured; 0 filtered out</w:t>
             </w:r>
           </w:p>
         </w:tc>
@@ -7174,7 +7390,11 @@
         <w:t>测试覆盖</w:t>
       </w:r>
       <w:r>
-        <w:t xml:space="preserve"> Todo 会话隔离、Todo 状态约束、.env 引号解析、分段文件读取、Git 路径越界拒绝、项目文本搜索、仓库地图和工作区指令加载等关键行为。</w:t>
+        <w:t xml:space="preserve"> Todo 会话隔离、Todo 状态约束、.env 引号解析、分段文件读取、Git 路径越界拒绝、项目文本搜索、仓库地图、工作区指令加载和 Skill 文件发现等关键行为。Windows </w:t>
+      </w:r>
+      <w:r>
+        <w:lastRenderedPageBreak/>
+        <w:t>上偶尔出现 incremental cache 无法 hard link 的警告，但它属于文件系统缓存性能提示，不影响编译、测试和功能结果。</w:t>
       </w:r>
     </w:p>
     <w:p>
@@ -7184,7 +7404,7 @@
         <w:ind w:left="420"/>
         <w:jc w:val="left"/>
       </w:pPr>
-      <w:bookmarkStart w:id="20" w:name="_Toc234967194"/>
+      <w:bookmarkStart w:id="20" w:name="_Toc235221991"/>
       <w:r>
         <w:t>5.2 功能验证</w:t>
       </w:r>
@@ -7421,7 +7641,6 @@
                 <w:rFonts w:hint="eastAsia"/>
                 <w:sz w:val="17"/>
               </w:rPr>
-              <w:lastRenderedPageBreak/>
               <w:t>修改与验证</w:t>
             </w:r>
           </w:p>
@@ -7870,7 +8089,7 @@
         <w:ind w:left="420"/>
         <w:jc w:val="left"/>
       </w:pPr>
-      <w:bookmarkStart w:id="21" w:name="_Toc234967195"/>
+      <w:bookmarkStart w:id="21" w:name="_Toc235221992"/>
       <w:r>
         <w:t>5.3 运行示例</w:t>
       </w:r>
@@ -8098,6 +8317,7 @@
                 <w:rFonts w:ascii="Consolas" w:hAnsi="Consolas"/>
                 <w:sz w:val="18"/>
               </w:rPr>
+              <w:lastRenderedPageBreak/>
               <w:t>Agent</w:t>
             </w:r>
             <w:r>
@@ -8151,12 +8371,164 @@
         <w:ind w:left="420"/>
         <w:jc w:val="left"/>
       </w:pPr>
-      <w:bookmarkStart w:id="22" w:name="_Toc234967196"/>
-      <w:r>
+      <w:bookmarkStart w:id="22" w:name="_Toc235221993"/>
+      <w:r>
+        <w:t>5.4 已知限制与后续计划</w:t>
+      </w:r>
+      <w:bookmarkEnd w:id="22"/>
+    </w:p>
+    <w:p>
+      <w:pPr>
+        <w:spacing w:after="80"/>
+        <w:ind w:left="420"/>
+        <w:jc w:val="left"/>
+      </w:pPr>
+      <w:r>
+        <w:rPr>
+          <w:rFonts w:hint="eastAsia"/>
+        </w:rPr>
+        <w:t>当前最终回答仍以完整响应返回，尚未实现</w:t>
+      </w:r>
+      <w:r>
+        <w:t xml:space="preserve"> DeepSeek SSE token 级流式输出。</w:t>
+      </w:r>
+    </w:p>
+    <w:p>
+      <w:pPr>
+        <w:spacing w:after="80"/>
+        <w:ind w:left="420"/>
+        <w:jc w:val="left"/>
+      </w:pPr>
+      <w:r>
+        <w:t>RAG 当前以本地切片和关键词评分为主，后续可接入 embedding 与向量数据库。</w:t>
+      </w:r>
+    </w:p>
+    <w:p>
+      <w:pPr>
+        <w:spacing w:after="80"/>
+        <w:ind w:left="420"/>
+        <w:jc w:val="left"/>
+      </w:pPr>
+      <w:r>
+        <w:t>MCP 已使用官方 rmcp 完成长连接式 stdio 工具桥接，后续可增加通知刷新、更多传输方式和更完整的权限控制。</w:t>
+      </w:r>
+    </w:p>
+    <w:p>
+      <w:pPr>
+        <w:spacing w:after="80"/>
+        <w:ind w:left="420"/>
+        <w:jc w:val="left"/>
+      </w:pPr>
+      <w:r>
+        <w:rPr>
+          <w:rFonts w:hint="eastAsia"/>
+        </w:rPr>
+        <w:t>子代理当前顺序执行，尚未实现多个独立子任务并行派遣和</w:t>
+      </w:r>
+      <w:r>
+        <w:t xml:space="preserve"> Agent Team。</w:t>
+      </w:r>
+    </w:p>
+    <w:p>
+      <w:pPr>
+        <w:spacing w:after="80"/>
+        <w:ind w:left="420"/>
+        <w:jc w:val="left"/>
+      </w:pPr>
+      <w:r>
+        <w:rPr>
+          <w:rFonts w:hint="eastAsia"/>
+        </w:rPr>
+        <w:t>写文件和命令执行已有工作区</w:t>
+      </w:r>
+      <w:r>
+        <w:t>/白名单限制，但高风险操作仍可增加逐次确认策略。</w:t>
+      </w:r>
+    </w:p>
+    <w:p>
+      <w:pPr>
+        <w:spacing w:after="80"/>
+        <w:ind w:left="420"/>
+        <w:jc w:val="left"/>
+      </w:pPr>
+      <w:r>
+        <w:t>TUI 已支持滚动和 Markdown，但还可加入命令面板、会话恢复和更细粒度流式事件。</w:t>
+      </w:r>
+    </w:p>
+    <w:p>
+      <w:pPr>
+        <w:pStyle w:val="2"/>
+        <w:keepNext w:val="0"/>
+        <w:ind w:left="420"/>
+        <w:jc w:val="left"/>
+      </w:pPr>
+      <w:bookmarkStart w:id="23" w:name="_Toc235221994"/>
+      <w:r>
+        <w:t>5.5 开发过程、困难与知识总结</w:t>
+      </w:r>
+      <w:bookmarkEnd w:id="23"/>
+    </w:p>
+    <w:p>
+      <w:pPr>
+        <w:ind w:left="420"/>
+        <w:rPr>
+          <w:rFonts w:hint="eastAsia"/>
+        </w:rPr>
+      </w:pPr>
+      <w:r>
+        <w:rPr>
+          <w:rFonts w:hint="eastAsia"/>
+        </w:rPr>
+        <w:t>项目采用“先跑通最小闭环，再逐层扩展”的方式推进。第一阶段完成</w:t>
+      </w:r>
+      <w:r>
+        <w:t xml:space="preserve"> DeepSeek 对话和本地工具注册；第二阶段把文本形式的工具请求升级为原生 tool_calls / role=tool 协议，并加入工具结果回填后的继续决策；第三阶段补充文件写入、Git、Web、Memory、Todo、Sub-Agent、RAG 和 Hook；第四阶段抽离 CLI/TUI 共享事件模型；第五阶段实现文件化 Skill、官方 rmcp MCP 桥接、动态运行时状态和提交版本保护。每个阶段都通过编译、测试和文档同步保持可回退</w:t>
+      </w:r>
+      <w:r>
+        <w:rPr>
+          <w:rFonts w:hint="eastAsia"/>
+        </w:rPr>
+        <w:t>。</w:t>
+      </w:r>
+    </w:p>
+    <w:p>
+      <w:pPr>
+        <w:pStyle w:val="3"/>
+        <w:keepNext w:val="0"/>
+        <w:spacing w:before="200" w:after="100"/>
+        <w:ind w:left="420"/>
+        <w:jc w:val="left"/>
+      </w:pPr>
+      <w:r>
+        <w:t>5.5.1 主要困难与解决方法</w:t>
+      </w:r>
+    </w:p>
+    <w:p>
+      <w:pPr>
+        <w:spacing w:after="80"/>
+        <w:ind w:left="420"/>
+        <w:jc w:val="left"/>
+      </w:pPr>
+      <w:r>
+        <w:t>Windows 环境最初出现 link.exe not found。原因是 MSVC 目标依赖 Visual C++ 链接器，而 VS Code 不是编译工具链；安装 Visual Studio Build Tools 的 C++ 工作负载和 Windows SDK 后恢复编译。</w:t>
+      </w:r>
+    </w:p>
+    <w:p>
+      <w:pPr>
+        <w:spacing w:after="80"/>
+        <w:ind w:left="420"/>
+        <w:jc w:val="left"/>
+      </w:pPr>
+      <w:r>
+        <w:rPr>
+          <w:rFonts w:hint="eastAsia"/>
+        </w:rPr>
         <w:lastRenderedPageBreak/>
-        <w:t>5.4 已知限制与后续计划</w:t>
-      </w:r>
-      <w:bookmarkEnd w:id="22"/>
+        <w:t>程序最初不会自动读取</w:t>
+      </w:r>
+      <w:r>
+        <w:t xml:space="preserve"> .env，导致用户明明填写密钥仍收到环境变量缺失错误。随后实现系统环境变量、当前目录 .env 和用户目录全局配置的分层读取，并保持密钥不进入 Git。</w:t>
+      </w:r>
     </w:p>
     <w:p>
       <w:pPr>
@@ -8165,13 +8537,33 @@
         <w:jc w:val="left"/>
       </w:pPr>
       <w:r>
+        <w:t>Agent 曾经在工具执行后直接结束。根因是只执行了模型输出，却没有把 tool result 按调用 ID写回消息历史；修复后形成 assistant tool_calls、执行工具、role=tool、再次请求模型的闭环。</w:t>
+      </w:r>
+    </w:p>
+    <w:p>
+      <w:pPr>
+        <w:spacing w:after="80"/>
+        <w:ind w:left="420"/>
+        <w:jc w:val="left"/>
+      </w:pPr>
+      <w:r>
+        <w:t>TUI 曾出现输入框重复、光标偏移、内容不能继续滚动和 Todo 跨新会话残留。通过单一输入框、独立 transcript 滚动偏移、后台任务事件通道和会话初始化清理解决。</w:t>
+      </w:r>
+    </w:p>
+    <w:p>
+      <w:pPr>
+        <w:spacing w:after="80"/>
+        <w:ind w:left="420"/>
+        <w:jc w:val="left"/>
+      </w:pPr>
+      <w:r>
         <w:rPr>
           <w:rFonts w:hint="eastAsia"/>
         </w:rPr>
-        <w:t>当前最终回答仍以完整响应返回，尚未实现</w:t>
-      </w:r>
-      <w:r>
-        <w:t xml:space="preserve"> DeepSeek SSE token 级流式输出。</w:t>
+        <w:t>模型曾根据</w:t>
+      </w:r>
+      <w:r>
+        <w:t xml:space="preserve"> system prompt 误报 Skill 数量。新增 skill_list 工具，让清单问题必须读取真实文件发现结果；skill_load 只在需要时加载完整正文，避免启动上下文膨胀。</w:t>
       </w:r>
     </w:p>
     <w:p>
@@ -8181,7 +8573,19 @@
         <w:jc w:val="left"/>
       </w:pPr>
       <w:r>
-        <w:t>RAG 当前以本地切片和关键词评分为主，后续可接入 embedding 与向量数据库。</w:t>
+        <w:t>MCP 早期手写一次性 JSON-RPC 桥接难以处理初始化、超时和动态工具。改用官方 rmcp 的持久 stdio 客户端，在启动时发现工具，在调用时统一映射到普通 Function Calling。</w:t>
+      </w:r>
+    </w:p>
+    <w:p>
+      <w:pPr>
+        <w:pStyle w:val="3"/>
+        <w:keepNext w:val="0"/>
+        <w:spacing w:before="200" w:after="100"/>
+        <w:ind w:left="420"/>
+        <w:jc w:val="left"/>
+      </w:pPr>
+      <w:r>
+        <w:t>5.5.2 本次项目形成的 Rust 知识</w:t>
       </w:r>
     </w:p>
     <w:p>
@@ -8191,7 +8595,13 @@
         <w:jc w:val="left"/>
       </w:pPr>
       <w:r>
-        <w:t>MCP 为基础桥接版本，后续可增加长连接、工具列表缓存和更完整的权限控制。</w:t>
+        <w:rPr>
+          <w:rFonts w:hint="eastAsia"/>
+        </w:rPr>
+        <w:t>所有权、借用和可变性：</w:t>
+      </w:r>
+      <w:r>
+        <w:t>Agent 持有多个状态模块，事件观察器借用执行过程，必须明确区分拥有数据和临时引用。</w:t>
       </w:r>
     </w:p>
     <w:p>
@@ -8201,13 +8611,43 @@
         <w:jc w:val="left"/>
       </w:pPr>
       <w:r>
+        <w:t>Result、? 和 anyhow::Context：网络、文件、JSON、进程和 MCP 调用都可能失败，错误应向上传播并补充发生位置，而不是静默吞掉。</w:t>
+      </w:r>
+    </w:p>
+    <w:p>
+      <w:pPr>
+        <w:spacing w:after="80"/>
+        <w:ind w:left="420"/>
+        <w:jc w:val="left"/>
+      </w:pPr>
+      <w:r>
+        <w:t>Serde 类型化数据：用结构体和 JSON Schema 表示 API 消息、工具参数、Todo、Skill frontmatter 和 MCP 工具，减少字符串拼接带来的协议错误。</w:t>
+      </w:r>
+    </w:p>
+    <w:p>
+      <w:pPr>
+        <w:spacing w:after="80"/>
+        <w:ind w:left="420"/>
+        <w:jc w:val="left"/>
+      </w:pPr>
+      <w:r>
+        <w:t>Tokio async/await 与 mpsc：HTTP 和 MCP 调用不能阻塞 TUI 绘制，通过后台任务和事件通道把执行与渲染解耦。</w:t>
+      </w:r>
+    </w:p>
+    <w:p>
+      <w:pPr>
+        <w:spacing w:after="80"/>
+        <w:ind w:left="420"/>
+        <w:jc w:val="left"/>
+      </w:pPr>
+      <w:r>
         <w:rPr>
           <w:rFonts w:hint="eastAsia"/>
         </w:rPr>
-        <w:t>子代理当前顺序执行，尚未实现多个独立子任务并行派遣和</w:t>
-      </w:r>
-      <w:r>
-        <w:t xml:space="preserve"> Agent Team。</w:t>
+        <w:t>模块系统和依赖方向：将启动、</w:t>
+      </w:r>
+      <w:r>
+        <w:t>LLM、Agent、工具、状态和 UI 分开，避免所有逻辑堆进 main.rs 或形成循环依赖。</w:t>
       </w:r>
     </w:p>
     <w:p>
@@ -8220,20 +8660,24 @@
         <w:rPr>
           <w:rFonts w:hint="eastAsia"/>
         </w:rPr>
-        <w:t>写文件和命令执行已有工作区</w:t>
-      </w:r>
-      <w:r>
-        <w:t>/白名单限制，但高风险操作仍可增加逐次确认策略。</w:t>
-      </w:r>
-    </w:p>
-    <w:p>
-      <w:pPr>
-        <w:spacing w:after="80"/>
-        <w:ind w:left="420"/>
-        <w:jc w:val="left"/>
-      </w:pPr>
-      <w:r>
-        <w:t>TUI 已支持滚动和 Markdown，但还可加入命令面板、会话恢复和更细粒度流式事件。</w:t>
+        <w:t>测试与工程门禁：格式化、</w:t>
+      </w:r>
+      <w:r>
+        <w:t>cargo check、Clippy、单元测试和 git diff --check 共同验证代码质量；报告数据必须来自实际命令，而不是估计。</w:t>
+      </w:r>
+    </w:p>
+    <w:p>
+      <w:pPr>
+        <w:ind w:left="420"/>
+      </w:pPr>
+      <w:r>
+        <w:rPr>
+          <w:rFonts w:hint="eastAsia"/>
+        </w:rPr>
+        <w:t>这次开发还形成了项目内的</w:t>
+      </w:r>
+      <w:r>
+        <w:t xml:space="preserve"> `rust-agent-project` 文件化 Skill。它把架构边界、Agent 闭环、Windows 配置、工具安全、Skill/MCP/TUI 验收和常见故障集中为可按需加载的工程规则，供下一次开发复用。</w:t>
       </w:r>
     </w:p>
     <w:p>
@@ -8243,11 +8687,12 @@
         <w:ind w:left="420"/>
         <w:jc w:val="left"/>
       </w:pPr>
-      <w:bookmarkStart w:id="23" w:name="_Toc234967197"/>
-      <w:r>
+      <w:bookmarkStart w:id="24" w:name="_Toc235221995"/>
+      <w:r>
+        <w:lastRenderedPageBreak/>
         <w:t>6 开源项目参考说明</w:t>
       </w:r>
-      <w:bookmarkEnd w:id="23"/>
+      <w:bookmarkEnd w:id="24"/>
     </w:p>
     <w:p>
       <w:pPr>
@@ -8256,11 +8701,11 @@
         <w:ind w:left="420"/>
         <w:jc w:val="left"/>
       </w:pPr>
-      <w:bookmarkStart w:id="24" w:name="_Toc234967198"/>
+      <w:bookmarkStart w:id="25" w:name="_Toc235221996"/>
       <w:r>
         <w:t>6.1 参考来源与引用方式</w:t>
       </w:r>
-      <w:bookmarkEnd w:id="24"/>
+      <w:bookmarkEnd w:id="25"/>
     </w:p>
     <w:p>
       <w:pPr>
@@ -8756,103 +9201,103 @@
         <w:ind w:left="420"/>
         <w:jc w:val="left"/>
       </w:pPr>
-      <w:bookmarkStart w:id="25" w:name="_Toc234967199"/>
-      <w:r>
+      <w:bookmarkStart w:id="26" w:name="_Toc235221997"/>
+      <w:r>
+        <w:t>6.2 本项目的独立工作与改进</w:t>
+      </w:r>
+      <w:bookmarkEnd w:id="26"/>
+    </w:p>
+    <w:p>
+      <w:pPr>
+        <w:spacing w:after="80"/>
+        <w:ind w:left="420"/>
+        <w:jc w:val="left"/>
+      </w:pPr>
+      <w:r>
+        <w:rPr>
+          <w:rFonts w:hint="eastAsia"/>
+        </w:rPr>
+        <w:t>使用</w:t>
+      </w:r>
+      <w:r>
+        <w:t xml:space="preserve"> Rust 的 Result、Context 和 Serde 将 API、工具参数和本地状态错误显式化。</w:t>
+      </w:r>
+    </w:p>
+    <w:p>
+      <w:pPr>
+        <w:spacing w:after="80"/>
+        <w:ind w:left="420"/>
+        <w:jc w:val="left"/>
+      </w:pPr>
+      <w:r>
+        <w:rPr>
+          <w:rFonts w:hint="eastAsia"/>
+        </w:rPr>
+        <w:t>将</w:t>
+      </w:r>
+      <w:r>
+        <w:t xml:space="preserve"> Agent 核心与 UI 解耦，同一 handle_user_input_stream 同时支持 CLI 与 TUI。</w:t>
+      </w:r>
+    </w:p>
+    <w:p>
+      <w:pPr>
+        <w:spacing w:after="80"/>
+        <w:ind w:left="420"/>
+        <w:jc w:val="left"/>
+      </w:pPr>
+      <w:r>
+        <w:rPr>
+          <w:rFonts w:hint="eastAsia"/>
+        </w:rPr>
+        <w:t>把文件访问限制在启动工作区内，并为命令、</w:t>
+      </w:r>
+      <w:r>
+        <w:t>Git、符号链接和覆盖写入设置安全边界。</w:t>
+      </w:r>
+    </w:p>
+    <w:p>
+      <w:pPr>
+        <w:spacing w:after="80"/>
+        <w:ind w:left="420"/>
+        <w:jc w:val="left"/>
+      </w:pPr>
+      <w:r>
+        <w:rPr>
+          <w:rFonts w:hint="eastAsia"/>
+        </w:rPr>
+        <w:t>解决“模型输出工具</w:t>
+      </w:r>
+      <w:r>
+        <w:t xml:space="preserve"> JSON 但程序不执行”和“执行一次工具后直接结束”的问题，使用原生 tool_calls / role=tool 闭环。</w:t>
+      </w:r>
+    </w:p>
+    <w:p>
+      <w:pPr>
+        <w:spacing w:after="80"/>
+        <w:ind w:left="420"/>
+        <w:jc w:val="left"/>
+        <w:rPr>
+          <w:rFonts w:hint="eastAsia"/>
+        </w:rPr>
+      </w:pPr>
+      <w:r>
+        <w:rPr>
+          <w:rFonts w:hint="eastAsia"/>
+        </w:rPr>
+        <w:t>增加重复工具调用熔断、最大步骤后的最终总结和长上下文压缩，降低无限循环与无结果停止。</w:t>
+      </w:r>
+    </w:p>
+    <w:p>
+      <w:pPr>
+        <w:spacing w:after="80"/>
+        <w:ind w:left="420"/>
+        <w:jc w:val="left"/>
+      </w:pPr>
+      <w:r>
+        <w:rPr>
+          <w:rFonts w:hint="eastAsia"/>
+        </w:rPr>
         <w:lastRenderedPageBreak/>
-        <w:t>6.2 本项目的独立工作与改进</w:t>
-      </w:r>
-      <w:bookmarkEnd w:id="25"/>
-    </w:p>
-    <w:p>
-      <w:pPr>
-        <w:spacing w:after="80"/>
-        <w:ind w:left="420"/>
-        <w:jc w:val="left"/>
-      </w:pPr>
-      <w:r>
-        <w:rPr>
-          <w:rFonts w:hint="eastAsia"/>
-        </w:rPr>
-        <w:t>使用</w:t>
-      </w:r>
-      <w:r>
-        <w:t xml:space="preserve"> Rust 的 Result、Context 和 Serde 将 API、工具参数和本地状态错误显式化。</w:t>
-      </w:r>
-    </w:p>
-    <w:p>
-      <w:pPr>
-        <w:spacing w:after="80"/>
-        <w:ind w:left="420"/>
-        <w:jc w:val="left"/>
-      </w:pPr>
-      <w:r>
-        <w:rPr>
-          <w:rFonts w:hint="eastAsia"/>
-        </w:rPr>
-        <w:t>将</w:t>
-      </w:r>
-      <w:r>
-        <w:t xml:space="preserve"> Agent 核心与 UI 解耦，同一 handle_user_input_stream 同时支持 CLI 与 TUI。</w:t>
-      </w:r>
-    </w:p>
-    <w:p>
-      <w:pPr>
-        <w:spacing w:after="80"/>
-        <w:ind w:left="420"/>
-        <w:jc w:val="left"/>
-      </w:pPr>
-      <w:r>
-        <w:rPr>
-          <w:rFonts w:hint="eastAsia"/>
-        </w:rPr>
-        <w:t>把文件访问限制在启动工作区内，并为命令、</w:t>
-      </w:r>
-      <w:r>
-        <w:t>Git、符号链接和覆盖写入设置安全边界。</w:t>
-      </w:r>
-    </w:p>
-    <w:p>
-      <w:pPr>
-        <w:spacing w:after="80"/>
-        <w:ind w:left="420"/>
-        <w:jc w:val="left"/>
-      </w:pPr>
-      <w:r>
-        <w:rPr>
-          <w:rFonts w:hint="eastAsia"/>
-        </w:rPr>
-        <w:t>解决“模型输出工具</w:t>
-      </w:r>
-      <w:r>
-        <w:t xml:space="preserve"> JSON 但程序不执行”和“执行一次工具后直接结束”的问题，使用原生 tool_calls / role=tool 闭环。</w:t>
-      </w:r>
-    </w:p>
-    <w:p>
-      <w:pPr>
-        <w:spacing w:after="80"/>
-        <w:ind w:left="420"/>
-        <w:jc w:val="left"/>
-        <w:rPr>
-          <w:rFonts w:hint="eastAsia"/>
-        </w:rPr>
-      </w:pPr>
-      <w:r>
-        <w:rPr>
-          <w:rFonts w:hint="eastAsia"/>
-        </w:rPr>
-        <w:t>增加重复工具调用熔断、最大步骤后的最终总结和长上下文压缩，降低无限循环与无结果停止。</w:t>
-      </w:r>
-    </w:p>
-    <w:p>
-      <w:pPr>
-        <w:spacing w:after="80"/>
-        <w:ind w:left="420"/>
-        <w:jc w:val="left"/>
-      </w:pPr>
-      <w:r>
-        <w:rPr>
-          <w:rFonts w:hint="eastAsia"/>
-        </w:rPr>
         <w:t>区分长期</w:t>
       </w:r>
       <w:r>
@@ -8882,11 +9327,11 @@
         <w:ind w:left="420"/>
         <w:jc w:val="left"/>
       </w:pPr>
-      <w:bookmarkStart w:id="26" w:name="_Toc234967200"/>
+      <w:bookmarkStart w:id="27" w:name="_Toc235221998"/>
       <w:r>
         <w:t>7 结论</w:t>
       </w:r>
-      <w:bookmarkEnd w:id="26"/>
+      <w:bookmarkEnd w:id="27"/>
     </w:p>
     <w:p>
       <w:pPr>
@@ -8899,7 +9344,7 @@
         <w:t>本项目完成了一个可实际运行的</w:t>
       </w:r>
       <w:r>
-        <w:t xml:space="preserve"> Rust + DeepSeek 通用 Agent。它已经超越简单聊天机器人：能够依据自然语言自主选择工具、观察执行结果、持续推进 Todo、修改与验证代码，并通过 Memory、Skill、Sub-Agent、RAG 和 MCP 扩展能力。模块化结构和 11 项自动化测试保证了当前版本的可读性与基本可靠性。</w:t>
+        <w:t xml:space="preserve"> Rust + DeepSeek 通用 Agent。它已经超越简单聊天机器人：能够依据自然语言自主选择工具、观察执行结果、持续推进 Todo、修改与验证代码，并通过 Memory、文件化 Skill、Sub-Agent、外部 RAG 和官方 rmcp MCP 桥接扩展能力。模块化结构、13 项自动化测试和 Clippy 清零保证了当前版本的可读性与基本可靠性。</w:t>
       </w:r>
     </w:p>
     <w:p>
@@ -8926,14 +9371,14 @@
           <w:rFonts w:hint="eastAsia"/>
         </w:rPr>
       </w:pPr>
-      <w:bookmarkStart w:id="27" w:name="_Toc234967201"/>
+      <w:bookmarkStart w:id="28" w:name="_Toc235221999"/>
       <w:r>
         <w:rPr>
           <w:rFonts w:hint="eastAsia"/>
         </w:rPr>
         <w:t>参考文献</w:t>
       </w:r>
-      <w:bookmarkEnd w:id="27"/>
+      <w:bookmarkEnd w:id="28"/>
     </w:p>
     <w:p>
       <w:pPr>
@@ -8980,7 +9425,6 @@
         <w:rPr>
           <w:sz w:val="19"/>
         </w:rPr>
-        <w:lastRenderedPageBreak/>
         <w:t>[3] TheSyart. claude-agent-examples. https://github.com/TheSyart/claude-agent-examples</w:t>
       </w:r>
     </w:p>
@@ -9062,6 +9506,22 @@
           <w:sz w:val="19"/>
         </w:rPr>
         <w:t>[8] Tokio Contributors. Tokio Documentation. https://tokio.rs/</w:t>
+      </w:r>
+    </w:p>
+    <w:p>
+      <w:pPr>
+        <w:spacing w:after="80"/>
+        <w:ind w:left="420"/>
+        <w:jc w:val="left"/>
+        <w:rPr>
+          <w:sz w:val="19"/>
+        </w:rPr>
+      </w:pPr>
+      <w:r>
+        <w:rPr>
+          <w:sz w:val="19"/>
+        </w:rPr>
+        <w:t>[9] Rust MCP SDK Contributors. rmcp Documentation. https://docs.rs/rmcp/</w:t>
       </w:r>
     </w:p>
     <w:p>
@@ -9087,24 +9547,7 @@
           <w:color w:val="808080"/>
           <w:sz w:val="18"/>
         </w:rPr>
-        <w:t>2026 年 7 月 14 日。</w:t>
-      </w:r>
-    </w:p>
-    <w:p>
-      <w:pPr>
-        <w:spacing w:after="0" w:line="240" w:lineRule="auto"/>
-        <w:ind w:left="420"/>
-        <w:rPr>
-          <w:color w:val="808080"/>
-          <w:sz w:val="18"/>
-        </w:rPr>
-      </w:pPr>
-      <w:r>
-        <w:rPr>
-          <w:color w:val="808080"/>
-          <w:sz w:val="18"/>
-        </w:rPr>
-        <w:br w:type="page"/>
+        <w:t>2026 年 7 月 17 日。</w:t>
       </w:r>
     </w:p>
     <w:p>
@@ -9114,7 +9557,7 @@
         <w:ind w:left="420"/>
         <w:jc w:val="left"/>
       </w:pPr>
-      <w:bookmarkStart w:id="28" w:name="_Toc234967202"/>
+      <w:bookmarkStart w:id="29" w:name="_Toc235222000"/>
       <w:r>
         <w:rPr>
           <w:rFonts w:hint="eastAsia"/>
@@ -9125,7 +9568,7 @@
       <w:r>
         <w:t xml:space="preserve"> A：3 分钟介绍视频建议讲稿</w:t>
       </w:r>
-      <w:bookmarkEnd w:id="28"/>
+      <w:bookmarkEnd w:id="29"/>
     </w:p>
     <w:tbl>
       <w:tblPr>
@@ -9155,6 +9598,7 @@
       </w:tblGrid>
       <w:tr>
         <w:trPr>
+          <w:cantSplit/>
           <w:tblHeader/>
         </w:trPr>
         <w:tc>
@@ -9262,6 +9706,9 @@
         <w:gridCol w:w="4720"/>
       </w:tblGrid>
       <w:tr>
+        <w:trPr>
+          <w:cantSplit/>
+        </w:trPr>
         <w:tc>
           <w:tcPr>
             <w:tcW w:w="1400" w:type="dxa"/>
@@ -9344,6 +9791,9 @@
         </w:tc>
       </w:tr>
       <w:tr>
+        <w:trPr>
+          <w:cantSplit/>
+        </w:trPr>
         <w:tc>
           <w:tcPr>
             <w:tcW w:w="1400" w:type="dxa"/>
@@ -9419,6 +9869,9 @@
         </w:tc>
       </w:tr>
       <w:tr>
+        <w:trPr>
+          <w:cantSplit/>
+        </w:trPr>
         <w:tc>
           <w:tcPr>
             <w:tcW w:w="1400" w:type="dxa"/>
@@ -9501,6 +9954,9 @@
         </w:tc>
       </w:tr>
       <w:tr>
+        <w:trPr>
+          <w:cantSplit/>
+        </w:trPr>
         <w:tc>
           <w:tcPr>
             <w:tcW w:w="1400" w:type="dxa"/>
@@ -9576,6 +10032,9 @@
         </w:tc>
       </w:tr>
       <w:tr>
+        <w:trPr>
+          <w:cantSplit/>
+        </w:trPr>
         <w:tc>
           <w:tcPr>
             <w:tcW w:w="1400" w:type="dxa"/>
@@ -9651,6 +10110,9 @@
         </w:tc>
       </w:tr>
       <w:tr>
+        <w:trPr>
+          <w:cantSplit/>
+        </w:trPr>
         <w:tc>
           <w:tcPr>
             <w:tcW w:w="1400" w:type="dxa"/>
@@ -9727,12 +10189,15 @@
               <w:rPr>
                 <w:sz w:val="17"/>
               </w:rPr>
-              <w:t>AgentEvent 共享 UI，展示 11 passed; 0 failed</w:t>
+              <w:t>AgentEvent 共享 UI，展示 13 passed; 0 failed 和 Clippy 清零</w:t>
             </w:r>
           </w:p>
         </w:tc>
       </w:tr>
       <w:tr>
+        <w:trPr>
+          <w:cantSplit/>
+        </w:trPr>
         <w:tc>
           <w:tcPr>
             <w:tcW w:w="1400" w:type="dxa"/>
@@ -9811,6 +10276,7 @@
     </w:tbl>
     <w:p>
       <w:pPr>
+        <w:pageBreakBefore/>
         <w:spacing w:after="80"/>
         <w:ind w:left="420"/>
       </w:pPr>
@@ -9822,7 +10288,7 @@
         <w:ind w:left="420"/>
         <w:jc w:val="left"/>
       </w:pPr>
-      <w:bookmarkStart w:id="29" w:name="_Toc234967203"/>
+      <w:bookmarkStart w:id="30" w:name="_Toc235222001"/>
       <w:r>
         <w:rPr>
           <w:rFonts w:hint="eastAsia"/>
@@ -9832,7 +10298,7 @@
       <w:r>
         <w:t xml:space="preserve"> B：提交前检查清单</w:t>
       </w:r>
-      <w:bookmarkEnd w:id="29"/>
+      <w:bookmarkEnd w:id="30"/>
     </w:p>
     <w:p>
       <w:pPr>
@@ -10185,7 +10651,7 @@
 <file path=word/numbering.xml><?xml version="1.0" encoding="utf-8"?>
 <w:numbering xmlns:wpc="http://schemas.microsoft.com/office/word/2010/wordprocessingCanvas" xmlns:cx="http://schemas.microsoft.com/office/drawing/2014/chartex" xmlns:cx1="http://schemas.microsoft.com/office/drawing/2015/9/8/chartex" xmlns:cx2="http://schemas.microsoft.com/office/drawing/2015/10/21/chartex" xmlns:cx3="http://schemas.microsoft.com/office/drawing/2016/5/9/chartex" xmlns:cx4="http://schemas.microsoft.com/office/drawing/2016/5/10/chartex" xmlns:cx5="http://schemas.microsoft.com/office/drawing/2016/5/11/chartex" xmlns:cx6="http://schemas.microsoft.com/office/drawing/2016/5/12/chartex" xmlns:cx7="http://schemas.microsoft.com/office/drawing/2016/5/13/chartex" xmlns:cx8="http://schemas.microsoft.com/office/drawing/2016/5/14/chartex" xmlns:mc="http://schemas.openxmlformats.org/markup-compatibility/2006" xmlns:aink="http://schemas.microsoft.com/office/drawing/2016/ink" xmlns:am3d="http://schemas.microsoft.com/office/drawing/2017/model3d" xmlns:o="urn:schemas-microsoft-com:office:office" xmlns:r="http://schemas.openxmlformats.org/officeDocument/2006/relationships" xmlns:m="http://schemas.openxmlformats.org/officeDocument/2006/math" xmlns:v="urn:schemas-microsoft-com:vml" xmlns:wp14="http://schemas.microsoft.com/office/word/2010/wordprocessingDrawing" xmlns:wp="http://schemas.openxmlformats.org/drawingml/2006/wordprocessingDrawing" xmlns:w10="urn:schemas-microsoft-com:office:word" xmlns:w="http://schemas.openxmlformats.org/wordprocessingml/2006/main" xmlns:w14="http://schemas.microsoft.com/office/word/2010/wordml" xmlns:w15="http://schemas.microsoft.com/office/word/2012/wordml" xmlns:w16cex="http://schemas.microsoft.com/office/word/2018/wordml/cex" xmlns:w16cid="http://schemas.microsoft.com/office/word/2016/wordml/cid" xmlns:w16="http://schemas.microsoft.com/office/word/2018/wordml" xmlns:w16sdtdh="http://schemas.microsoft.com/office/word/2020/wordml/sdtdatahash" xmlns:w16se="http://schemas.microsoft.com/office/word/2015/wordml/symex" xmlns:wpg="http://schemas.microsoft.com/office/word/2010/wordprocessingGroup" xmlns:wpi="http://schemas.microsoft.com/office/word/2010/wordprocessingInk" xmlns:wne="http://schemas.microsoft.com/office/word/2006/wordml" xmlns:wps="http://schemas.microsoft.com/office/word/2010/wordprocessingShape" mc:Ignorable="w14 w15 w16se w16cid w16 w16cex w16sdtdh wp14">
   <w:abstractNum w:abstractNumId="0" w15:restartNumberingAfterBreak="0">
-    <w:nsid w:val="0048752D"/>
+    <w:nsid w:val="030E5289"/>
     <w:multiLevelType w:val="singleLevel"/>
     <w:tmpl w:val="04090001"/>
     <w:lvl w:ilvl="0">
@@ -10202,7 +10668,7 @@
     </w:lvl>
   </w:abstractNum>
   <w:abstractNum w:abstractNumId="1" w15:restartNumberingAfterBreak="0">
-    <w:nsid w:val="01FC3D67"/>
+    <w:nsid w:val="06CC6272"/>
     <w:multiLevelType w:val="singleLevel"/>
     <w:tmpl w:val="04090001"/>
     <w:lvl w:ilvl="0">
@@ -10219,7 +10685,7 @@
     </w:lvl>
   </w:abstractNum>
   <w:abstractNum w:abstractNumId="2" w15:restartNumberingAfterBreak="0">
-    <w:nsid w:val="101A7037"/>
+    <w:nsid w:val="08363CB4"/>
     <w:multiLevelType w:val="singleLevel"/>
     <w:tmpl w:val="04090001"/>
     <w:lvl w:ilvl="0">
@@ -10236,7 +10702,7 @@
     </w:lvl>
   </w:abstractNum>
   <w:abstractNum w:abstractNumId="3" w15:restartNumberingAfterBreak="0">
-    <w:nsid w:val="127E0F49"/>
+    <w:nsid w:val="0AD84219"/>
     <w:multiLevelType w:val="singleLevel"/>
     <w:tmpl w:val="04090001"/>
     <w:lvl w:ilvl="0">
@@ -10253,7 +10719,7 @@
     </w:lvl>
   </w:abstractNum>
   <w:abstractNum w:abstractNumId="4" w15:restartNumberingAfterBreak="0">
-    <w:nsid w:val="13502A00"/>
+    <w:nsid w:val="0B137C3F"/>
     <w:multiLevelType w:val="singleLevel"/>
     <w:tmpl w:val="04090001"/>
     <w:lvl w:ilvl="0">
@@ -10270,7 +10736,7 @@
     </w:lvl>
   </w:abstractNum>
   <w:abstractNum w:abstractNumId="5" w15:restartNumberingAfterBreak="0">
-    <w:nsid w:val="18A06EB3"/>
+    <w:nsid w:val="0C6D739D"/>
     <w:multiLevelType w:val="singleLevel"/>
     <w:tmpl w:val="04090001"/>
     <w:lvl w:ilvl="0">
@@ -10287,7 +10753,7 @@
     </w:lvl>
   </w:abstractNum>
   <w:abstractNum w:abstractNumId="6" w15:restartNumberingAfterBreak="0">
-    <w:nsid w:val="19CD08E1"/>
+    <w:nsid w:val="1689498F"/>
     <w:multiLevelType w:val="singleLevel"/>
     <w:tmpl w:val="04090001"/>
     <w:lvl w:ilvl="0">
@@ -10304,7 +10770,7 @@
     </w:lvl>
   </w:abstractNum>
   <w:abstractNum w:abstractNumId="7" w15:restartNumberingAfterBreak="0">
-    <w:nsid w:val="1A6A1C0F"/>
+    <w:nsid w:val="189669FB"/>
     <w:multiLevelType w:val="singleLevel"/>
     <w:tmpl w:val="04090001"/>
     <w:lvl w:ilvl="0">
@@ -10321,7 +10787,7 @@
     </w:lvl>
   </w:abstractNum>
   <w:abstractNum w:abstractNumId="8" w15:restartNumberingAfterBreak="0">
-    <w:nsid w:val="1BE30179"/>
+    <w:nsid w:val="1AD460AE"/>
     <w:multiLevelType w:val="singleLevel"/>
     <w:tmpl w:val="04090001"/>
     <w:lvl w:ilvl="0">
@@ -10338,7 +10804,7 @@
     </w:lvl>
   </w:abstractNum>
   <w:abstractNum w:abstractNumId="9" w15:restartNumberingAfterBreak="0">
-    <w:nsid w:val="1E84602E"/>
+    <w:nsid w:val="1B4A2072"/>
     <w:multiLevelType w:val="singleLevel"/>
     <w:tmpl w:val="04090001"/>
     <w:lvl w:ilvl="0">
@@ -10355,7 +10821,7 @@
     </w:lvl>
   </w:abstractNum>
   <w:abstractNum w:abstractNumId="10" w15:restartNumberingAfterBreak="0">
-    <w:nsid w:val="24643AA0"/>
+    <w:nsid w:val="1BAE18F8"/>
     <w:multiLevelType w:val="singleLevel"/>
     <w:tmpl w:val="04090001"/>
     <w:lvl w:ilvl="0">
@@ -10372,7 +10838,7 @@
     </w:lvl>
   </w:abstractNum>
   <w:abstractNum w:abstractNumId="11" w15:restartNumberingAfterBreak="0">
-    <w:nsid w:val="24DE1196"/>
+    <w:nsid w:val="1C701964"/>
     <w:multiLevelType w:val="singleLevel"/>
     <w:tmpl w:val="04090001"/>
     <w:lvl w:ilvl="0">
@@ -10389,7 +10855,7 @@
     </w:lvl>
   </w:abstractNum>
   <w:abstractNum w:abstractNumId="12" w15:restartNumberingAfterBreak="0">
-    <w:nsid w:val="2E3610DC"/>
+    <w:nsid w:val="223046F2"/>
     <w:multiLevelType w:val="singleLevel"/>
     <w:tmpl w:val="04090001"/>
     <w:lvl w:ilvl="0">
@@ -10406,7 +10872,7 @@
     </w:lvl>
   </w:abstractNum>
   <w:abstractNum w:abstractNumId="13" w15:restartNumberingAfterBreak="0">
-    <w:nsid w:val="2EB51544"/>
+    <w:nsid w:val="223874BB"/>
     <w:multiLevelType w:val="singleLevel"/>
     <w:tmpl w:val="04090001"/>
     <w:lvl w:ilvl="0">
@@ -10423,7 +10889,7 @@
     </w:lvl>
   </w:abstractNum>
   <w:abstractNum w:abstractNumId="14" w15:restartNumberingAfterBreak="0">
-    <w:nsid w:val="303D5CD7"/>
+    <w:nsid w:val="2B5212A4"/>
     <w:multiLevelType w:val="singleLevel"/>
     <w:tmpl w:val="04090001"/>
     <w:lvl w:ilvl="0">
@@ -10440,7 +10906,7 @@
     </w:lvl>
   </w:abstractNum>
   <w:abstractNum w:abstractNumId="15" w15:restartNumberingAfterBreak="0">
-    <w:nsid w:val="3A533213"/>
+    <w:nsid w:val="2FAB74DE"/>
     <w:multiLevelType w:val="singleLevel"/>
     <w:tmpl w:val="04090001"/>
     <w:lvl w:ilvl="0">
@@ -10457,7 +10923,7 @@
     </w:lvl>
   </w:abstractNum>
   <w:abstractNum w:abstractNumId="16" w15:restartNumberingAfterBreak="0">
-    <w:nsid w:val="3B612B3F"/>
+    <w:nsid w:val="2FF17FE3"/>
     <w:multiLevelType w:val="singleLevel"/>
     <w:tmpl w:val="04090001"/>
     <w:lvl w:ilvl="0">
@@ -10474,7 +10940,7 @@
     </w:lvl>
   </w:abstractNum>
   <w:abstractNum w:abstractNumId="17" w15:restartNumberingAfterBreak="0">
-    <w:nsid w:val="405F390E"/>
+    <w:nsid w:val="329F4BB1"/>
     <w:multiLevelType w:val="singleLevel"/>
     <w:tmpl w:val="04090001"/>
     <w:lvl w:ilvl="0">
@@ -10491,7 +10957,7 @@
     </w:lvl>
   </w:abstractNum>
   <w:abstractNum w:abstractNumId="18" w15:restartNumberingAfterBreak="0">
-    <w:nsid w:val="45C134FF"/>
+    <w:nsid w:val="3CBA6EB0"/>
     <w:multiLevelType w:val="singleLevel"/>
     <w:tmpl w:val="04090001"/>
     <w:lvl w:ilvl="0">
@@ -10508,7 +10974,7 @@
     </w:lvl>
   </w:abstractNum>
   <w:abstractNum w:abstractNumId="19" w15:restartNumberingAfterBreak="0">
-    <w:nsid w:val="4BCC1CD5"/>
+    <w:nsid w:val="3E8113D9"/>
     <w:multiLevelType w:val="singleLevel"/>
     <w:tmpl w:val="04090001"/>
     <w:lvl w:ilvl="0">
@@ -10525,7 +10991,7 @@
     </w:lvl>
   </w:abstractNum>
   <w:abstractNum w:abstractNumId="20" w15:restartNumberingAfterBreak="0">
-    <w:nsid w:val="4C83781E"/>
+    <w:nsid w:val="3F920CEF"/>
     <w:multiLevelType w:val="singleLevel"/>
     <w:tmpl w:val="04090001"/>
     <w:lvl w:ilvl="0">
@@ -10542,7 +11008,7 @@
     </w:lvl>
   </w:abstractNum>
   <w:abstractNum w:abstractNumId="21" w15:restartNumberingAfterBreak="0">
-    <w:nsid w:val="4FA95209"/>
+    <w:nsid w:val="409728C8"/>
     <w:multiLevelType w:val="singleLevel"/>
     <w:tmpl w:val="04090001"/>
     <w:lvl w:ilvl="0">
@@ -10559,7 +11025,7 @@
     </w:lvl>
   </w:abstractNum>
   <w:abstractNum w:abstractNumId="22" w15:restartNumberingAfterBreak="0">
-    <w:nsid w:val="50520CF6"/>
+    <w:nsid w:val="42AF7289"/>
     <w:multiLevelType w:val="singleLevel"/>
     <w:tmpl w:val="04090001"/>
     <w:lvl w:ilvl="0">
@@ -10576,7 +11042,7 @@
     </w:lvl>
   </w:abstractNum>
   <w:abstractNum w:abstractNumId="23" w15:restartNumberingAfterBreak="0">
-    <w:nsid w:val="5C253B3D"/>
+    <w:nsid w:val="44BC2BD9"/>
     <w:multiLevelType w:val="singleLevel"/>
     <w:tmpl w:val="04090001"/>
     <w:lvl w:ilvl="0">
@@ -10593,7 +11059,7 @@
     </w:lvl>
   </w:abstractNum>
   <w:abstractNum w:abstractNumId="24" w15:restartNumberingAfterBreak="0">
-    <w:nsid w:val="5FA163FF"/>
+    <w:nsid w:val="45A765F5"/>
     <w:multiLevelType w:val="singleLevel"/>
     <w:tmpl w:val="04090001"/>
     <w:lvl w:ilvl="0">
@@ -10610,7 +11076,7 @@
     </w:lvl>
   </w:abstractNum>
   <w:abstractNum w:abstractNumId="25" w15:restartNumberingAfterBreak="0">
-    <w:nsid w:val="66D371DF"/>
+    <w:nsid w:val="47AE177E"/>
     <w:multiLevelType w:val="singleLevel"/>
     <w:tmpl w:val="04090001"/>
     <w:lvl w:ilvl="0">
@@ -10627,7 +11093,7 @@
     </w:lvl>
   </w:abstractNum>
   <w:abstractNum w:abstractNumId="26" w15:restartNumberingAfterBreak="0">
-    <w:nsid w:val="69E53927"/>
+    <w:nsid w:val="489A0B94"/>
     <w:multiLevelType w:val="singleLevel"/>
     <w:tmpl w:val="04090001"/>
     <w:lvl w:ilvl="0">
@@ -10644,7 +11110,7 @@
     </w:lvl>
   </w:abstractNum>
   <w:abstractNum w:abstractNumId="27" w15:restartNumberingAfterBreak="0">
-    <w:nsid w:val="70CE5D77"/>
+    <w:nsid w:val="48D9627D"/>
     <w:multiLevelType w:val="singleLevel"/>
     <w:tmpl w:val="04090001"/>
     <w:lvl w:ilvl="0">
@@ -10661,7 +11127,7 @@
     </w:lvl>
   </w:abstractNum>
   <w:abstractNum w:abstractNumId="28" w15:restartNumberingAfterBreak="0">
-    <w:nsid w:val="754F3ABF"/>
+    <w:nsid w:val="4C6D2854"/>
     <w:multiLevelType w:val="singleLevel"/>
     <w:tmpl w:val="04090001"/>
     <w:lvl w:ilvl="0">
@@ -10678,7 +11144,7 @@
     </w:lvl>
   </w:abstractNum>
   <w:abstractNum w:abstractNumId="29" w15:restartNumberingAfterBreak="0">
-    <w:nsid w:val="7ABC444D"/>
+    <w:nsid w:val="5167347A"/>
     <w:multiLevelType w:val="singleLevel"/>
     <w:tmpl w:val="04090001"/>
     <w:lvl w:ilvl="0">
@@ -10695,7 +11161,7 @@
     </w:lvl>
   </w:abstractNum>
   <w:abstractNum w:abstractNumId="30" w15:restartNumberingAfterBreak="0">
-    <w:nsid w:val="7AF30244"/>
+    <w:nsid w:val="53506183"/>
     <w:multiLevelType w:val="singleLevel"/>
     <w:tmpl w:val="04090001"/>
     <w:lvl w:ilvl="0">
@@ -10712,7 +11178,7 @@
     </w:lvl>
   </w:abstractNum>
   <w:abstractNum w:abstractNumId="31" w15:restartNumberingAfterBreak="0">
-    <w:nsid w:val="7E1D7239"/>
+    <w:nsid w:val="54B27566"/>
     <w:multiLevelType w:val="singleLevel"/>
     <w:tmpl w:val="04090001"/>
     <w:lvl w:ilvl="0">
@@ -10728,101 +11194,341 @@
       </w:rPr>
     </w:lvl>
   </w:abstractNum>
+  <w:abstractNum w:abstractNumId="32" w15:restartNumberingAfterBreak="0">
+    <w:nsid w:val="57B46FC5"/>
+    <w:multiLevelType w:val="singleLevel"/>
+    <w:tmpl w:val="04090001"/>
+    <w:lvl w:ilvl="0">
+      <w:start w:val="1"/>
+      <w:numFmt w:val="bullet"/>
+      <w:lvlText w:val=""/>
+      <w:lvlJc w:val="left"/>
+      <w:pPr>
+        <w:ind w:left="420" w:hanging="420"/>
+      </w:pPr>
+      <w:rPr>
+        <w:rFonts w:ascii="Wingdings" w:hAnsi="Wingdings" w:hint="default"/>
+      </w:rPr>
+    </w:lvl>
+  </w:abstractNum>
+  <w:abstractNum w:abstractNumId="33" w15:restartNumberingAfterBreak="0">
+    <w:nsid w:val="57DE3540"/>
+    <w:multiLevelType w:val="singleLevel"/>
+    <w:tmpl w:val="04090001"/>
+    <w:lvl w:ilvl="0">
+      <w:start w:val="1"/>
+      <w:numFmt w:val="bullet"/>
+      <w:lvlText w:val=""/>
+      <w:lvlJc w:val="left"/>
+      <w:pPr>
+        <w:ind w:left="420" w:hanging="420"/>
+      </w:pPr>
+      <w:rPr>
+        <w:rFonts w:ascii="Wingdings" w:hAnsi="Wingdings" w:hint="default"/>
+      </w:rPr>
+    </w:lvl>
+  </w:abstractNum>
+  <w:abstractNum w:abstractNumId="34" w15:restartNumberingAfterBreak="0">
+    <w:nsid w:val="587961B7"/>
+    <w:multiLevelType w:val="singleLevel"/>
+    <w:tmpl w:val="04090001"/>
+    <w:lvl w:ilvl="0">
+      <w:start w:val="1"/>
+      <w:numFmt w:val="bullet"/>
+      <w:lvlText w:val=""/>
+      <w:lvlJc w:val="left"/>
+      <w:pPr>
+        <w:ind w:left="420" w:hanging="420"/>
+      </w:pPr>
+      <w:rPr>
+        <w:rFonts w:ascii="Wingdings" w:hAnsi="Wingdings" w:hint="default"/>
+      </w:rPr>
+    </w:lvl>
+  </w:abstractNum>
+  <w:abstractNum w:abstractNumId="35" w15:restartNumberingAfterBreak="0">
+    <w:nsid w:val="5976585B"/>
+    <w:multiLevelType w:val="singleLevel"/>
+    <w:tmpl w:val="04090001"/>
+    <w:lvl w:ilvl="0">
+      <w:start w:val="1"/>
+      <w:numFmt w:val="bullet"/>
+      <w:lvlText w:val=""/>
+      <w:lvlJc w:val="left"/>
+      <w:pPr>
+        <w:ind w:left="420" w:hanging="420"/>
+      </w:pPr>
+      <w:rPr>
+        <w:rFonts w:ascii="Wingdings" w:hAnsi="Wingdings" w:hint="default"/>
+      </w:rPr>
+    </w:lvl>
+  </w:abstractNum>
+  <w:abstractNum w:abstractNumId="36" w15:restartNumberingAfterBreak="0">
+    <w:nsid w:val="5D5251FD"/>
+    <w:multiLevelType w:val="singleLevel"/>
+    <w:tmpl w:val="04090001"/>
+    <w:lvl w:ilvl="0">
+      <w:start w:val="1"/>
+      <w:numFmt w:val="bullet"/>
+      <w:lvlText w:val=""/>
+      <w:lvlJc w:val="left"/>
+      <w:pPr>
+        <w:ind w:left="420" w:hanging="420"/>
+      </w:pPr>
+      <w:rPr>
+        <w:rFonts w:ascii="Wingdings" w:hAnsi="Wingdings" w:hint="default"/>
+      </w:rPr>
+    </w:lvl>
+  </w:abstractNum>
+  <w:abstractNum w:abstractNumId="37" w15:restartNumberingAfterBreak="0">
+    <w:nsid w:val="64474B0F"/>
+    <w:multiLevelType w:val="singleLevel"/>
+    <w:tmpl w:val="04090001"/>
+    <w:lvl w:ilvl="0">
+      <w:start w:val="1"/>
+      <w:numFmt w:val="bullet"/>
+      <w:lvlText w:val=""/>
+      <w:lvlJc w:val="left"/>
+      <w:pPr>
+        <w:ind w:left="420" w:hanging="420"/>
+      </w:pPr>
+      <w:rPr>
+        <w:rFonts w:ascii="Wingdings" w:hAnsi="Wingdings" w:hint="default"/>
+      </w:rPr>
+    </w:lvl>
+  </w:abstractNum>
+  <w:abstractNum w:abstractNumId="38" w15:restartNumberingAfterBreak="0">
+    <w:nsid w:val="68A679F5"/>
+    <w:multiLevelType w:val="singleLevel"/>
+    <w:tmpl w:val="04090001"/>
+    <w:lvl w:ilvl="0">
+      <w:start w:val="1"/>
+      <w:numFmt w:val="bullet"/>
+      <w:lvlText w:val=""/>
+      <w:lvlJc w:val="left"/>
+      <w:pPr>
+        <w:ind w:left="420" w:hanging="420"/>
+      </w:pPr>
+      <w:rPr>
+        <w:rFonts w:ascii="Wingdings" w:hAnsi="Wingdings" w:hint="default"/>
+      </w:rPr>
+    </w:lvl>
+  </w:abstractNum>
+  <w:abstractNum w:abstractNumId="39" w15:restartNumberingAfterBreak="0">
+    <w:nsid w:val="6B4B60DB"/>
+    <w:multiLevelType w:val="singleLevel"/>
+    <w:tmpl w:val="04090001"/>
+    <w:lvl w:ilvl="0">
+      <w:start w:val="1"/>
+      <w:numFmt w:val="bullet"/>
+      <w:lvlText w:val=""/>
+      <w:lvlJc w:val="left"/>
+      <w:pPr>
+        <w:ind w:left="420" w:hanging="420"/>
+      </w:pPr>
+      <w:rPr>
+        <w:rFonts w:ascii="Wingdings" w:hAnsi="Wingdings" w:hint="default"/>
+      </w:rPr>
+    </w:lvl>
+  </w:abstractNum>
+  <w:abstractNum w:abstractNumId="40" w15:restartNumberingAfterBreak="0">
+    <w:nsid w:val="6C596974"/>
+    <w:multiLevelType w:val="singleLevel"/>
+    <w:tmpl w:val="04090001"/>
+    <w:lvl w:ilvl="0">
+      <w:start w:val="1"/>
+      <w:numFmt w:val="bullet"/>
+      <w:lvlText w:val=""/>
+      <w:lvlJc w:val="left"/>
+      <w:pPr>
+        <w:ind w:left="420" w:hanging="420"/>
+      </w:pPr>
+      <w:rPr>
+        <w:rFonts w:ascii="Wingdings" w:hAnsi="Wingdings" w:hint="default"/>
+      </w:rPr>
+    </w:lvl>
+  </w:abstractNum>
+  <w:abstractNum w:abstractNumId="41" w15:restartNumberingAfterBreak="0">
+    <w:nsid w:val="759A60F5"/>
+    <w:multiLevelType w:val="singleLevel"/>
+    <w:tmpl w:val="04090001"/>
+    <w:lvl w:ilvl="0">
+      <w:start w:val="1"/>
+      <w:numFmt w:val="bullet"/>
+      <w:lvlText w:val=""/>
+      <w:lvlJc w:val="left"/>
+      <w:pPr>
+        <w:ind w:left="420" w:hanging="420"/>
+      </w:pPr>
+      <w:rPr>
+        <w:rFonts w:ascii="Wingdings" w:hAnsi="Wingdings" w:hint="default"/>
+      </w:rPr>
+    </w:lvl>
+  </w:abstractNum>
+  <w:abstractNum w:abstractNumId="42" w15:restartNumberingAfterBreak="0">
+    <w:nsid w:val="7C6509F3"/>
+    <w:multiLevelType w:val="singleLevel"/>
+    <w:tmpl w:val="04090001"/>
+    <w:lvl w:ilvl="0">
+      <w:start w:val="1"/>
+      <w:numFmt w:val="bullet"/>
+      <w:lvlText w:val=""/>
+      <w:lvlJc w:val="left"/>
+      <w:pPr>
+        <w:ind w:left="420" w:hanging="420"/>
+      </w:pPr>
+      <w:rPr>
+        <w:rFonts w:ascii="Wingdings" w:hAnsi="Wingdings" w:hint="default"/>
+      </w:rPr>
+    </w:lvl>
+  </w:abstractNum>
+  <w:abstractNum w:abstractNumId="43" w15:restartNumberingAfterBreak="0">
+    <w:nsid w:val="7F622248"/>
+    <w:multiLevelType w:val="singleLevel"/>
+    <w:tmpl w:val="04090001"/>
+    <w:lvl w:ilvl="0">
+      <w:start w:val="1"/>
+      <w:numFmt w:val="bullet"/>
+      <w:lvlText w:val=""/>
+      <w:lvlJc w:val="left"/>
+      <w:pPr>
+        <w:ind w:left="420" w:hanging="420"/>
+      </w:pPr>
+      <w:rPr>
+        <w:rFonts w:ascii="Wingdings" w:hAnsi="Wingdings" w:hint="default"/>
+      </w:rPr>
+    </w:lvl>
+  </w:abstractNum>
   <w:num w:numId="1">
+    <w:abstractNumId w:val="7"/>
+  </w:num>
+  <w:num w:numId="2">
+    <w:abstractNumId w:val="43"/>
+  </w:num>
+  <w:num w:numId="3">
+    <w:abstractNumId w:val="22"/>
+  </w:num>
+  <w:num w:numId="4">
+    <w:abstractNumId w:val="39"/>
+  </w:num>
+  <w:num w:numId="5">
+    <w:abstractNumId w:val="3"/>
+  </w:num>
+  <w:num w:numId="6">
+    <w:abstractNumId w:val="26"/>
+  </w:num>
+  <w:num w:numId="7">
+    <w:abstractNumId w:val="31"/>
+  </w:num>
+  <w:num w:numId="8">
+    <w:abstractNumId w:val="23"/>
+  </w:num>
+  <w:num w:numId="9">
+    <w:abstractNumId w:val="32"/>
+  </w:num>
+  <w:num w:numId="10">
+    <w:abstractNumId w:val="30"/>
+  </w:num>
+  <w:num w:numId="11">
+    <w:abstractNumId w:val="6"/>
+  </w:num>
+  <w:num w:numId="12">
+    <w:abstractNumId w:val="41"/>
+  </w:num>
+  <w:num w:numId="13">
+    <w:abstractNumId w:val="27"/>
+  </w:num>
+  <w:num w:numId="14">
+    <w:abstractNumId w:val="15"/>
+  </w:num>
+  <w:num w:numId="15">
+    <w:abstractNumId w:val="20"/>
+  </w:num>
+  <w:num w:numId="16">
+    <w:abstractNumId w:val="0"/>
+  </w:num>
+  <w:num w:numId="17">
+    <w:abstractNumId w:val="18"/>
+  </w:num>
+  <w:num w:numId="18">
+    <w:abstractNumId w:val="5"/>
+  </w:num>
+  <w:num w:numId="19">
     <w:abstractNumId w:val="13"/>
   </w:num>
-  <w:num w:numId="2">
+  <w:num w:numId="20">
     <w:abstractNumId w:val="29"/>
   </w:num>
-  <w:num w:numId="3">
+  <w:num w:numId="21">
+    <w:abstractNumId w:val="34"/>
+  </w:num>
+  <w:num w:numId="22">
+    <w:abstractNumId w:val="42"/>
+  </w:num>
+  <w:num w:numId="23">
+    <w:abstractNumId w:val="37"/>
+  </w:num>
+  <w:num w:numId="24">
+    <w:abstractNumId w:val="38"/>
+  </w:num>
+  <w:num w:numId="25">
+    <w:abstractNumId w:val="16"/>
+  </w:num>
+  <w:num w:numId="26">
+    <w:abstractNumId w:val="12"/>
+  </w:num>
+  <w:num w:numId="27">
+    <w:abstractNumId w:val="21"/>
+  </w:num>
+  <w:num w:numId="28">
     <w:abstractNumId w:val="14"/>
   </w:num>
-  <w:num w:numId="4">
-    <w:abstractNumId w:val="6"/>
-  </w:num>
-  <w:num w:numId="5">
-    <w:abstractNumId w:val="12"/>
-  </w:num>
-  <w:num w:numId="6">
+  <w:num w:numId="29">
     <w:abstractNumId w:val="4"/>
   </w:num>
-  <w:num w:numId="7">
-    <w:abstractNumId w:val="21"/>
-  </w:num>
-  <w:num w:numId="8">
-    <w:abstractNumId w:val="31"/>
-  </w:num>
-  <w:num w:numId="9">
+  <w:num w:numId="30">
     <w:abstractNumId w:val="11"/>
   </w:num>
-  <w:num w:numId="10">
-    <w:abstractNumId w:val="3"/>
+  <w:num w:numId="31">
+    <w:abstractNumId w:val="28"/>
   </w:num>
-  <w:num w:numId="11">
-    <w:abstractNumId w:val="22"/>
+  <w:num w:numId="32">
+    <w:abstractNumId w:val="24"/>
   </w:num>
-  <w:num w:numId="12">
+  <w:num w:numId="33">
+    <w:abstractNumId w:val="40"/>
+  </w:num>
+  <w:num w:numId="34">
+    <w:abstractNumId w:val="1"/>
+  </w:num>
+  <w:num w:numId="35">
+    <w:abstractNumId w:val="36"/>
+  </w:num>
+  <w:num w:numId="36">
+    <w:abstractNumId w:val="10"/>
+  </w:num>
+  <w:num w:numId="37">
+    <w:abstractNumId w:val="35"/>
+  </w:num>
+  <w:num w:numId="38">
+    <w:abstractNumId w:val="2"/>
+  </w:num>
+  <w:num w:numId="39">
+    <w:abstractNumId w:val="9"/>
+  </w:num>
+  <w:num w:numId="40">
+    <w:abstractNumId w:val="19"/>
+  </w:num>
+  <w:num w:numId="41">
+    <w:abstractNumId w:val="25"/>
+  </w:num>
+  <w:num w:numId="42">
+    <w:abstractNumId w:val="17"/>
+  </w:num>
+  <w:num w:numId="43">
     <w:abstractNumId w:val="8"/>
   </w:num>
-  <w:num w:numId="13">
-    <w:abstractNumId w:val="30"/>
-  </w:num>
-  <w:num w:numId="14">
-    <w:abstractNumId w:val="24"/>
-  </w:num>
-  <w:num w:numId="15">
-    <w:abstractNumId w:val="9"/>
-  </w:num>
-  <w:num w:numId="16">
-    <w:abstractNumId w:val="26"/>
-  </w:num>
-  <w:num w:numId="17">
-    <w:abstractNumId w:val="20"/>
-  </w:num>
-  <w:num w:numId="18">
-    <w:abstractNumId w:val="28"/>
-  </w:num>
-  <w:num w:numId="19">
-    <w:abstractNumId w:val="0"/>
-  </w:num>
-  <w:num w:numId="20">
-    <w:abstractNumId w:val="23"/>
-  </w:num>
-  <w:num w:numId="21">
-    <w:abstractNumId w:val="16"/>
-  </w:num>
-  <w:num w:numId="22">
-    <w:abstractNumId w:val="19"/>
-  </w:num>
-  <w:num w:numId="23">
-    <w:abstractNumId w:val="2"/>
-  </w:num>
-  <w:num w:numId="24">
-    <w:abstractNumId w:val="10"/>
-  </w:num>
-  <w:num w:numId="25">
-    <w:abstractNumId w:val="17"/>
-  </w:num>
-  <w:num w:numId="26">
-    <w:abstractNumId w:val="25"/>
-  </w:num>
-  <w:num w:numId="27">
-    <w:abstractNumId w:val="15"/>
-  </w:num>
-  <w:num w:numId="28">
-    <w:abstractNumId w:val="27"/>
-  </w:num>
-  <w:num w:numId="29">
-    <w:abstractNumId w:val="7"/>
-  </w:num>
-  <w:num w:numId="30">
-    <w:abstractNumId w:val="18"/>
-  </w:num>
-  <w:num w:numId="31">
-    <w:abstractNumId w:val="5"/>
-  </w:num>
-  <w:num w:numId="32">
-    <w:abstractNumId w:val="1"/>
+  <w:num w:numId="44">
+    <w:abstractNumId w:val="33"/>
   </w:num>
 </w:numbering>
 </file>
@@ -11242,7 +11948,7 @@
     <w:link w:val="10"/>
     <w:uiPriority w:val="9"/>
     <w:qFormat/>
-    <w:rsid w:val="00F55707"/>
+    <w:rsid w:val="00374065"/>
     <w:pPr>
       <w:keepNext/>
       <w:keepLines/>
@@ -11267,7 +11973,7 @@
     <w:uiPriority w:val="9"/>
     <w:unhideWhenUsed/>
     <w:qFormat/>
-    <w:rsid w:val="00F55707"/>
+    <w:rsid w:val="00374065"/>
     <w:pPr>
       <w:keepNext/>
       <w:keepLines/>
@@ -11289,10 +11995,9 @@
     <w:next w:val="a"/>
     <w:link w:val="30"/>
     <w:uiPriority w:val="9"/>
-    <w:semiHidden/>
     <w:unhideWhenUsed/>
     <w:qFormat/>
-    <w:rsid w:val="00F55707"/>
+    <w:rsid w:val="00374065"/>
     <w:pPr>
       <w:keepNext/>
       <w:keepLines/>
@@ -11340,7 +12045,7 @@
     <w:basedOn w:val="a0"/>
     <w:link w:val="1"/>
     <w:uiPriority w:val="9"/>
-    <w:rsid w:val="00F55707"/>
+    <w:rsid w:val="00374065"/>
     <w:rPr>
       <w:rFonts w:ascii="微软雅黑" w:eastAsia="微软雅黑" w:hAnsi="SimSun"/>
       <w:b/>
@@ -11356,7 +12061,7 @@
     <w:basedOn w:val="a0"/>
     <w:link w:val="2"/>
     <w:uiPriority w:val="9"/>
-    <w:rsid w:val="00F55707"/>
+    <w:rsid w:val="00374065"/>
     <w:rPr>
       <w:rFonts w:ascii="微软雅黑" w:eastAsia="微软雅黑" w:hAnsi="微软雅黑" w:cstheme="majorBidi"/>
       <w:b/>
@@ -11371,8 +12076,7 @@
     <w:basedOn w:val="a0"/>
     <w:link w:val="3"/>
     <w:uiPriority w:val="9"/>
-    <w:semiHidden/>
-    <w:rsid w:val="00F55707"/>
+    <w:rsid w:val="00374065"/>
     <w:rPr>
       <w:rFonts w:ascii="微软雅黑" w:eastAsia="微软雅黑" w:hAnsi="微软雅黑"/>
       <w:b/>
@@ -11388,7 +12092,7 @@
     <w:link w:val="a4"/>
     <w:uiPriority w:val="99"/>
     <w:unhideWhenUsed/>
-    <w:rsid w:val="00F55707"/>
+    <w:rsid w:val="00374065"/>
     <w:pPr>
       <w:pBdr>
         <w:bottom w:val="single" w:sz="6" w:space="1" w:color="auto"/>
@@ -11411,7 +12115,7 @@
     <w:basedOn w:val="a0"/>
     <w:link w:val="a3"/>
     <w:uiPriority w:val="99"/>
-    <w:rsid w:val="00F55707"/>
+    <w:rsid w:val="00374065"/>
     <w:rPr>
       <w:rFonts w:ascii="SimSun" w:eastAsia="SimSun" w:hAnsi="SimSun"/>
       <w:sz w:val="18"/>
@@ -11424,7 +12128,7 @@
     <w:link w:val="a6"/>
     <w:uiPriority w:val="99"/>
     <w:unhideWhenUsed/>
-    <w:rsid w:val="00F55707"/>
+    <w:rsid w:val="00374065"/>
     <w:pPr>
       <w:tabs>
         <w:tab w:val="center" w:pos="4153"/>
@@ -11444,7 +12148,7 @@
     <w:basedOn w:val="a0"/>
     <w:link w:val="a5"/>
     <w:uiPriority w:val="99"/>
-    <w:rsid w:val="00F55707"/>
+    <w:rsid w:val="00374065"/>
     <w:rPr>
       <w:rFonts w:ascii="SimSun" w:eastAsia="SimSun" w:hAnsi="SimSun"/>
       <w:sz w:val="18"/>
@@ -11457,7 +12161,7 @@
     <w:uiPriority w:val="99"/>
     <w:semiHidden/>
     <w:unhideWhenUsed/>
-    <w:rsid w:val="00F55707"/>
+    <w:rsid w:val="00374065"/>
   </w:style>
   <w:style w:type="paragraph" w:styleId="TOC1">
     <w:name w:val="toc 1"/>
@@ -11466,7 +12170,7 @@
     <w:autoRedefine/>
     <w:uiPriority w:val="39"/>
     <w:unhideWhenUsed/>
-    <w:rsid w:val="00F55707"/>
+    <w:rsid w:val="00374065"/>
     <w:pPr>
       <w:ind w:left="0"/>
     </w:pPr>
@@ -11476,7 +12180,7 @@
     <w:basedOn w:val="a"/>
     <w:uiPriority w:val="34"/>
     <w:qFormat/>
-    <w:rsid w:val="00F55707"/>
+    <w:rsid w:val="00374065"/>
     <w:pPr>
       <w:ind w:firstLineChars="200" w:firstLine="420"/>
     </w:pPr>
@@ -11488,7 +12192,7 @@
     <w:autoRedefine/>
     <w:uiPriority w:val="39"/>
     <w:unhideWhenUsed/>
-    <w:rsid w:val="00F55707"/>
+    <w:rsid w:val="00374065"/>
     <w:pPr>
       <w:ind w:left="420"/>
     </w:pPr>

</xml_diff>

<commit_message>
feat: run safe subagents concurrently
</commit_message>
<xml_diff>
--- a/Rust课程大作业实验报告.docx
+++ b/Rust课程大作业实验报告.docx
@@ -131,18 +131,15 @@
       </w:tblPr>
       <w:tblGrid>
         <w:gridCol w:w="2100"/>
-        <w:gridCol w:w="2521"/>
-        <w:gridCol w:w="3679"/>
-        <w:gridCol w:w="942"/>
+        <w:gridCol w:w="6200"/>
       </w:tblGrid>
       <w:tr>
-        <w:trPr>
-          <w:gridAfter w:val="1"/>
-          <w:wAfter w:w="942" w:type="dxa"/>
-        </w:trPr>
         <w:tc>
           <w:tcPr>
             <w:tcW w:w="2100" w:type="dxa"/>
+            <w:tcBorders>
+              <w:bottom w:val="single" w:sz="4" w:space="0" w:color="auto"/>
+            </w:tcBorders>
             <w:shd w:val="clear" w:color="auto" w:fill="E6E6E6"/>
             <w:vAlign w:val="center"/>
           </w:tcPr>
@@ -166,8 +163,7 @@
         <w:tc>
           <w:tcPr>
             <w:tcW w:w="6200" w:type="dxa"/>
-            <w:gridSpan w:val="2"/>
-            <w:shd w:val="clear" w:color="auto" w:fill="FFFFCC"/>
+            <w:shd w:val="clear" w:color="auto" w:fill="auto"/>
             <w:vAlign w:val="center"/>
           </w:tcPr>
           <w:p>
@@ -177,65 +173,6 @@
             </w:pPr>
             <w:r>
               <w:t>Rust 程序设计</w:t>
-            </w:r>
-          </w:p>
-        </w:tc>
-      </w:tr>
-      <w:tr>
-        <w:tblPrEx>
-          <w:tblBorders>
-            <w:top w:val="none" w:sz="0" w:space="0" w:color="auto"/>
-            <w:left w:val="none" w:sz="0" w:space="0" w:color="auto"/>
-            <w:bottom w:val="none" w:sz="0" w:space="0" w:color="auto"/>
-            <w:right w:val="none" w:sz="0" w:space="0" w:color="auto"/>
-            <w:insideH w:val="none" w:sz="0" w:space="0" w:color="auto"/>
-            <w:insideV w:val="none" w:sz="0" w:space="0" w:color="auto"/>
-          </w:tblBorders>
-          <w:tblCellMar>
-            <w:top w:w="0" w:type="dxa"/>
-            <w:left w:w="108" w:type="dxa"/>
-            <w:bottom w:w="0" w:type="dxa"/>
-            <w:right w:w="108" w:type="dxa"/>
-          </w:tblCellMar>
-        </w:tblPrEx>
-        <w:tc>
-          <w:tcPr>
-            <w:tcW w:w="4621" w:type="dxa"/>
-            <w:gridSpan w:val="2"/>
-            <w:vAlign w:val="center"/>
-          </w:tcPr>
-          <w:p>
-            <w:pPr>
-              <w:ind w:left="420"/>
-              <w:jc w:val="left"/>
-            </w:pPr>
-            <w:r>
-              <w:rPr>
-                <w:rFonts w:hint="eastAsia"/>
-              </w:rPr>
-              <w:t>项目类型</w:t>
-            </w:r>
-          </w:p>
-        </w:tc>
-        <w:tc>
-          <w:tcPr>
-            <w:tcW w:w="4621" w:type="dxa"/>
-            <w:gridSpan w:val="2"/>
-            <w:vAlign w:val="center"/>
-          </w:tcPr>
-          <w:p>
-            <w:pPr>
-              <w:ind w:left="420"/>
-              <w:jc w:val="left"/>
-            </w:pPr>
-            <w:r>
-              <w:rPr>
-                <w:rFonts w:hint="eastAsia"/>
-              </w:rPr>
-              <w:t>课程大作业</w:t>
-            </w:r>
-            <w:r>
-              <w:t xml:space="preserve"> / 软件系统开发</w:t>
             </w:r>
           </w:p>
         </w:tc>
@@ -245,121 +182,197 @@
       <w:tblPr>
         <w:tblStyle w:val="a"/>
         <w:tblW w:w="0" w:type="auto"/>
+        <w:tblInd w:w="12" w:type="dxa"/>
+        <w:tblBorders>
+          <w:top w:val="single" w:sz="4" w:space="0" w:color="auto"/>
+          <w:left w:val="single" w:sz="4" w:space="0" w:color="auto"/>
+          <w:bottom w:val="single" w:sz="4" w:space="0" w:color="auto"/>
+          <w:right w:val="single" w:sz="4" w:space="0" w:color="auto"/>
+          <w:insideH w:val="single" w:sz="4" w:space="0" w:color="auto"/>
+          <w:insideV w:val="single" w:sz="4" w:space="0" w:color="auto"/>
+        </w:tblBorders>
         <w:tblLayout w:type="fixed"/>
+        <w:tblCellMar>
+          <w:top w:w="80" w:type="dxa"/>
+          <w:left w:w="120" w:type="dxa"/>
+          <w:bottom w:w="80" w:type="dxa"/>
+          <w:right w:w="120" w:type="dxa"/>
+        </w:tblCellMar>
         <w:tblLook w:val="0000" w:firstRow="0" w:lastRow="0" w:firstColumn="0" w:lastColumn="0" w:noHBand="0" w:noVBand="0"/>
       </w:tblPr>
       <w:tblGrid>
-        <w:gridCol w:w="4621"/>
-        <w:gridCol w:w="4621"/>
+        <w:gridCol w:w="2100"/>
+        <w:gridCol w:w="6200"/>
       </w:tblGrid>
       <w:tr>
-        <w:tblPrEx>
-          <w:tblCellMar>
-            <w:top w:w="0" w:type="dxa"/>
-            <w:bottom w:w="0" w:type="dxa"/>
-          </w:tblCellMar>
-        </w:tblPrEx>
-        <w:tc>
-          <w:tcPr>
-            <w:tcW w:w="4621" w:type="dxa"/>
-            <w:vAlign w:val="center"/>
-          </w:tcPr>
-          <w:p>
-            <w:pPr>
-              <w:ind w:left="420"/>
-              <w:jc w:val="left"/>
-            </w:pPr>
-            <w:r>
-              <w:rPr>
-                <w:rFonts w:hint="eastAsia"/>
-              </w:rPr>
-              <w:t>团队成员</w:t>
-            </w:r>
-          </w:p>
-        </w:tc>
-        <w:tc>
-          <w:tcPr>
-            <w:tcW w:w="4621" w:type="dxa"/>
-            <w:vAlign w:val="center"/>
-          </w:tcPr>
-          <w:p>
-            <w:pPr>
-              <w:ind w:left="420"/>
-              <w:jc w:val="left"/>
-            </w:pPr>
-            <w:r>
-              <w:rPr>
-                <w:rFonts w:hint="eastAsia"/>
-              </w:rPr>
-              <w:t>【待填写：姓名】</w:t>
+        <w:tc>
+          <w:tcPr>
+            <w:tcW w:w="2100" w:type="dxa"/>
+            <w:tcBorders>
+              <w:bottom w:val="single" w:sz="4" w:space="0" w:color="auto"/>
+            </w:tcBorders>
+            <w:shd w:val="clear" w:color="auto" w:fill="E6E6E6"/>
+            <w:vAlign w:val="center"/>
+          </w:tcPr>
+          <w:p>
+            <w:pPr>
+              <w:ind w:left="420"/>
+              <w:jc w:val="center"/>
+              <w:rPr>
+                <w:b/>
+              </w:rPr>
+            </w:pPr>
+            <w:r>
+              <w:rPr>
+                <w:rFonts w:hint="eastAsia"/>
+                <w:b/>
+              </w:rPr>
+              <w:t>项目类型</w:t>
+            </w:r>
+          </w:p>
+        </w:tc>
+        <w:tc>
+          <w:tcPr>
+            <w:tcW w:w="6200" w:type="dxa"/>
+            <w:tcBorders>
+              <w:bottom w:val="single" w:sz="4" w:space="0" w:color="auto"/>
+            </w:tcBorders>
+            <w:shd w:val="clear" w:color="auto" w:fill="auto"/>
+            <w:vAlign w:val="center"/>
+          </w:tcPr>
+          <w:p>
+            <w:pPr>
+              <w:ind w:left="420"/>
+              <w:jc w:val="left"/>
+            </w:pPr>
+            <w:r>
+              <w:rPr>
+                <w:rFonts w:hint="eastAsia"/>
+              </w:rPr>
+              <w:t>课程大作业</w:t>
+            </w:r>
+            <w:r>
+              <w:t xml:space="preserve"> / 软件系统开发</w:t>
             </w:r>
           </w:p>
         </w:tc>
       </w:tr>
       <w:tr>
-        <w:tblPrEx>
-          <w:tblCellMar>
-            <w:top w:w="0" w:type="dxa"/>
-            <w:bottom w:w="0" w:type="dxa"/>
-          </w:tblCellMar>
-        </w:tblPrEx>
-        <w:tc>
-          <w:tcPr>
-            <w:tcW w:w="4621" w:type="dxa"/>
-            <w:vAlign w:val="center"/>
-          </w:tcPr>
-          <w:p>
-            <w:pPr>
-              <w:ind w:left="420"/>
-              <w:jc w:val="left"/>
-            </w:pPr>
-            <w:r>
-              <w:rPr>
-                <w:rFonts w:hint="eastAsia"/>
-              </w:rPr>
-              <w:t>学号</w:t>
-            </w:r>
-          </w:p>
-        </w:tc>
-        <w:tc>
-          <w:tcPr>
-            <w:tcW w:w="4621" w:type="dxa"/>
-            <w:vAlign w:val="center"/>
-          </w:tcPr>
-          <w:p>
-            <w:pPr>
-              <w:ind w:left="420"/>
-              <w:jc w:val="left"/>
-            </w:pPr>
-            <w:r>
-              <w:rPr>
-                <w:rFonts w:hint="eastAsia"/>
-              </w:rPr>
-              <w:t>【待填写：学号】</w:t>
+        <w:tc>
+          <w:tcPr>
+            <w:tcW w:w="2100" w:type="dxa"/>
+            <w:tcBorders>
+              <w:bottom w:val="single" w:sz="4" w:space="0" w:color="auto"/>
+            </w:tcBorders>
+            <w:shd w:val="clear" w:color="auto" w:fill="E6E6E6"/>
+            <w:vAlign w:val="center"/>
+          </w:tcPr>
+          <w:p>
+            <w:pPr>
+              <w:ind w:left="420"/>
+              <w:jc w:val="center"/>
+              <w:rPr>
+                <w:b/>
+              </w:rPr>
+            </w:pPr>
+            <w:r>
+              <w:rPr>
+                <w:rFonts w:hint="eastAsia"/>
+                <w:b/>
+              </w:rPr>
+              <w:t>团队成员</w:t>
+            </w:r>
+          </w:p>
+        </w:tc>
+        <w:tc>
+          <w:tcPr>
+            <w:tcW w:w="6200" w:type="dxa"/>
+            <w:tcBorders>
+              <w:bottom w:val="single" w:sz="4" w:space="0" w:color="auto"/>
+            </w:tcBorders>
+            <w:shd w:val="clear" w:color="auto" w:fill="FFFFCC"/>
+            <w:vAlign w:val="center"/>
+          </w:tcPr>
+          <w:p>
+            <w:pPr>
+              <w:ind w:left="420"/>
+              <w:jc w:val="left"/>
+            </w:pPr>
+            <w:r>
+              <w:rPr>
+                <w:rFonts w:hint="eastAsia"/>
+              </w:rPr>
+              <w:t>【待填写：姓名】</w:t>
             </w:r>
           </w:p>
         </w:tc>
       </w:tr>
       <w:tr>
-        <w:tblPrEx>
-          <w:tblCellMar>
-            <w:top w:w="0" w:type="dxa"/>
-            <w:bottom w:w="0" w:type="dxa"/>
-          </w:tblCellMar>
-        </w:tblPrEx>
-        <w:tc>
-          <w:tcPr>
-            <w:tcW w:w="4621" w:type="dxa"/>
-            <w:vAlign w:val="center"/>
-          </w:tcPr>
-          <w:p>
-            <w:pPr>
-              <w:ind w:left="420"/>
-              <w:jc w:val="left"/>
-            </w:pPr>
-            <w:r>
-              <w:rPr>
-                <w:rFonts w:hint="eastAsia"/>
+        <w:tc>
+          <w:tcPr>
+            <w:tcW w:w="2100" w:type="dxa"/>
+            <w:tcBorders>
+              <w:bottom w:val="single" w:sz="4" w:space="0" w:color="auto"/>
+            </w:tcBorders>
+            <w:shd w:val="clear" w:color="auto" w:fill="E6E6E6"/>
+            <w:vAlign w:val="center"/>
+          </w:tcPr>
+          <w:p>
+            <w:pPr>
+              <w:ind w:left="420"/>
+              <w:jc w:val="center"/>
+              <w:rPr>
+                <w:b/>
+              </w:rPr>
+            </w:pPr>
+            <w:r>
+              <w:rPr>
+                <w:rFonts w:hint="eastAsia"/>
+                <w:b/>
+              </w:rPr>
+              <w:t>学号</w:t>
+            </w:r>
+          </w:p>
+        </w:tc>
+        <w:tc>
+          <w:tcPr>
+            <w:tcW w:w="6200" w:type="dxa"/>
+            <w:shd w:val="clear" w:color="auto" w:fill="FFFFCC"/>
+            <w:vAlign w:val="center"/>
+          </w:tcPr>
+          <w:p>
+            <w:pPr>
+              <w:ind w:left="420"/>
+              <w:jc w:val="left"/>
+            </w:pPr>
+            <w:r>
+              <w:rPr>
+                <w:rFonts w:hint="eastAsia"/>
+              </w:rPr>
+              <w:t>【待填写：学号】</w:t>
+            </w:r>
+          </w:p>
+        </w:tc>
+      </w:tr>
+      <w:tr>
+        <w:tc>
+          <w:tcPr>
+            <w:tcW w:w="2100" w:type="dxa"/>
+            <w:shd w:val="clear" w:color="auto" w:fill="E6E6E6"/>
+            <w:vAlign w:val="center"/>
+          </w:tcPr>
+          <w:p>
+            <w:pPr>
+              <w:ind w:left="420"/>
+              <w:jc w:val="center"/>
+              <w:rPr>
+                <w:b/>
+              </w:rPr>
+            </w:pPr>
+            <w:r>
+              <w:rPr>
+                <w:rFonts w:hint="eastAsia"/>
+                <w:b/>
               </w:rPr>
               <w:t>完成日期</w:t>
             </w:r>
@@ -367,7 +380,8 @@
         </w:tc>
         <w:tc>
           <w:tcPr>
-            <w:tcW w:w="4621" w:type="dxa"/>
+            <w:tcW w:w="6200" w:type="dxa"/>
+            <w:shd w:val="clear" w:color="auto" w:fill="auto"/>
             <w:vAlign w:val="center"/>
           </w:tcPr>
           <w:p>
@@ -447,7 +461,7 @@
           <w:rFonts w:hint="eastAsia"/>
         </w:rPr>
       </w:pPr>
-      <w:bookmarkStart w:id="0" w:name="_Toc235221971"/>
+      <w:bookmarkStart w:id="0" w:name="_Toc235225792"/>
       <w:r>
         <w:rPr>
           <w:rFonts w:hint="eastAsia"/>
@@ -485,13 +499,13 @@
         <w:t>实现过程中重点解决了</w:t>
       </w:r>
       <w:r>
-        <w:t xml:space="preserve"> Agent 只回答不执行、工具调用后提前结束、重复调用陷入循环、长文件读取被截断、Todo 仅展示不驱动任务、跨会话状态边界不清晰、Skill 清单与真实文件不一致等问题。系统采用模块化架构和事件驱动 UI，将 LLM 通信、消息协议、工具注册、状态管理和界面渲染分离。当前工程包含 25 个 Rust 源文件、约 5675 行 Rust 代码；cargo test 共执行 13 项测试，全部通过，cargo clippy 在警告视为错误的模式下通过。实验结果表明，该系统已经具备完整的</w:t>
+        <w:t xml:space="preserve"> Agent 只回答不执行、工具调用后提前结束、重复调用陷入循环、长文件读取被截断、Todo 仅展示不驱动任务、跨会话状态边界不清晰、Skill 清单与真实文件不一致和子代理串行阻塞等问题。系统采用模块化架构和事件驱动 UI，将 LLM 通信、消息协议、工具注册、状态管理和界面渲染分离。当前工程包含 25 个 Rust 源文件、约 6062 行 Rust 代码；cargo test 共执行 16 项测试，全部通过，cargo clippy 在警告视为错误的模式下通过。实验结果表明，该系</w:t>
       </w:r>
       <w:r>
         <w:rPr>
           <w:rFonts w:hint="eastAsia"/>
         </w:rPr>
-        <w:t>“理解请求—制定计划—调用工具—观察结果—继续决策—验证完成—总结输出”闭环。</w:t>
+        <w:t>统已经具备完整的“理解请求—制定计划—调用工具—观察结果—继续决策—验证完成—总结输出”闭环。</w:t>
       </w:r>
     </w:p>
     <w:p>
@@ -527,7 +541,7 @@
           <w:rFonts w:hint="eastAsia"/>
         </w:rPr>
       </w:pPr>
-      <w:bookmarkStart w:id="1" w:name="_Toc235221972"/>
+      <w:bookmarkStart w:id="1" w:name="_Toc235225793"/>
       <w:r>
         <w:rPr>
           <w:rFonts w:hint="eastAsia"/>
@@ -580,7 +594,7 @@
         <w:rPr>
           <w:noProof/>
         </w:rPr>
-        <w:instrText xml:space="preserve"> PAGEREF _Toc235221971 \h </w:instrText>
+        <w:instrText xml:space="preserve"> PAGEREF _Toc235225792 \h </w:instrText>
       </w:r>
       <w:r>
         <w:rPr>
@@ -641,7 +655,7 @@
         <w:rPr>
           <w:noProof/>
         </w:rPr>
-        <w:instrText xml:space="preserve"> PAGEREF _Toc235221972 \h </w:instrText>
+        <w:instrText xml:space="preserve"> PAGEREF _Toc235225793 \h </w:instrText>
       </w:r>
       <w:r>
         <w:rPr>
@@ -702,7 +716,7 @@
         <w:rPr>
           <w:noProof/>
         </w:rPr>
-        <w:instrText xml:space="preserve"> PAGEREF _Toc235221973 \h </w:instrText>
+        <w:instrText xml:space="preserve"> PAGEREF _Toc235225794 \h </w:instrText>
       </w:r>
       <w:r>
         <w:rPr>
@@ -763,7 +777,7 @@
         <w:rPr>
           <w:noProof/>
         </w:rPr>
-        <w:instrText xml:space="preserve"> PAGEREF _Toc235221974 \h </w:instrText>
+        <w:instrText xml:space="preserve"> PAGEREF _Toc235225795 \h </w:instrText>
       </w:r>
       <w:r>
         <w:rPr>
@@ -824,7 +838,7 @@
         <w:rPr>
           <w:noProof/>
         </w:rPr>
-        <w:instrText xml:space="preserve"> PAGEREF _Toc235221975 \h </w:instrText>
+        <w:instrText xml:space="preserve"> PAGEREF _Toc235225796 \h </w:instrText>
       </w:r>
       <w:r>
         <w:rPr>
@@ -882,7 +896,7 @@
         <w:rPr>
           <w:noProof/>
         </w:rPr>
-        <w:instrText xml:space="preserve"> PAGEREF _Toc235221976 \h </w:instrText>
+        <w:instrText xml:space="preserve"> PAGEREF _Toc235225797 \h </w:instrText>
       </w:r>
       <w:r>
         <w:rPr>
@@ -940,7 +954,7 @@
         <w:rPr>
           <w:noProof/>
         </w:rPr>
-        <w:instrText xml:space="preserve"> PAGEREF _Toc235221977 \h </w:instrText>
+        <w:instrText xml:space="preserve"> PAGEREF _Toc235225798 \h </w:instrText>
       </w:r>
       <w:r>
         <w:rPr>
@@ -998,7 +1012,7 @@
         <w:rPr>
           <w:noProof/>
         </w:rPr>
-        <w:instrText xml:space="preserve"> PAGEREF _Toc235221978 \h </w:instrText>
+        <w:instrText xml:space="preserve"> PAGEREF _Toc235225799 \h </w:instrText>
       </w:r>
       <w:r>
         <w:rPr>
@@ -1060,7 +1074,7 @@
         <w:rPr>
           <w:noProof/>
         </w:rPr>
-        <w:instrText xml:space="preserve"> PAGEREF _Toc235221979 \h </w:instrText>
+        <w:instrText xml:space="preserve"> PAGEREF _Toc235225800 \h </w:instrText>
       </w:r>
       <w:r>
         <w:rPr>
@@ -1118,7 +1132,7 @@
         <w:rPr>
           <w:noProof/>
         </w:rPr>
-        <w:instrText xml:space="preserve"> PAGEREF _Toc235221980 \h </w:instrText>
+        <w:instrText xml:space="preserve"> PAGEREF _Toc235225801 \h </w:instrText>
       </w:r>
       <w:r>
         <w:rPr>
@@ -1176,7 +1190,7 @@
         <w:rPr>
           <w:noProof/>
         </w:rPr>
-        <w:instrText xml:space="preserve"> PAGEREF _Toc235221981 \h </w:instrText>
+        <w:instrText xml:space="preserve"> PAGEREF _Toc235225802 \h </w:instrText>
       </w:r>
       <w:r>
         <w:rPr>
@@ -1234,7 +1248,7 @@
         <w:rPr>
           <w:noProof/>
         </w:rPr>
-        <w:instrText xml:space="preserve"> PAGEREF _Toc235221982 \h </w:instrText>
+        <w:instrText xml:space="preserve"> PAGEREF _Toc235225803 \h </w:instrText>
       </w:r>
       <w:r>
         <w:rPr>
@@ -1292,7 +1306,7 @@
         <w:rPr>
           <w:noProof/>
         </w:rPr>
-        <w:instrText xml:space="preserve"> PAGEREF _Toc235221983 \h </w:instrText>
+        <w:instrText xml:space="preserve"> PAGEREF _Toc235225804 \h </w:instrText>
       </w:r>
       <w:r>
         <w:rPr>
@@ -1350,7 +1364,7 @@
         <w:rPr>
           <w:noProof/>
         </w:rPr>
-        <w:instrText xml:space="preserve"> PAGEREF _Toc235221984 \h </w:instrText>
+        <w:instrText xml:space="preserve"> PAGEREF _Toc235225805 \h </w:instrText>
       </w:r>
       <w:r>
         <w:rPr>
@@ -1408,7 +1422,7 @@
         <w:rPr>
           <w:noProof/>
         </w:rPr>
-        <w:instrText xml:space="preserve"> PAGEREF _Toc235221985 \h </w:instrText>
+        <w:instrText xml:space="preserve"> PAGEREF _Toc235225806 \h </w:instrText>
       </w:r>
       <w:r>
         <w:rPr>
@@ -1466,7 +1480,7 @@
         <w:rPr>
           <w:noProof/>
         </w:rPr>
-        <w:instrText xml:space="preserve"> PAGEREF _Toc235221986 \h </w:instrText>
+        <w:instrText xml:space="preserve"> PAGEREF _Toc235225807 \h </w:instrText>
       </w:r>
       <w:r>
         <w:rPr>
@@ -1524,7 +1538,7 @@
         <w:rPr>
           <w:noProof/>
         </w:rPr>
-        <w:instrText xml:space="preserve"> PAGEREF _Toc235221987 \h </w:instrText>
+        <w:instrText xml:space="preserve"> PAGEREF _Toc235225808 \h </w:instrText>
       </w:r>
       <w:r>
         <w:rPr>
@@ -1582,7 +1596,7 @@
         <w:rPr>
           <w:noProof/>
         </w:rPr>
-        <w:instrText xml:space="preserve"> PAGEREF _Toc235221988 \h </w:instrText>
+        <w:instrText xml:space="preserve"> PAGEREF _Toc235225809 \h </w:instrText>
       </w:r>
       <w:r>
         <w:rPr>
@@ -1599,7 +1613,7 @@
         <w:rPr>
           <w:noProof/>
         </w:rPr>
-        <w:t>10</w:t>
+        <w:t>11</w:t>
       </w:r>
       <w:r>
         <w:rPr>
@@ -1643,7 +1657,7 @@
         <w:rPr>
           <w:noProof/>
         </w:rPr>
-        <w:instrText xml:space="preserve"> PAGEREF _Toc235221989 \h </w:instrText>
+        <w:instrText xml:space="preserve"> PAGEREF _Toc235225810 \h </w:instrText>
       </w:r>
       <w:r>
         <w:rPr>
@@ -1701,7 +1715,7 @@
         <w:rPr>
           <w:noProof/>
         </w:rPr>
-        <w:instrText xml:space="preserve"> PAGEREF _Toc235221990 \h </w:instrText>
+        <w:instrText xml:space="preserve"> PAGEREF _Toc235225811 \h </w:instrText>
       </w:r>
       <w:r>
         <w:rPr>
@@ -1759,7 +1773,7 @@
         <w:rPr>
           <w:noProof/>
         </w:rPr>
-        <w:instrText xml:space="preserve"> PAGEREF _Toc235221991 \h </w:instrText>
+        <w:instrText xml:space="preserve"> PAGEREF _Toc235225812 \h </w:instrText>
       </w:r>
       <w:r>
         <w:rPr>
@@ -1817,7 +1831,7 @@
         <w:rPr>
           <w:noProof/>
         </w:rPr>
-        <w:instrText xml:space="preserve"> PAGEREF _Toc235221992 \h </w:instrText>
+        <w:instrText xml:space="preserve"> PAGEREF _Toc235225813 \h </w:instrText>
       </w:r>
       <w:r>
         <w:rPr>
@@ -1875,7 +1889,7 @@
         <w:rPr>
           <w:noProof/>
         </w:rPr>
-        <w:instrText xml:space="preserve"> PAGEREF _Toc235221993 \h </w:instrText>
+        <w:instrText xml:space="preserve"> PAGEREF _Toc235225814 \h </w:instrText>
       </w:r>
       <w:r>
         <w:rPr>
@@ -1933,7 +1947,7 @@
         <w:rPr>
           <w:noProof/>
         </w:rPr>
-        <w:instrText xml:space="preserve"> PAGEREF _Toc235221994 \h </w:instrText>
+        <w:instrText xml:space="preserve"> PAGEREF _Toc235225815 \h </w:instrText>
       </w:r>
       <w:r>
         <w:rPr>
@@ -1994,7 +2008,7 @@
         <w:rPr>
           <w:noProof/>
         </w:rPr>
-        <w:instrText xml:space="preserve"> PAGEREF _Toc235221995 \h </w:instrText>
+        <w:instrText xml:space="preserve"> PAGEREF _Toc235225816 \h </w:instrText>
       </w:r>
       <w:r>
         <w:rPr>
@@ -2052,7 +2066,7 @@
         <w:rPr>
           <w:noProof/>
         </w:rPr>
-        <w:instrText xml:space="preserve"> PAGEREF _Toc235221996 \h </w:instrText>
+        <w:instrText xml:space="preserve"> PAGEREF _Toc235225817 \h </w:instrText>
       </w:r>
       <w:r>
         <w:rPr>
@@ -2110,7 +2124,7 @@
         <w:rPr>
           <w:noProof/>
         </w:rPr>
-        <w:instrText xml:space="preserve"> PAGEREF _Toc235221997 \h </w:instrText>
+        <w:instrText xml:space="preserve"> PAGEREF _Toc235225818 \h </w:instrText>
       </w:r>
       <w:r>
         <w:rPr>
@@ -2127,7 +2141,7 @@
         <w:rPr>
           <w:noProof/>
         </w:rPr>
-        <w:t>15</w:t>
+        <w:t>16</w:t>
       </w:r>
       <w:r>
         <w:rPr>
@@ -2171,7 +2185,7 @@
         <w:rPr>
           <w:noProof/>
         </w:rPr>
-        <w:instrText xml:space="preserve"> PAGEREF _Toc235221998 \h </w:instrText>
+        <w:instrText xml:space="preserve"> PAGEREF _Toc235225819 \h </w:instrText>
       </w:r>
       <w:r>
         <w:rPr>
@@ -2232,7 +2246,7 @@
         <w:rPr>
           <w:noProof/>
         </w:rPr>
-        <w:instrText xml:space="preserve"> PAGEREF _Toc235221999 \h </w:instrText>
+        <w:instrText xml:space="preserve"> PAGEREF _Toc235225820 \h </w:instrText>
       </w:r>
       <w:r>
         <w:rPr>
@@ -2249,7 +2263,7 @@
         <w:rPr>
           <w:noProof/>
         </w:rPr>
-        <w:t>16</w:t>
+        <w:t>17</w:t>
       </w:r>
       <w:r>
         <w:rPr>
@@ -2293,7 +2307,7 @@
         <w:rPr>
           <w:noProof/>
         </w:rPr>
-        <w:instrText xml:space="preserve"> PAGEREF _Toc235222000 \h </w:instrText>
+        <w:instrText xml:space="preserve"> PAGEREF _Toc235225821 \h </w:instrText>
       </w:r>
       <w:r>
         <w:rPr>
@@ -2354,7 +2368,7 @@
         <w:rPr>
           <w:noProof/>
         </w:rPr>
-        <w:instrText xml:space="preserve"> PAGEREF _Toc235222001 \h </w:instrText>
+        <w:instrText xml:space="preserve"> PAGEREF _Toc235225822 \h </w:instrText>
       </w:r>
       <w:r>
         <w:rPr>
@@ -2371,7 +2385,7 @@
         <w:rPr>
           <w:noProof/>
         </w:rPr>
-        <w:t>18</w:t>
+        <w:t>19</w:t>
       </w:r>
       <w:r>
         <w:rPr>
@@ -2395,7 +2409,7 @@
         <w:ind w:left="420"/>
         <w:jc w:val="left"/>
       </w:pPr>
-      <w:bookmarkStart w:id="2" w:name="_Toc235221973"/>
+      <w:bookmarkStart w:id="2" w:name="_Toc235225794"/>
       <w:r>
         <w:lastRenderedPageBreak/>
         <w:t>1 项目名称</w:t>
@@ -2506,7 +2520,7 @@
         <w:ind w:left="420"/>
         <w:jc w:val="left"/>
       </w:pPr>
-      <w:bookmarkStart w:id="3" w:name="_Toc235221974"/>
+      <w:bookmarkStart w:id="3" w:name="_Toc235225795"/>
       <w:r>
         <w:t>2 团队成员与分工</w:t>
       </w:r>
@@ -3117,7 +3131,7 @@
         <w:ind w:left="420"/>
         <w:jc w:val="left"/>
       </w:pPr>
-      <w:bookmarkStart w:id="4" w:name="_Toc235221975"/>
+      <w:bookmarkStart w:id="4" w:name="_Toc235225796"/>
       <w:r>
         <w:t>3 项目背景与目标</w:t>
       </w:r>
@@ -3130,7 +3144,7 @@
         <w:ind w:left="420"/>
         <w:jc w:val="left"/>
       </w:pPr>
-      <w:bookmarkStart w:id="5" w:name="_Toc235221976"/>
+      <w:bookmarkStart w:id="5" w:name="_Toc235225797"/>
       <w:r>
         <w:t>3.1 项目背景</w:t>
       </w:r>
@@ -3172,7 +3186,7 @@
         <w:ind w:left="420"/>
         <w:jc w:val="left"/>
       </w:pPr>
-      <w:bookmarkStart w:id="6" w:name="_Toc235221977"/>
+      <w:bookmarkStart w:id="6" w:name="_Toc235225798"/>
       <w:r>
         <w:t>3.2 项目目标</w:t>
       </w:r>
@@ -3281,7 +3295,7 @@
         <w:ind w:left="420"/>
         <w:jc w:val="left"/>
       </w:pPr>
-      <w:bookmarkStart w:id="7" w:name="_Toc235221978"/>
+      <w:bookmarkStart w:id="7" w:name="_Toc235225799"/>
       <w:r>
         <w:t>3.3 预期功能与验收标准</w:t>
       </w:r>
@@ -3878,7 +3892,7 @@
         <w:ind w:left="420"/>
         <w:jc w:val="left"/>
       </w:pPr>
-      <w:bookmarkStart w:id="8" w:name="_Toc235221979"/>
+      <w:bookmarkStart w:id="8" w:name="_Toc235225800"/>
       <w:r>
         <w:t>4 系统设计与实现思路</w:t>
       </w:r>
@@ -3891,7 +3905,7 @@
         <w:ind w:left="420"/>
         <w:jc w:val="left"/>
       </w:pPr>
-      <w:bookmarkStart w:id="9" w:name="_Toc235221980"/>
+      <w:bookmarkStart w:id="9" w:name="_Toc235225801"/>
       <w:r>
         <w:t>4.1 技术选型</w:t>
       </w:r>
@@ -3909,7 +3923,6 @@
           <w:insideH w:val="single" w:sz="4" w:space="0" w:color="auto"/>
           <w:insideV w:val="single" w:sz="4" w:space="0" w:color="auto"/>
         </w:tblBorders>
-        <w:shd w:val="clear" w:color="auto" w:fill="E6E6E6"/>
         <w:tblLayout w:type="fixed"/>
         <w:tblCellMar>
           <w:top w:w="80" w:type="dxa"/>
@@ -4017,24 +4030,33 @@
         <w:tblStyle w:val="a"/>
         <w:tblW w:w="0" w:type="auto"/>
         <w:tblInd w:w="12" w:type="dxa"/>
+        <w:tblBorders>
+          <w:top w:val="single" w:sz="4" w:space="0" w:color="auto"/>
+          <w:left w:val="single" w:sz="4" w:space="0" w:color="auto"/>
+          <w:bottom w:val="single" w:sz="4" w:space="0" w:color="auto"/>
+          <w:right w:val="single" w:sz="4" w:space="0" w:color="auto"/>
+          <w:insideH w:val="single" w:sz="4" w:space="0" w:color="auto"/>
+          <w:insideV w:val="single" w:sz="4" w:space="0" w:color="auto"/>
+        </w:tblBorders>
         <w:tblLayout w:type="fixed"/>
+        <w:tblCellMar>
+          <w:top w:w="80" w:type="dxa"/>
+          <w:left w:w="120" w:type="dxa"/>
+          <w:bottom w:w="80" w:type="dxa"/>
+          <w:right w:w="120" w:type="dxa"/>
+        </w:tblCellMar>
         <w:tblLook w:val="0000" w:firstRow="0" w:lastRow="0" w:firstColumn="0" w:lastColumn="0" w:noHBand="0" w:noVBand="0"/>
       </w:tblPr>
       <w:tblGrid>
-        <w:gridCol w:w="3080"/>
-        <w:gridCol w:w="3081"/>
-        <w:gridCol w:w="3081"/>
+        <w:gridCol w:w="2000"/>
+        <w:gridCol w:w="2200"/>
+        <w:gridCol w:w="4820"/>
       </w:tblGrid>
       <w:tr>
-        <w:tblPrEx>
-          <w:tblCellMar>
-            <w:top w:w="0" w:type="dxa"/>
-            <w:bottom w:w="0" w:type="dxa"/>
-          </w:tblCellMar>
-        </w:tblPrEx>
-        <w:tc>
-          <w:tcPr>
-            <w:tcW w:w="3080" w:type="dxa"/>
+        <w:tc>
+          <w:tcPr>
+            <w:tcW w:w="2000" w:type="dxa"/>
+            <w:shd w:val="clear" w:color="auto" w:fill="auto"/>
             <w:vAlign w:val="center"/>
           </w:tcPr>
           <w:p>
@@ -4055,7 +4077,8 @@
         </w:tc>
         <w:tc>
           <w:tcPr>
-            <w:tcW w:w="3081" w:type="dxa"/>
+            <w:tcW w:w="2200" w:type="dxa"/>
+            <w:shd w:val="clear" w:color="auto" w:fill="auto"/>
             <w:vAlign w:val="center"/>
           </w:tcPr>
           <w:p>
@@ -4077,7 +4100,8 @@
         </w:tc>
         <w:tc>
           <w:tcPr>
-            <w:tcW w:w="3081" w:type="dxa"/>
+            <w:tcW w:w="4820" w:type="dxa"/>
+            <w:shd w:val="clear" w:color="auto" w:fill="auto"/>
             <w:vAlign w:val="center"/>
           </w:tcPr>
           <w:p>
@@ -4099,15 +4123,10 @@
         </w:tc>
       </w:tr>
       <w:tr>
-        <w:tblPrEx>
-          <w:tblCellMar>
-            <w:top w:w="0" w:type="dxa"/>
-            <w:bottom w:w="0" w:type="dxa"/>
-          </w:tblCellMar>
-        </w:tblPrEx>
-        <w:tc>
-          <w:tcPr>
-            <w:tcW w:w="3080" w:type="dxa"/>
+        <w:tc>
+          <w:tcPr>
+            <w:tcW w:w="2000" w:type="dxa"/>
+            <w:shd w:val="clear" w:color="auto" w:fill="auto"/>
             <w:vAlign w:val="center"/>
           </w:tcPr>
           <w:p>
@@ -4128,7 +4147,8 @@
         </w:tc>
         <w:tc>
           <w:tcPr>
-            <w:tcW w:w="3081" w:type="dxa"/>
+            <w:tcW w:w="2200" w:type="dxa"/>
+            <w:shd w:val="clear" w:color="auto" w:fill="auto"/>
             <w:vAlign w:val="center"/>
           </w:tcPr>
           <w:p>
@@ -4150,7 +4170,8 @@
         </w:tc>
         <w:tc>
           <w:tcPr>
-            <w:tcW w:w="3081" w:type="dxa"/>
+            <w:tcW w:w="4820" w:type="dxa"/>
+            <w:shd w:val="clear" w:color="auto" w:fill="auto"/>
             <w:vAlign w:val="center"/>
           </w:tcPr>
           <w:p>
@@ -4178,15 +4199,10 @@
         </w:tc>
       </w:tr>
       <w:tr>
-        <w:tblPrEx>
-          <w:tblCellMar>
-            <w:top w:w="0" w:type="dxa"/>
-            <w:bottom w:w="0" w:type="dxa"/>
-          </w:tblCellMar>
-        </w:tblPrEx>
-        <w:tc>
-          <w:tcPr>
-            <w:tcW w:w="3080" w:type="dxa"/>
+        <w:tc>
+          <w:tcPr>
+            <w:tcW w:w="2000" w:type="dxa"/>
+            <w:shd w:val="clear" w:color="auto" w:fill="auto"/>
             <w:vAlign w:val="center"/>
           </w:tcPr>
           <w:p>
@@ -4207,7 +4223,8 @@
         </w:tc>
         <w:tc>
           <w:tcPr>
-            <w:tcW w:w="3081" w:type="dxa"/>
+            <w:tcW w:w="2200" w:type="dxa"/>
+            <w:shd w:val="clear" w:color="auto" w:fill="auto"/>
             <w:vAlign w:val="center"/>
           </w:tcPr>
           <w:p>
@@ -4228,7 +4245,8 @@
         </w:tc>
         <w:tc>
           <w:tcPr>
-            <w:tcW w:w="3081" w:type="dxa"/>
+            <w:tcW w:w="4820" w:type="dxa"/>
+            <w:shd w:val="clear" w:color="auto" w:fill="auto"/>
             <w:vAlign w:val="center"/>
           </w:tcPr>
           <w:p>
@@ -4256,15 +4274,10 @@
         </w:tc>
       </w:tr>
       <w:tr>
-        <w:tblPrEx>
-          <w:tblCellMar>
-            <w:top w:w="0" w:type="dxa"/>
-            <w:bottom w:w="0" w:type="dxa"/>
-          </w:tblCellMar>
-        </w:tblPrEx>
-        <w:tc>
-          <w:tcPr>
-            <w:tcW w:w="3080" w:type="dxa"/>
+        <w:tc>
+          <w:tcPr>
+            <w:tcW w:w="2000" w:type="dxa"/>
+            <w:shd w:val="clear" w:color="auto" w:fill="auto"/>
             <w:vAlign w:val="center"/>
           </w:tcPr>
           <w:p>
@@ -4285,7 +4298,8 @@
         </w:tc>
         <w:tc>
           <w:tcPr>
-            <w:tcW w:w="3081" w:type="dxa"/>
+            <w:tcW w:w="2200" w:type="dxa"/>
+            <w:shd w:val="clear" w:color="auto" w:fill="auto"/>
             <w:vAlign w:val="center"/>
           </w:tcPr>
           <w:p>
@@ -4306,7 +4320,8 @@
         </w:tc>
         <w:tc>
           <w:tcPr>
-            <w:tcW w:w="3081" w:type="dxa"/>
+            <w:tcW w:w="4820" w:type="dxa"/>
+            <w:shd w:val="clear" w:color="auto" w:fill="auto"/>
             <w:vAlign w:val="center"/>
           </w:tcPr>
           <w:p>
@@ -4334,15 +4349,10 @@
         </w:tc>
       </w:tr>
       <w:tr>
-        <w:tblPrEx>
-          <w:tblCellMar>
-            <w:top w:w="0" w:type="dxa"/>
-            <w:bottom w:w="0" w:type="dxa"/>
-          </w:tblCellMar>
-        </w:tblPrEx>
-        <w:tc>
-          <w:tcPr>
-            <w:tcW w:w="3080" w:type="dxa"/>
+        <w:tc>
+          <w:tcPr>
+            <w:tcW w:w="2000" w:type="dxa"/>
+            <w:shd w:val="clear" w:color="auto" w:fill="auto"/>
             <w:vAlign w:val="center"/>
           </w:tcPr>
           <w:p>
@@ -4363,7 +4373,8 @@
         </w:tc>
         <w:tc>
           <w:tcPr>
-            <w:tcW w:w="3081" w:type="dxa"/>
+            <w:tcW w:w="2200" w:type="dxa"/>
+            <w:shd w:val="clear" w:color="auto" w:fill="auto"/>
             <w:vAlign w:val="center"/>
           </w:tcPr>
           <w:p>
@@ -4385,7 +4396,8 @@
         </w:tc>
         <w:tc>
           <w:tcPr>
-            <w:tcW w:w="3081" w:type="dxa"/>
+            <w:tcW w:w="4820" w:type="dxa"/>
+            <w:shd w:val="clear" w:color="auto" w:fill="auto"/>
             <w:vAlign w:val="center"/>
           </w:tcPr>
           <w:p>
@@ -4413,15 +4425,10 @@
         </w:tc>
       </w:tr>
       <w:tr>
-        <w:tblPrEx>
-          <w:tblCellMar>
-            <w:top w:w="0" w:type="dxa"/>
-            <w:bottom w:w="0" w:type="dxa"/>
-          </w:tblCellMar>
-        </w:tblPrEx>
-        <w:tc>
-          <w:tcPr>
-            <w:tcW w:w="3080" w:type="dxa"/>
+        <w:tc>
+          <w:tcPr>
+            <w:tcW w:w="2000" w:type="dxa"/>
+            <w:shd w:val="clear" w:color="auto" w:fill="auto"/>
             <w:vAlign w:val="center"/>
           </w:tcPr>
           <w:p>
@@ -4442,7 +4449,8 @@
         </w:tc>
         <w:tc>
           <w:tcPr>
-            <w:tcW w:w="3081" w:type="dxa"/>
+            <w:tcW w:w="2200" w:type="dxa"/>
+            <w:shd w:val="clear" w:color="auto" w:fill="auto"/>
             <w:vAlign w:val="center"/>
           </w:tcPr>
           <w:p>
@@ -4463,7 +4471,8 @@
         </w:tc>
         <w:tc>
           <w:tcPr>
-            <w:tcW w:w="3081" w:type="dxa"/>
+            <w:tcW w:w="4820" w:type="dxa"/>
+            <w:shd w:val="clear" w:color="auto" w:fill="auto"/>
             <w:vAlign w:val="center"/>
           </w:tcPr>
           <w:p>
@@ -4491,15 +4500,10 @@
         </w:tc>
       </w:tr>
       <w:tr>
-        <w:tblPrEx>
-          <w:tblCellMar>
-            <w:top w:w="0" w:type="dxa"/>
-            <w:bottom w:w="0" w:type="dxa"/>
-          </w:tblCellMar>
-        </w:tblPrEx>
-        <w:tc>
-          <w:tcPr>
-            <w:tcW w:w="3080" w:type="dxa"/>
+        <w:tc>
+          <w:tcPr>
+            <w:tcW w:w="2000" w:type="dxa"/>
+            <w:shd w:val="clear" w:color="auto" w:fill="auto"/>
             <w:vAlign w:val="center"/>
           </w:tcPr>
           <w:p>
@@ -4520,7 +4524,8 @@
         </w:tc>
         <w:tc>
           <w:tcPr>
-            <w:tcW w:w="3081" w:type="dxa"/>
+            <w:tcW w:w="2200" w:type="dxa"/>
+            <w:shd w:val="clear" w:color="auto" w:fill="auto"/>
             <w:vAlign w:val="center"/>
           </w:tcPr>
           <w:p>
@@ -4542,7 +4547,8 @@
         </w:tc>
         <w:tc>
           <w:tcPr>
-            <w:tcW w:w="3081" w:type="dxa"/>
+            <w:tcW w:w="4820" w:type="dxa"/>
+            <w:shd w:val="clear" w:color="auto" w:fill="auto"/>
             <w:vAlign w:val="center"/>
           </w:tcPr>
           <w:p>
@@ -4592,7 +4598,7 @@
         <w:ind w:left="420"/>
         <w:jc w:val="left"/>
       </w:pPr>
-      <w:bookmarkStart w:id="10" w:name="_Toc235221981"/>
+      <w:bookmarkStart w:id="10" w:name="_Toc235225802"/>
       <w:r>
         <w:lastRenderedPageBreak/>
         <w:t>4.2 总体架构</w:t>
@@ -5077,7 +5083,7 @@
         <w:ind w:left="420"/>
         <w:jc w:val="left"/>
       </w:pPr>
-      <w:bookmarkStart w:id="11" w:name="_Toc235221982"/>
+      <w:bookmarkStart w:id="11" w:name="_Toc235225803"/>
       <w:r>
         <w:t>4.3 目录与模块职责</w:t>
       </w:r>
@@ -5095,7 +5101,6 @@
           <w:insideH w:val="single" w:sz="4" w:space="0" w:color="auto"/>
           <w:insideV w:val="single" w:sz="4" w:space="0" w:color="auto"/>
         </w:tblBorders>
-        <w:shd w:val="clear" w:color="auto" w:fill="E6E6E6"/>
         <w:tblLayout w:type="fixed"/>
         <w:tblCellMar>
           <w:top w:w="80" w:type="dxa"/>
@@ -5170,23 +5175,32 @@
         <w:tblStyle w:val="a"/>
         <w:tblW w:w="0" w:type="auto"/>
         <w:tblInd w:w="12" w:type="dxa"/>
+        <w:tblBorders>
+          <w:top w:val="single" w:sz="4" w:space="0" w:color="auto"/>
+          <w:left w:val="single" w:sz="4" w:space="0" w:color="auto"/>
+          <w:bottom w:val="single" w:sz="4" w:space="0" w:color="auto"/>
+          <w:right w:val="single" w:sz="4" w:space="0" w:color="auto"/>
+          <w:insideH w:val="single" w:sz="4" w:space="0" w:color="auto"/>
+          <w:insideV w:val="single" w:sz="4" w:space="0" w:color="auto"/>
+        </w:tblBorders>
         <w:tblLayout w:type="fixed"/>
+        <w:tblCellMar>
+          <w:top w:w="80" w:type="dxa"/>
+          <w:left w:w="120" w:type="dxa"/>
+          <w:bottom w:w="80" w:type="dxa"/>
+          <w:right w:w="120" w:type="dxa"/>
+        </w:tblCellMar>
         <w:tblLook w:val="0000" w:firstRow="0" w:lastRow="0" w:firstColumn="0" w:lastColumn="0" w:noHBand="0" w:noVBand="0"/>
       </w:tblPr>
       <w:tblGrid>
-        <w:gridCol w:w="4621"/>
-        <w:gridCol w:w="4621"/>
+        <w:gridCol w:w="3400"/>
+        <w:gridCol w:w="5620"/>
       </w:tblGrid>
       <w:tr>
-        <w:tblPrEx>
-          <w:tblCellMar>
-            <w:top w:w="0" w:type="dxa"/>
-            <w:bottom w:w="0" w:type="dxa"/>
-          </w:tblCellMar>
-        </w:tblPrEx>
-        <w:tc>
-          <w:tcPr>
-            <w:tcW w:w="4621" w:type="dxa"/>
+        <w:tc>
+          <w:tcPr>
+            <w:tcW w:w="3400" w:type="dxa"/>
+            <w:shd w:val="clear" w:color="auto" w:fill="auto"/>
             <w:vAlign w:val="center"/>
           </w:tcPr>
           <w:p>
@@ -5207,7 +5221,8 @@
         </w:tc>
         <w:tc>
           <w:tcPr>
-            <w:tcW w:w="4621" w:type="dxa"/>
+            <w:tcW w:w="5620" w:type="dxa"/>
+            <w:shd w:val="clear" w:color="auto" w:fill="auto"/>
             <w:vAlign w:val="center"/>
           </w:tcPr>
           <w:p>
@@ -5229,15 +5244,10 @@
         </w:tc>
       </w:tr>
       <w:tr>
-        <w:tblPrEx>
-          <w:tblCellMar>
-            <w:top w:w="0" w:type="dxa"/>
-            <w:bottom w:w="0" w:type="dxa"/>
-          </w:tblCellMar>
-        </w:tblPrEx>
-        <w:tc>
-          <w:tcPr>
-            <w:tcW w:w="4621" w:type="dxa"/>
+        <w:tc>
+          <w:tcPr>
+            <w:tcW w:w="3400" w:type="dxa"/>
+            <w:shd w:val="clear" w:color="auto" w:fill="auto"/>
             <w:vAlign w:val="center"/>
           </w:tcPr>
           <w:p>
@@ -5258,7 +5268,8 @@
         </w:tc>
         <w:tc>
           <w:tcPr>
-            <w:tcW w:w="4621" w:type="dxa"/>
+            <w:tcW w:w="5620" w:type="dxa"/>
+            <w:shd w:val="clear" w:color="auto" w:fill="auto"/>
             <w:vAlign w:val="center"/>
           </w:tcPr>
           <w:p>
@@ -5286,15 +5297,10 @@
         </w:tc>
       </w:tr>
       <w:tr>
-        <w:tblPrEx>
-          <w:tblCellMar>
-            <w:top w:w="0" w:type="dxa"/>
-            <w:bottom w:w="0" w:type="dxa"/>
-          </w:tblCellMar>
-        </w:tblPrEx>
-        <w:tc>
-          <w:tcPr>
-            <w:tcW w:w="4621" w:type="dxa"/>
+        <w:tc>
+          <w:tcPr>
+            <w:tcW w:w="3400" w:type="dxa"/>
+            <w:shd w:val="clear" w:color="auto" w:fill="auto"/>
             <w:vAlign w:val="center"/>
           </w:tcPr>
           <w:p>
@@ -5315,7 +5321,8 @@
         </w:tc>
         <w:tc>
           <w:tcPr>
-            <w:tcW w:w="4621" w:type="dxa"/>
+            <w:tcW w:w="5620" w:type="dxa"/>
+            <w:shd w:val="clear" w:color="auto" w:fill="auto"/>
             <w:vAlign w:val="center"/>
           </w:tcPr>
           <w:p>
@@ -5336,36 +5343,33 @@
         </w:tc>
       </w:tr>
       <w:tr>
-        <w:tblPrEx>
-          <w:tblCellMar>
-            <w:top w:w="0" w:type="dxa"/>
-            <w:bottom w:w="0" w:type="dxa"/>
-          </w:tblCellMar>
-        </w:tblPrEx>
-        <w:tc>
-          <w:tcPr>
-            <w:tcW w:w="4621" w:type="dxa"/>
-            <w:vAlign w:val="center"/>
-          </w:tcPr>
-          <w:p>
-            <w:pPr>
-              <w:ind w:left="420"/>
-              <w:jc w:val="left"/>
-              <w:rPr>
-                <w:sz w:val="18"/>
-              </w:rPr>
-            </w:pPr>
-            <w:r>
-              <w:rPr>
-                <w:sz w:val="18"/>
-              </w:rPr>
+        <w:tc>
+          <w:tcPr>
+            <w:tcW w:w="3400" w:type="dxa"/>
+            <w:shd w:val="clear" w:color="auto" w:fill="auto"/>
+            <w:vAlign w:val="center"/>
+          </w:tcPr>
+          <w:p>
+            <w:pPr>
+              <w:ind w:left="420"/>
+              <w:jc w:val="left"/>
+              <w:rPr>
+                <w:sz w:val="18"/>
+              </w:rPr>
+            </w:pPr>
+            <w:r>
+              <w:rPr>
+                <w:sz w:val="18"/>
+              </w:rPr>
+              <w:lastRenderedPageBreak/>
               <w:t>tools/</w:t>
             </w:r>
           </w:p>
         </w:tc>
         <w:tc>
           <w:tcPr>
-            <w:tcW w:w="4621" w:type="dxa"/>
+            <w:tcW w:w="5620" w:type="dxa"/>
+            <w:shd w:val="clear" w:color="auto" w:fill="auto"/>
             <w:vAlign w:val="center"/>
           </w:tcPr>
           <w:p>
@@ -5393,37 +5397,32 @@
         </w:tc>
       </w:tr>
       <w:tr>
-        <w:tblPrEx>
-          <w:tblCellMar>
-            <w:top w:w="0" w:type="dxa"/>
-            <w:bottom w:w="0" w:type="dxa"/>
-          </w:tblCellMar>
-        </w:tblPrEx>
-        <w:tc>
-          <w:tcPr>
-            <w:tcW w:w="4621" w:type="dxa"/>
-            <w:vAlign w:val="center"/>
-          </w:tcPr>
-          <w:p>
-            <w:pPr>
-              <w:ind w:left="420"/>
-              <w:jc w:val="left"/>
-              <w:rPr>
-                <w:sz w:val="18"/>
-              </w:rPr>
-            </w:pPr>
-            <w:r>
-              <w:rPr>
-                <w:sz w:val="18"/>
-              </w:rPr>
-              <w:lastRenderedPageBreak/>
+        <w:tc>
+          <w:tcPr>
+            <w:tcW w:w="3400" w:type="dxa"/>
+            <w:shd w:val="clear" w:color="auto" w:fill="auto"/>
+            <w:vAlign w:val="center"/>
+          </w:tcPr>
+          <w:p>
+            <w:pPr>
+              <w:ind w:left="420"/>
+              <w:jc w:val="left"/>
+              <w:rPr>
+                <w:sz w:val="18"/>
+              </w:rPr>
+            </w:pPr>
+            <w:r>
+              <w:rPr>
+                <w:sz w:val="18"/>
+              </w:rPr>
               <w:t>memory/ / todo/ / skills/</w:t>
             </w:r>
           </w:p>
         </w:tc>
         <w:tc>
           <w:tcPr>
-            <w:tcW w:w="4621" w:type="dxa"/>
+            <w:tcW w:w="5620" w:type="dxa"/>
+            <w:shd w:val="clear" w:color="auto" w:fill="auto"/>
             <w:vAlign w:val="center"/>
           </w:tcPr>
           <w:p>
@@ -5445,15 +5444,10 @@
         </w:tc>
       </w:tr>
       <w:tr>
-        <w:tblPrEx>
-          <w:tblCellMar>
-            <w:top w:w="0" w:type="dxa"/>
-            <w:bottom w:w="0" w:type="dxa"/>
-          </w:tblCellMar>
-        </w:tblPrEx>
-        <w:tc>
-          <w:tcPr>
-            <w:tcW w:w="4621" w:type="dxa"/>
+        <w:tc>
+          <w:tcPr>
+            <w:tcW w:w="3400" w:type="dxa"/>
+            <w:shd w:val="clear" w:color="auto" w:fill="auto"/>
             <w:vAlign w:val="center"/>
           </w:tcPr>
           <w:p>
@@ -5474,7 +5468,8 @@
         </w:tc>
         <w:tc>
           <w:tcPr>
-            <w:tcW w:w="4621" w:type="dxa"/>
+            <w:tcW w:w="5620" w:type="dxa"/>
+            <w:shd w:val="clear" w:color="auto" w:fill="auto"/>
             <w:vAlign w:val="center"/>
           </w:tcPr>
           <w:p>
@@ -5496,15 +5491,10 @@
         </w:tc>
       </w:tr>
       <w:tr>
-        <w:tblPrEx>
-          <w:tblCellMar>
-            <w:top w:w="0" w:type="dxa"/>
-            <w:bottom w:w="0" w:type="dxa"/>
-          </w:tblCellMar>
-        </w:tblPrEx>
-        <w:tc>
-          <w:tcPr>
-            <w:tcW w:w="4621" w:type="dxa"/>
+        <w:tc>
+          <w:tcPr>
+            <w:tcW w:w="3400" w:type="dxa"/>
+            <w:shd w:val="clear" w:color="auto" w:fill="auto"/>
             <w:vAlign w:val="center"/>
           </w:tcPr>
           <w:p>
@@ -5525,7 +5515,8 @@
         </w:tc>
         <w:tc>
           <w:tcPr>
-            <w:tcW w:w="4621" w:type="dxa"/>
+            <w:tcW w:w="5620" w:type="dxa"/>
+            <w:shd w:val="clear" w:color="auto" w:fill="auto"/>
             <w:vAlign w:val="center"/>
           </w:tcPr>
           <w:p>
@@ -5553,15 +5544,10 @@
         </w:tc>
       </w:tr>
       <w:tr>
-        <w:tblPrEx>
-          <w:tblCellMar>
-            <w:top w:w="0" w:type="dxa"/>
-            <w:bottom w:w="0" w:type="dxa"/>
-          </w:tblCellMar>
-        </w:tblPrEx>
-        <w:tc>
-          <w:tcPr>
-            <w:tcW w:w="4621" w:type="dxa"/>
+        <w:tc>
+          <w:tcPr>
+            <w:tcW w:w="3400" w:type="dxa"/>
+            <w:shd w:val="clear" w:color="auto" w:fill="auto"/>
             <w:vAlign w:val="center"/>
           </w:tcPr>
           <w:p>
@@ -5582,7 +5568,8 @@
         </w:tc>
         <w:tc>
           <w:tcPr>
-            <w:tcW w:w="4621" w:type="dxa"/>
+            <w:tcW w:w="5620" w:type="dxa"/>
+            <w:shd w:val="clear" w:color="auto" w:fill="auto"/>
             <w:vAlign w:val="center"/>
           </w:tcPr>
           <w:p>
@@ -5616,7 +5603,7 @@
         <w:ind w:left="420"/>
         <w:jc w:val="left"/>
       </w:pPr>
-      <w:bookmarkStart w:id="12" w:name="_Toc235221983"/>
+      <w:bookmarkStart w:id="12" w:name="_Toc235225804"/>
       <w:r>
         <w:t>4.4 核心数据结构</w:t>
       </w:r>
@@ -5958,6 +5945,7 @@
                 <w:rFonts w:ascii="Consolas" w:hAnsi="Consolas"/>
                 <w:sz w:val="18"/>
               </w:rPr>
+              <w:lastRenderedPageBreak/>
               <w:t>}</w:t>
             </w:r>
           </w:p>
@@ -5974,7 +5962,6 @@
         <w:ind w:left="420"/>
       </w:pPr>
       <w:r>
-        <w:lastRenderedPageBreak/>
         <w:t>Message 直接对应聊天 API 的消息协议。assistant 返回 tool_calls 后，Rust 根据工具名和 JSON 参数执行工具，再以 role=tool 和 tool_call_id 写回结果。Agent 聚合各业务模块，但不把具体工具、存储或 UI 逻辑塞入调度中心。</w:t>
       </w:r>
     </w:p>
@@ -5985,7 +5972,7 @@
         <w:ind w:left="420"/>
         <w:jc w:val="left"/>
       </w:pPr>
-      <w:bookmarkStart w:id="13" w:name="_Toc235221984"/>
+      <w:bookmarkStart w:id="13" w:name="_Toc235225805"/>
       <w:r>
         <w:t>4.5 Agent 核心执行算法</w:t>
       </w:r>
@@ -6595,7 +6582,7 @@
         <w:ind w:left="420"/>
         <w:jc w:val="left"/>
       </w:pPr>
-      <w:bookmarkStart w:id="14" w:name="_Toc235221985"/>
+      <w:bookmarkStart w:id="14" w:name="_Toc235225806"/>
       <w:r>
         <w:t>4.6 工具注册与安全边界</w:t>
       </w:r>
@@ -6612,7 +6599,11 @@
         <w:t>每个工具包含</w:t>
       </w:r>
       <w:r>
-        <w:t xml:space="preserve"> name、description、usage、parameters、input_format 和 source。parameters 使用 JSON Schema 描述，既用于告诉模型如何调用，也用于 Rust 端转换与校验。当前工具覆盖计算、目录查看、分段读文件、全文搜索、仓库地图、文件写入与精确替换、安全命令、Git 状态与差异、Web Search、网页抓取、RAG、Memory、Todo、Sub-Agent 和 MCP。</w:t>
+        <w:t xml:space="preserve"> name、description、usage、parameters、input_format 和 source。parameters 使用 JSON Schema 描述，既用于告诉模型如何调用，也用于 Rust 端转换与校</w:t>
+      </w:r>
+      <w:r>
+        <w:lastRenderedPageBreak/>
+        <w:t>验。当前工具覆盖计算、目录查看、分段读文件、全文搜索、仓库地图、文件写入与精确替换、安全命令、Git 状态与差异、Web Search、网页抓取、RAG、Memory、Todo、Sub-Agent 和 MCP。</w:t>
       </w:r>
     </w:p>
     <w:p>
@@ -6625,7 +6616,6 @@
         <w:rPr>
           <w:rFonts w:hint="eastAsia"/>
         </w:rPr>
-        <w:lastRenderedPageBreak/>
         <w:t>文件工具只允许当前工作目录内的相对路径，拒绝绝对路径和</w:t>
       </w:r>
       <w:r>
@@ -6701,7 +6691,7 @@
         <w:ind w:left="420"/>
         <w:jc w:val="left"/>
       </w:pPr>
-      <w:bookmarkStart w:id="15" w:name="_Toc235221986"/>
+      <w:bookmarkStart w:id="15" w:name="_Toc235225807"/>
       <w:r>
         <w:t>4.7 Memory、Todo、Skill 与 Sub-Agent</w:t>
       </w:r>
@@ -6720,7 +6710,16 @@
         <w:ind w:left="420"/>
       </w:pPr>
       <w:r>
-        <w:t>Skill 通过 `.agents/skills/*/SKILL.md` 文件发现，解析 YAML frontmatter 得到真实清单，再由 `skill_load` 按需加载完整正文；`skill_list` 专门用于回答 Skill 数量和目录问题，避免模型依据提示词猜测。当前包含 code-review、rust-teacher、task-planner 和 rust-agent-project。Sub-Agent 具有独立消息历史、角色提示词、工具白名单和最大轮次；主 Agent 可以派遣 rust_teacher、reviewer、planner、researcher，子代理完成后只返回总结，避免把大量中间工具结果塞入主上下文。</w:t>
+        <w:t>Skill 通过 `.agents/skills/*/SKILL.md` 文件发现，解析 YAML frontmatter 得到真实清单，再由 `skill_load` 按需加载完整正文；`skill_list` 专门用于回答 Skill 数量和目录问题，避免模型依据提示词猜测。当前包含 code-review、rust-teacher、task-planner 和 rust-agent-project。Sub-Agent 具有独立消息历史、角色提示词、工具白名单和最大轮次；主 Agent 可以一次派遣多</w:t>
+      </w:r>
+      <w:r>
+        <w:rPr>
+          <w:rFonts w:hint="eastAsia"/>
+        </w:rPr>
+        <w:t>个独立子任务。</w:t>
+      </w:r>
+      <w:r>
+        <w:t>researcher、planner、rust_teacher 等只读角色通过 Tokio JoinSet 并发执行，Semaphore 把并发数限制为 3；包含 run_command 或 validate_project 的 reviewer 按安全策略串行。每个子代理通过事件报告开始、完成或失败，结果按原任务顺序返回主 Agent 汇总。</w:t>
       </w:r>
     </w:p>
     <w:p>
@@ -6730,7 +6729,7 @@
         <w:ind w:left="420"/>
         <w:jc w:val="left"/>
       </w:pPr>
-      <w:bookmarkStart w:id="16" w:name="_Toc235221987"/>
+      <w:bookmarkStart w:id="16" w:name="_Toc235225808"/>
       <w:r>
         <w:t>4.8 RAG、MCP 与 Web Search</w:t>
       </w:r>
@@ -6741,7 +6740,11 @@
         <w:ind w:left="420"/>
       </w:pPr>
       <w:r>
-        <w:t>RAG 面向用户添加的外部资料源，而不是默认检索 Agent 自身代码。用户可配置外部课程资料、笔记或参考代码文件夹，按需建立索引并检索。MCP 模块使用官方 `rmcp` SDK 建立持久 stdio 连接，完成初始化后调用 `tools/list`，把远程工具动态映射为 `mcp__server__tool`，再以普通 Function Calling 工具交给模型。Web Search 优先调用 Brave Search API；未配置 BRAVE_SEARCH_API_KEY 时自动回退到 DuckDuckGo Lite，降低使用门槛。</w:t>
+        <w:t xml:space="preserve">RAG 面向用户添加的外部资料源，而不是默认检索 Agent 自身代码。用户可配置外部课程资料、笔记或参考代码文件夹，按需建立索引并检索。MCP 模块使用官方 `rmcp` SDK 建立持久 stdio 连接，完成初始化后调用 `tools/list`，把远程工具动态映射为 </w:t>
+      </w:r>
+      <w:r>
+        <w:lastRenderedPageBreak/>
+        <w:t>`mcp__server__tool`，再以普通 Function Calling 工具交给模型。Web Search 优先调用 Brave Search API；未配置 BRAVE_SEARCH_API_KEY 时自动回退到 DuckDuckGo Lite，降低使用门槛。</w:t>
       </w:r>
     </w:p>
     <w:p>
@@ -6751,7 +6754,7 @@
         <w:ind w:left="420"/>
         <w:jc w:val="left"/>
       </w:pPr>
-      <w:bookmarkStart w:id="17" w:name="_Toc235221988"/>
+      <w:bookmarkStart w:id="17" w:name="_Toc235225809"/>
       <w:r>
         <w:t>4.9 CLI/TUI 共享事件模型</w:t>
       </w:r>
@@ -6762,7 +6765,6 @@
         <w:ind w:left="420"/>
       </w:pPr>
       <w:r>
-        <w:lastRenderedPageBreak/>
         <w:t>Agent 不直接打印终端，而是返回 AgentTurnResult，并在执行过程中通过 observer 发出 AgentEvent。CLI 将事件转换为普通文本；TUI 则由 Tokio 后台任务执行 Agent，通过 mpsc 接收同一事件流，把它渲染为用户、思考、Agent、工具、错误和运行时快照等区块。这样既保留了简单可靠的 CLI，也避免 TUI 复制 Agent 逻辑。TUI 采用左侧对话执行流、右侧真实会话状态、底部输入框的布局，支持 PgUp/PgDown、方向键、Home/End 滚动</w:t>
       </w:r>
       <w:r>
@@ -6782,7 +6784,7 @@
         <w:ind w:left="420"/>
         <w:jc w:val="left"/>
       </w:pPr>
-      <w:bookmarkStart w:id="18" w:name="_Toc235221989"/>
+      <w:bookmarkStart w:id="18" w:name="_Toc235225810"/>
       <w:r>
         <w:t>5 实验结果</w:t>
       </w:r>
@@ -6795,7 +6797,7 @@
         <w:ind w:left="420"/>
         <w:jc w:val="left"/>
       </w:pPr>
-      <w:bookmarkStart w:id="19" w:name="_Toc235221990"/>
+      <w:bookmarkStart w:id="19" w:name="_Toc235225811"/>
       <w:r>
         <w:t>5.1 编译与自动化测试</w:t>
       </w:r>
@@ -6828,6 +6830,7 @@
           <w:insideH w:val="single" w:sz="4" w:space="0" w:color="auto"/>
           <w:insideV w:val="single" w:sz="4" w:space="0" w:color="auto"/>
         </w:tblBorders>
+        <w:shd w:val="clear" w:color="auto" w:fill="E6E6E6"/>
         <w:tblLayout w:type="fixed"/>
         <w:tblCellMar>
           <w:top w:w="80" w:type="dxa"/>
@@ -6928,33 +6931,24 @@
         <w:tblStyle w:val="a"/>
         <w:tblW w:w="0" w:type="auto"/>
         <w:tblInd w:w="12" w:type="dxa"/>
-        <w:tblBorders>
-          <w:top w:val="single" w:sz="4" w:space="0" w:color="auto"/>
-          <w:left w:val="single" w:sz="4" w:space="0" w:color="auto"/>
-          <w:bottom w:val="single" w:sz="4" w:space="0" w:color="auto"/>
-          <w:right w:val="single" w:sz="4" w:space="0" w:color="auto"/>
-          <w:insideH w:val="single" w:sz="4" w:space="0" w:color="auto"/>
-          <w:insideV w:val="single" w:sz="4" w:space="0" w:color="auto"/>
-        </w:tblBorders>
         <w:tblLayout w:type="fixed"/>
-        <w:tblCellMar>
-          <w:top w:w="80" w:type="dxa"/>
-          <w:left w:w="120" w:type="dxa"/>
-          <w:bottom w:w="80" w:type="dxa"/>
-          <w:right w:w="120" w:type="dxa"/>
-        </w:tblCellMar>
         <w:tblLook w:val="0000" w:firstRow="0" w:lastRow="0" w:firstColumn="0" w:lastColumn="0" w:noHBand="0" w:noVBand="0"/>
       </w:tblPr>
       <w:tblGrid>
-        <w:gridCol w:w="2100"/>
-        <w:gridCol w:w="3700"/>
-        <w:gridCol w:w="3220"/>
+        <w:gridCol w:w="3080"/>
+        <w:gridCol w:w="3081"/>
+        <w:gridCol w:w="3081"/>
       </w:tblGrid>
       <w:tr>
-        <w:tc>
-          <w:tcPr>
-            <w:tcW w:w="2100" w:type="dxa"/>
-            <w:shd w:val="clear" w:color="auto" w:fill="auto"/>
+        <w:tblPrEx>
+          <w:tblCellMar>
+            <w:top w:w="0" w:type="dxa"/>
+            <w:bottom w:w="0" w:type="dxa"/>
+          </w:tblCellMar>
+        </w:tblPrEx>
+        <w:tc>
+          <w:tcPr>
+            <w:tcW w:w="3080" w:type="dxa"/>
             <w:vAlign w:val="center"/>
           </w:tcPr>
           <w:p>
@@ -6976,8 +6970,7 @@
         </w:tc>
         <w:tc>
           <w:tcPr>
-            <w:tcW w:w="3700" w:type="dxa"/>
-            <w:shd w:val="clear" w:color="auto" w:fill="auto"/>
+            <w:tcW w:w="3081" w:type="dxa"/>
             <w:vAlign w:val="center"/>
           </w:tcPr>
           <w:p>
@@ -6998,8 +6991,7 @@
         </w:tc>
         <w:tc>
           <w:tcPr>
-            <w:tcW w:w="3220" w:type="dxa"/>
-            <w:shd w:val="clear" w:color="auto" w:fill="auto"/>
+            <w:tcW w:w="3081" w:type="dxa"/>
             <w:vAlign w:val="center"/>
           </w:tcPr>
           <w:p>
@@ -7021,10 +7013,15 @@
         </w:tc>
       </w:tr>
       <w:tr>
-        <w:tc>
-          <w:tcPr>
-            <w:tcW w:w="2100" w:type="dxa"/>
-            <w:shd w:val="clear" w:color="auto" w:fill="auto"/>
+        <w:tblPrEx>
+          <w:tblCellMar>
+            <w:top w:w="0" w:type="dxa"/>
+            <w:bottom w:w="0" w:type="dxa"/>
+          </w:tblCellMar>
+        </w:tblPrEx>
+        <w:tc>
+          <w:tcPr>
+            <w:tcW w:w="3080" w:type="dxa"/>
             <w:vAlign w:val="center"/>
           </w:tcPr>
           <w:p>
@@ -7046,8 +7043,7 @@
         </w:tc>
         <w:tc>
           <w:tcPr>
-            <w:tcW w:w="3700" w:type="dxa"/>
-            <w:shd w:val="clear" w:color="auto" w:fill="auto"/>
+            <w:tcW w:w="3081" w:type="dxa"/>
             <w:vAlign w:val="center"/>
           </w:tcPr>
           <w:p>
@@ -7068,8 +7064,7 @@
         </w:tc>
         <w:tc>
           <w:tcPr>
-            <w:tcW w:w="3220" w:type="dxa"/>
-            <w:shd w:val="clear" w:color="auto" w:fill="auto"/>
+            <w:tcW w:w="3081" w:type="dxa"/>
             <w:vAlign w:val="center"/>
           </w:tcPr>
           <w:p>
@@ -7091,10 +7086,15 @@
         </w:tc>
       </w:tr>
       <w:tr>
-        <w:tc>
-          <w:tcPr>
-            <w:tcW w:w="2100" w:type="dxa"/>
-            <w:shd w:val="clear" w:color="auto" w:fill="auto"/>
+        <w:tblPrEx>
+          <w:tblCellMar>
+            <w:top w:w="0" w:type="dxa"/>
+            <w:bottom w:w="0" w:type="dxa"/>
+          </w:tblCellMar>
+        </w:tblPrEx>
+        <w:tc>
+          <w:tcPr>
+            <w:tcW w:w="3080" w:type="dxa"/>
             <w:vAlign w:val="center"/>
           </w:tcPr>
           <w:p>
@@ -7116,8 +7116,7 @@
         </w:tc>
         <w:tc>
           <w:tcPr>
-            <w:tcW w:w="3700" w:type="dxa"/>
-            <w:shd w:val="clear" w:color="auto" w:fill="auto"/>
+            <w:tcW w:w="3081" w:type="dxa"/>
             <w:vAlign w:val="center"/>
           </w:tcPr>
           <w:p>
@@ -7138,8 +7137,7 @@
         </w:tc>
         <w:tc>
           <w:tcPr>
-            <w:tcW w:w="3220" w:type="dxa"/>
-            <w:shd w:val="clear" w:color="auto" w:fill="auto"/>
+            <w:tcW w:w="3081" w:type="dxa"/>
             <w:vAlign w:val="center"/>
           </w:tcPr>
           <w:p>
@@ -7161,10 +7159,15 @@
         </w:tc>
       </w:tr>
       <w:tr>
-        <w:tc>
-          <w:tcPr>
-            <w:tcW w:w="2100" w:type="dxa"/>
-            <w:shd w:val="clear" w:color="auto" w:fill="auto"/>
+        <w:tblPrEx>
+          <w:tblCellMar>
+            <w:top w:w="0" w:type="dxa"/>
+            <w:bottom w:w="0" w:type="dxa"/>
+          </w:tblCellMar>
+        </w:tblPrEx>
+        <w:tc>
+          <w:tcPr>
+            <w:tcW w:w="3080" w:type="dxa"/>
             <w:vAlign w:val="center"/>
           </w:tcPr>
           <w:p>
@@ -7186,8 +7189,7 @@
         </w:tc>
         <w:tc>
           <w:tcPr>
-            <w:tcW w:w="3700" w:type="dxa"/>
-            <w:shd w:val="clear" w:color="auto" w:fill="auto"/>
+            <w:tcW w:w="3081" w:type="dxa"/>
             <w:vAlign w:val="center"/>
           </w:tcPr>
           <w:p>
@@ -7208,8 +7210,7 @@
         </w:tc>
         <w:tc>
           <w:tcPr>
-            <w:tcW w:w="3220" w:type="dxa"/>
-            <w:shd w:val="clear" w:color="auto" w:fill="auto"/>
+            <w:tcW w:w="3081" w:type="dxa"/>
             <w:vAlign w:val="center"/>
           </w:tcPr>
           <w:p>
@@ -7224,16 +7225,21 @@
               <w:rPr>
                 <w:sz w:val="19"/>
               </w:rPr>
-              <w:t>13 passed; 0 failed</w:t>
+              <w:t>16 passed; 0 failed</w:t>
             </w:r>
           </w:p>
         </w:tc>
       </w:tr>
       <w:tr>
-        <w:tc>
-          <w:tcPr>
-            <w:tcW w:w="2100" w:type="dxa"/>
-            <w:shd w:val="clear" w:color="auto" w:fill="auto"/>
+        <w:tblPrEx>
+          <w:tblCellMar>
+            <w:top w:w="0" w:type="dxa"/>
+            <w:bottom w:w="0" w:type="dxa"/>
+          </w:tblCellMar>
+        </w:tblPrEx>
+        <w:tc>
+          <w:tcPr>
+            <w:tcW w:w="3080" w:type="dxa"/>
             <w:vAlign w:val="center"/>
           </w:tcPr>
           <w:p>
@@ -7255,8 +7261,7 @@
         </w:tc>
         <w:tc>
           <w:tcPr>
-            <w:tcW w:w="3700" w:type="dxa"/>
-            <w:shd w:val="clear" w:color="auto" w:fill="auto"/>
+            <w:tcW w:w="3081" w:type="dxa"/>
             <w:vAlign w:val="center"/>
           </w:tcPr>
           <w:p>
@@ -7284,8 +7289,7 @@
         </w:tc>
         <w:tc>
           <w:tcPr>
-            <w:tcW w:w="3220" w:type="dxa"/>
-            <w:shd w:val="clear" w:color="auto" w:fill="auto"/>
+            <w:tcW w:w="3081" w:type="dxa"/>
             <w:vAlign w:val="center"/>
           </w:tcPr>
           <w:p>
@@ -7300,7 +7304,7 @@
               <w:rPr>
                 <w:sz w:val="19"/>
               </w:rPr>
-              <w:t>25 个 Rust 文件，约 5675 行</w:t>
+              <w:t>25 个 Rust 文件，约 6062 行</w:t>
             </w:r>
           </w:p>
         </w:tc>
@@ -7350,7 +7354,7 @@
                 <w:rFonts w:ascii="Consolas" w:hAnsi="Consolas"/>
                 <w:sz w:val="18"/>
               </w:rPr>
-              <w:t>running 13 tests</w:t>
+              <w:t>running 16 tests</w:t>
             </w:r>
           </w:p>
           <w:p>
@@ -7367,7 +7371,8 @@
                 <w:rFonts w:ascii="Consolas" w:hAnsi="Consolas"/>
                 <w:sz w:val="18"/>
               </w:rPr>
-              <w:t>test result: ok. 13 passed; 0 failed; 0 ignored; 0 measured; 0 filtered out</w:t>
+              <w:lastRenderedPageBreak/>
+              <w:t>test result: ok. 16 passed; 0 failed; 0 ignored; 0 measured; 0 filtered out</w:t>
             </w:r>
           </w:p>
         </w:tc>
@@ -7390,11 +7395,7 @@
         <w:t>测试覆盖</w:t>
       </w:r>
       <w:r>
-        <w:t xml:space="preserve"> Todo 会话隔离、Todo 状态约束、.env 引号解析、分段文件读取、Git 路径越界拒绝、项目文本搜索、仓库地图、工作区指令加载和 Skill 文件发现等关键行为。Windows </w:t>
-      </w:r>
-      <w:r>
-        <w:lastRenderedPageBreak/>
-        <w:t>上偶尔出现 incremental cache 无法 hard link 的警告，但它属于文件系统缓存性能提示，不影响编译、测试和功能结果。</w:t>
+        <w:t xml:space="preserve"> Todo 会话隔离、Todo 状态约束、.env 引号解析、分段文件读取、Git 路径越界拒绝、项目文本搜索、仓库地图、工作区指令加载、Skill 文件发现、单任务兼容、批量子任务顺序和并行安全角色判定等关键行为。Windows 上偶尔出现 incremental cache 无法 hard link 的警告，但它属于文件系统缓存性能提示，不影响编译、测试和功能结果。</w:t>
       </w:r>
     </w:p>
     <w:p>
@@ -7404,7 +7405,7 @@
         <w:ind w:left="420"/>
         <w:jc w:val="left"/>
       </w:pPr>
-      <w:bookmarkStart w:id="20" w:name="_Toc235221991"/>
+      <w:bookmarkStart w:id="20" w:name="_Toc235225812"/>
       <w:r>
         <w:t>5.2 功能验证</w:t>
       </w:r>
@@ -8089,7 +8090,7 @@
         <w:ind w:left="420"/>
         <w:jc w:val="left"/>
       </w:pPr>
-      <w:bookmarkStart w:id="21" w:name="_Toc235221992"/>
+      <w:bookmarkStart w:id="21" w:name="_Toc235225813"/>
       <w:r>
         <w:t>5.3 运行示例</w:t>
       </w:r>
@@ -8190,6 +8191,7 @@
                 <w:rFonts w:ascii="Consolas" w:hAnsi="Consolas"/>
                 <w:sz w:val="18"/>
               </w:rPr>
+              <w:lastRenderedPageBreak/>
               <w:t xml:space="preserve"># </w:t>
             </w:r>
             <w:r>
@@ -8317,7 +8319,6 @@
                 <w:rFonts w:ascii="Consolas" w:hAnsi="Consolas"/>
                 <w:sz w:val="18"/>
               </w:rPr>
-              <w:lastRenderedPageBreak/>
               <w:t>Agent</w:t>
             </w:r>
             <w:r>
@@ -8371,7 +8372,7 @@
         <w:ind w:left="420"/>
         <w:jc w:val="left"/>
       </w:pPr>
-      <w:bookmarkStart w:id="22" w:name="_Toc235221993"/>
+      <w:bookmarkStart w:id="22" w:name="_Toc235225814"/>
       <w:r>
         <w:t>5.4 已知限制与后续计划</w:t>
       </w:r>
@@ -8423,10 +8424,10 @@
         <w:rPr>
           <w:rFonts w:hint="eastAsia"/>
         </w:rPr>
-        <w:t>子代理当前顺序执行，尚未实现多个独立子任务并行派遣和</w:t>
-      </w:r>
-      <w:r>
-        <w:t xml:space="preserve"> Agent Team。</w:t>
+        <w:t>子代理已支持最多</w:t>
+      </w:r>
+      <w:r>
+        <w:t xml:space="preserve"> 3 个独立只读任务并发；命令执行、项目校验和未来写操作仍保持串行，尚未实现依赖 DAG、取消、超时和隔离工作区。</w:t>
       </w:r>
     </w:p>
     <w:p>
@@ -8462,7 +8463,7 @@
         <w:ind w:left="420"/>
         <w:jc w:val="left"/>
       </w:pPr>
-      <w:bookmarkStart w:id="23" w:name="_Toc235221994"/>
+      <w:bookmarkStart w:id="23" w:name="_Toc235225815"/>
       <w:r>
         <w:t>5.5 开发过程、困难与知识总结</w:t>
       </w:r>
@@ -8471,24 +8472,19 @@
     <w:p>
       <w:pPr>
         <w:ind w:left="420"/>
+      </w:pPr>
+      <w:r>
         <w:rPr>
           <w:rFonts w:hint="eastAsia"/>
         </w:rPr>
-      </w:pPr>
-      <w:r>
-        <w:rPr>
-          <w:rFonts w:hint="eastAsia"/>
-        </w:rPr>
         <w:t>项目采用“先跑通最小闭环，再逐层扩展”的方式推进。第一阶段完成</w:t>
       </w:r>
       <w:r>
-        <w:t xml:space="preserve"> DeepSeek 对话和本地工具注册；第二阶段把文本形式的工具请求升级为原生 tool_calls / role=tool 协议，并加入工具结果回填后的继续决策；第三阶段补充文件写入、Git、Web、Memory、Todo、Sub-Agent、RAG 和 Hook；第四阶段抽离 CLI/TUI 共享事件模型；第五阶段实现文件化 Skill、官方 rmcp MCP 桥接、动态运行时状态和提交版本保护。每个阶段都通过编译、测试和文档同步保持可回退</w:t>
-      </w:r>
-      <w:r>
-        <w:rPr>
-          <w:rFonts w:hint="eastAsia"/>
-        </w:rPr>
-        <w:t>。</w:t>
+        <w:t xml:space="preserve"> DeepSeek 对话和本地工具注册；第二阶段把文本形式的工具请求升级为原生 tool_calls / role=tool 协议，并加入工具结果回填后的继续决策；第三阶段补充文件写入、Git、Web、Memory、Todo、Sub-Agent、RAG 和 Hook；第四阶段抽离 CLI/TUI 共享事件模型；第五阶段实现文件化 Skill、官方 rmcp MCP 桥接、动态运行时状态和提交版本保护；第六阶段使用 Tokio </w:t>
+      </w:r>
+      <w:r>
+        <w:lastRenderedPageBreak/>
+        <w:t>JoinSet、Semaphore 和 mpsc 事件通道实现受控的并行只读子代理调度。每个阶段都通过编译、测试和文档同步保持可回退。</w:t>
       </w:r>
     </w:p>
     <w:p>
@@ -8523,7 +8519,6 @@
         <w:rPr>
           <w:rFonts w:hint="eastAsia"/>
         </w:rPr>
-        <w:lastRenderedPageBreak/>
         <w:t>程序最初不会自动读取</w:t>
       </w:r>
       <w:r>
@@ -8564,6 +8559,22 @@
       </w:r>
       <w:r>
         <w:t xml:space="preserve"> system prompt 误报 Skill 数量。新增 skill_list 工具，让清单问题必须读取真实文件发现结果；skill_load 只在需要时加载完整正文，避免启动上下文膨胀。</w:t>
+      </w:r>
+    </w:p>
+    <w:p>
+      <w:pPr>
+        <w:spacing w:after="80"/>
+        <w:ind w:left="420"/>
+        <w:jc w:val="left"/>
+      </w:pPr>
+      <w:r>
+        <w:rPr>
+          <w:rFonts w:hint="eastAsia"/>
+        </w:rPr>
+        <w:t>子代理最初只有单任务</w:t>
+      </w:r>
+      <w:r>
+        <w:t xml:space="preserve"> await，因此即使任务互不依赖也会顺序等待。改进后批量请求按工具能力分组：只读角色进入 JoinSet 并由 Semaphore 限流，带命令工具的角色串行；mpsc 将每个任务的状态实时转给 UI，最终结果再按原顺序聚合。</w:t>
       </w:r>
     </w:p>
     <w:p>
@@ -8621,6 +8632,7 @@
         <w:jc w:val="left"/>
       </w:pPr>
       <w:r>
+        <w:lastRenderedPageBreak/>
         <w:t>Serde 类型化数据：用结构体和 JSON Schema 表示 API 消息、工具参数、Todo、Skill frontmatter 和 MCP 工具，减少字符串拼接带来的协议错误。</w:t>
       </w:r>
     </w:p>
@@ -8687,9 +8699,8 @@
         <w:ind w:left="420"/>
         <w:jc w:val="left"/>
       </w:pPr>
-      <w:bookmarkStart w:id="24" w:name="_Toc235221995"/>
-      <w:r>
-        <w:lastRenderedPageBreak/>
+      <w:bookmarkStart w:id="24" w:name="_Toc235225816"/>
+      <w:r>
         <w:t>6 开源项目参考说明</w:t>
       </w:r>
       <w:bookmarkEnd w:id="24"/>
@@ -8701,7 +8712,7 @@
         <w:ind w:left="420"/>
         <w:jc w:val="left"/>
       </w:pPr>
-      <w:bookmarkStart w:id="25" w:name="_Toc235221996"/>
+      <w:bookmarkStart w:id="25" w:name="_Toc235225817"/>
       <w:r>
         <w:t>6.1 参考来源与引用方式</w:t>
       </w:r>
@@ -9102,6 +9113,7 @@
               <w:rPr>
                 <w:sz w:val="16"/>
               </w:rPr>
+              <w:lastRenderedPageBreak/>
               <w:t>Aider</w:t>
             </w:r>
           </w:p>
@@ -9201,7 +9213,7 @@
         <w:ind w:left="420"/>
         <w:jc w:val="left"/>
       </w:pPr>
-      <w:bookmarkStart w:id="26" w:name="_Toc235221997"/>
+      <w:bookmarkStart w:id="26" w:name="_Toc235225818"/>
       <w:r>
         <w:t>6.2 本项目的独立工作与改进</w:t>
       </w:r>
@@ -9297,7 +9309,6 @@
         <w:rPr>
           <w:rFonts w:hint="eastAsia"/>
         </w:rPr>
-        <w:lastRenderedPageBreak/>
         <w:t>区分长期</w:t>
       </w:r>
       <w:r>
@@ -9327,7 +9338,7 @@
         <w:ind w:left="420"/>
         <w:jc w:val="left"/>
       </w:pPr>
-      <w:bookmarkStart w:id="27" w:name="_Toc235221998"/>
+      <w:bookmarkStart w:id="27" w:name="_Toc235225819"/>
       <w:r>
         <w:t>7 结论</w:t>
       </w:r>
@@ -9344,7 +9355,7 @@
         <w:t>本项目完成了一个可实际运行的</w:t>
       </w:r>
       <w:r>
-        <w:t xml:space="preserve"> Rust + DeepSeek 通用 Agent。它已经超越简单聊天机器人：能够依据自然语言自主选择工具、观察执行结果、持续推进 Todo、修改与验证代码，并通过 Memory、文件化 Skill、Sub-Agent、外部 RAG 和官方 rmcp MCP 桥接扩展能力。模块化结构、13 项自动化测试和 Clippy 清零保证了当前版本的可读性与基本可靠性。</w:t>
+        <w:t xml:space="preserve"> Rust + DeepSeek 通用 Agent。它已经超越简单聊天机器人：能够依据自然语言自主选择工具、观察执行结果、持续推进 Todo、修改与验证代码，并通过 Memory、文件化 Skill、并行只读 Sub-Agent、外部 RAG 和官方 rmcp MCP 桥接扩展能力。模块化结构、16 项自动化测试和 Clippy 清零保证了当前版本的可读性与基本可靠性。</w:t>
       </w:r>
     </w:p>
     <w:p>
@@ -9358,7 +9369,7 @@
         <w:t>从课程学习角度看，项目综合运用了</w:t>
       </w:r>
       <w:r>
-        <w:t xml:space="preserve"> Rust 模块系统、结构体与枚举、所有权与借用、Result 错误处理、trait 相关库接口、Serde 序列化、Tokio 异步编程、文件与进程操作等知识；同时也训练了需求分析、架构设计、测试和文档维护能力。后续若继续实现 token 级流式输出、语义 RAG、权限确认和并行 Agent Team，可进一步提升产品化程度。</w:t>
+        <w:t xml:space="preserve"> Rust 模块系统、结构体与枚举、所有权与借用、Result 错误处理、trait 相关库接口、Serde 序列化、Tokio 异步编程、文件与进程操作等知识；同时也训练了需求分析、架构设计、测试和文档维护能力。后续若继续实现 token 级流式输出、语义 RAG、权限确认、子任务依赖 DAG 和隔离工作区，可进一步提升产品化程度。</w:t>
       </w:r>
     </w:p>
     <w:p>
@@ -9371,11 +9382,12 @@
           <w:rFonts w:hint="eastAsia"/>
         </w:rPr>
       </w:pPr>
-      <w:bookmarkStart w:id="28" w:name="_Toc235221999"/>
+      <w:bookmarkStart w:id="28" w:name="_Toc235225820"/>
       <w:r>
         <w:rPr>
           <w:rFonts w:hint="eastAsia"/>
         </w:rPr>
+        <w:lastRenderedPageBreak/>
         <w:t>参考文献</w:t>
       </w:r>
       <w:bookmarkEnd w:id="28"/>
@@ -9557,12 +9569,11 @@
         <w:ind w:left="420"/>
         <w:jc w:val="left"/>
       </w:pPr>
-      <w:bookmarkStart w:id="29" w:name="_Toc235222000"/>
+      <w:bookmarkStart w:id="29" w:name="_Toc235225821"/>
       <w:r>
         <w:rPr>
           <w:rFonts w:hint="eastAsia"/>
         </w:rPr>
-        <w:lastRenderedPageBreak/>
         <w:t>附录</w:t>
       </w:r>
       <w:r>
@@ -9582,6 +9593,7 @@
           <w:insideH w:val="single" w:sz="4" w:space="0" w:color="auto"/>
           <w:insideV w:val="single" w:sz="4" w:space="0" w:color="auto"/>
         </w:tblBorders>
+        <w:shd w:val="clear" w:color="auto" w:fill="E6E6E6"/>
         <w:tblLayout w:type="fixed"/>
         <w:tblCellMar>
           <w:top w:w="80" w:type="dxa"/>
@@ -9683,36 +9695,24 @@
         <w:tblStyle w:val="a"/>
         <w:tblW w:w="0" w:type="auto"/>
         <w:tblInd w:w="12" w:type="dxa"/>
-        <w:tblBorders>
-          <w:top w:val="single" w:sz="4" w:space="0" w:color="auto"/>
-          <w:left w:val="single" w:sz="4" w:space="0" w:color="auto"/>
-          <w:bottom w:val="single" w:sz="4" w:space="0" w:color="auto"/>
-          <w:right w:val="single" w:sz="4" w:space="0" w:color="auto"/>
-          <w:insideH w:val="single" w:sz="4" w:space="0" w:color="auto"/>
-          <w:insideV w:val="single" w:sz="4" w:space="0" w:color="auto"/>
-        </w:tblBorders>
         <w:tblLayout w:type="fixed"/>
-        <w:tblCellMar>
-          <w:top w:w="80" w:type="dxa"/>
-          <w:left w:w="120" w:type="dxa"/>
-          <w:bottom w:w="80" w:type="dxa"/>
-          <w:right w:w="120" w:type="dxa"/>
-        </w:tblCellMar>
         <w:tblLook w:val="0000" w:firstRow="0" w:lastRow="0" w:firstColumn="0" w:lastColumn="0" w:noHBand="0" w:noVBand="0"/>
       </w:tblPr>
       <w:tblGrid>
-        <w:gridCol w:w="1400"/>
-        <w:gridCol w:w="2900"/>
-        <w:gridCol w:w="4720"/>
+        <w:gridCol w:w="3080"/>
+        <w:gridCol w:w="3081"/>
+        <w:gridCol w:w="3081"/>
       </w:tblGrid>
       <w:tr>
-        <w:trPr>
-          <w:cantSplit/>
-        </w:trPr>
-        <w:tc>
-          <w:tcPr>
-            <w:tcW w:w="1400" w:type="dxa"/>
-            <w:shd w:val="clear" w:color="auto" w:fill="auto"/>
+        <w:tblPrEx>
+          <w:tblCellMar>
+            <w:top w:w="0" w:type="dxa"/>
+            <w:bottom w:w="0" w:type="dxa"/>
+          </w:tblCellMar>
+        </w:tblPrEx>
+        <w:tc>
+          <w:tcPr>
+            <w:tcW w:w="3080" w:type="dxa"/>
             <w:vAlign w:val="center"/>
           </w:tcPr>
           <w:p>
@@ -9733,8 +9733,7 @@
         </w:tc>
         <w:tc>
           <w:tcPr>
-            <w:tcW w:w="2900" w:type="dxa"/>
-            <w:shd w:val="clear" w:color="auto" w:fill="auto"/>
+            <w:tcW w:w="3081" w:type="dxa"/>
             <w:vAlign w:val="center"/>
           </w:tcPr>
           <w:p>
@@ -9762,8 +9761,7 @@
         </w:tc>
         <w:tc>
           <w:tcPr>
-            <w:tcW w:w="4720" w:type="dxa"/>
-            <w:shd w:val="clear" w:color="auto" w:fill="auto"/>
+            <w:tcW w:w="3081" w:type="dxa"/>
             <w:vAlign w:val="center"/>
           </w:tcPr>
           <w:p>
@@ -9791,13 +9789,15 @@
         </w:tc>
       </w:tr>
       <w:tr>
-        <w:trPr>
-          <w:cantSplit/>
-        </w:trPr>
-        <w:tc>
-          <w:tcPr>
-            <w:tcW w:w="1400" w:type="dxa"/>
-            <w:shd w:val="clear" w:color="auto" w:fill="auto"/>
+        <w:tblPrEx>
+          <w:tblCellMar>
+            <w:top w:w="0" w:type="dxa"/>
+            <w:bottom w:w="0" w:type="dxa"/>
+          </w:tblCellMar>
+        </w:tblPrEx>
+        <w:tc>
+          <w:tcPr>
+            <w:tcW w:w="3080" w:type="dxa"/>
             <w:vAlign w:val="center"/>
           </w:tcPr>
           <w:p>
@@ -9818,8 +9818,7 @@
         </w:tc>
         <w:tc>
           <w:tcPr>
-            <w:tcW w:w="2900" w:type="dxa"/>
-            <w:shd w:val="clear" w:color="auto" w:fill="auto"/>
+            <w:tcW w:w="3081" w:type="dxa"/>
             <w:vAlign w:val="center"/>
           </w:tcPr>
           <w:p>
@@ -9840,8 +9839,7 @@
         </w:tc>
         <w:tc>
           <w:tcPr>
-            <w:tcW w:w="4720" w:type="dxa"/>
-            <w:shd w:val="clear" w:color="auto" w:fill="auto"/>
+            <w:tcW w:w="3081" w:type="dxa"/>
             <w:vAlign w:val="center"/>
           </w:tcPr>
           <w:p>
@@ -9869,13 +9867,15 @@
         </w:tc>
       </w:tr>
       <w:tr>
-        <w:trPr>
-          <w:cantSplit/>
-        </w:trPr>
-        <w:tc>
-          <w:tcPr>
-            <w:tcW w:w="1400" w:type="dxa"/>
-            <w:shd w:val="clear" w:color="auto" w:fill="auto"/>
+        <w:tblPrEx>
+          <w:tblCellMar>
+            <w:top w:w="0" w:type="dxa"/>
+            <w:bottom w:w="0" w:type="dxa"/>
+          </w:tblCellMar>
+        </w:tblPrEx>
+        <w:tc>
+          <w:tcPr>
+            <w:tcW w:w="3080" w:type="dxa"/>
             <w:vAlign w:val="center"/>
           </w:tcPr>
           <w:p>
@@ -9896,8 +9896,7 @@
         </w:tc>
         <w:tc>
           <w:tcPr>
-            <w:tcW w:w="2900" w:type="dxa"/>
-            <w:shd w:val="clear" w:color="auto" w:fill="auto"/>
+            <w:tcW w:w="3081" w:type="dxa"/>
             <w:vAlign w:val="center"/>
           </w:tcPr>
           <w:p>
@@ -9925,8 +9924,7 @@
         </w:tc>
         <w:tc>
           <w:tcPr>
-            <w:tcW w:w="4720" w:type="dxa"/>
-            <w:shd w:val="clear" w:color="auto" w:fill="auto"/>
+            <w:tcW w:w="3081" w:type="dxa"/>
             <w:vAlign w:val="center"/>
           </w:tcPr>
           <w:p>
@@ -9954,13 +9952,15 @@
         </w:tc>
       </w:tr>
       <w:tr>
-        <w:trPr>
-          <w:cantSplit/>
-        </w:trPr>
-        <w:tc>
-          <w:tcPr>
-            <w:tcW w:w="1400" w:type="dxa"/>
-            <w:shd w:val="clear" w:color="auto" w:fill="auto"/>
+        <w:tblPrEx>
+          <w:tblCellMar>
+            <w:top w:w="0" w:type="dxa"/>
+            <w:bottom w:w="0" w:type="dxa"/>
+          </w:tblCellMar>
+        </w:tblPrEx>
+        <w:tc>
+          <w:tcPr>
+            <w:tcW w:w="3080" w:type="dxa"/>
             <w:vAlign w:val="center"/>
           </w:tcPr>
           <w:p>
@@ -9981,8 +9981,7 @@
         </w:tc>
         <w:tc>
           <w:tcPr>
-            <w:tcW w:w="2900" w:type="dxa"/>
-            <w:shd w:val="clear" w:color="auto" w:fill="auto"/>
+            <w:tcW w:w="3081" w:type="dxa"/>
             <w:vAlign w:val="center"/>
           </w:tcPr>
           <w:p>
@@ -10003,8 +10002,7 @@
         </w:tc>
         <w:tc>
           <w:tcPr>
-            <w:tcW w:w="4720" w:type="dxa"/>
-            <w:shd w:val="clear" w:color="auto" w:fill="auto"/>
+            <w:tcW w:w="3081" w:type="dxa"/>
             <w:vAlign w:val="center"/>
           </w:tcPr>
           <w:p>
@@ -10032,13 +10030,15 @@
         </w:tc>
       </w:tr>
       <w:tr>
-        <w:trPr>
-          <w:cantSplit/>
-        </w:trPr>
-        <w:tc>
-          <w:tcPr>
-            <w:tcW w:w="1400" w:type="dxa"/>
-            <w:shd w:val="clear" w:color="auto" w:fill="auto"/>
+        <w:tblPrEx>
+          <w:tblCellMar>
+            <w:top w:w="0" w:type="dxa"/>
+            <w:bottom w:w="0" w:type="dxa"/>
+          </w:tblCellMar>
+        </w:tblPrEx>
+        <w:tc>
+          <w:tcPr>
+            <w:tcW w:w="3080" w:type="dxa"/>
             <w:vAlign w:val="center"/>
           </w:tcPr>
           <w:p>
@@ -10059,8 +10059,7 @@
         </w:tc>
         <w:tc>
           <w:tcPr>
-            <w:tcW w:w="2900" w:type="dxa"/>
-            <w:shd w:val="clear" w:color="auto" w:fill="auto"/>
+            <w:tcW w:w="3081" w:type="dxa"/>
             <w:vAlign w:val="center"/>
           </w:tcPr>
           <w:p>
@@ -10081,8 +10080,7 @@
         </w:tc>
         <w:tc>
           <w:tcPr>
-            <w:tcW w:w="4720" w:type="dxa"/>
-            <w:shd w:val="clear" w:color="auto" w:fill="auto"/>
+            <w:tcW w:w="3081" w:type="dxa"/>
             <w:vAlign w:val="center"/>
           </w:tcPr>
           <w:p>
@@ -10098,25 +10096,27 @@
                 <w:rFonts w:hint="eastAsia"/>
                 <w:sz w:val="17"/>
               </w:rPr>
-              <w:t>快速展示</w:t>
+              <w:t>派遣多个独立只读子代理，展示开始</w:t>
             </w:r>
             <w:r>
               <w:rPr>
                 <w:sz w:val="17"/>
               </w:rPr>
-              <w:t xml:space="preserve"> /subagents、RAG 数据源和 MCP 配置，强调可扩展性</w:t>
+              <w:t>/完成事件和并行汇总</w:t>
             </w:r>
           </w:p>
         </w:tc>
       </w:tr>
       <w:tr>
-        <w:trPr>
-          <w:cantSplit/>
-        </w:trPr>
-        <w:tc>
-          <w:tcPr>
-            <w:tcW w:w="1400" w:type="dxa"/>
-            <w:shd w:val="clear" w:color="auto" w:fill="auto"/>
+        <w:tblPrEx>
+          <w:tblCellMar>
+            <w:top w:w="0" w:type="dxa"/>
+            <w:bottom w:w="0" w:type="dxa"/>
+          </w:tblCellMar>
+        </w:tblPrEx>
+        <w:tc>
+          <w:tcPr>
+            <w:tcW w:w="3080" w:type="dxa"/>
             <w:vAlign w:val="center"/>
           </w:tcPr>
           <w:p>
@@ -10131,14 +10131,14 @@
               <w:rPr>
                 <w:sz w:val="17"/>
               </w:rPr>
+              <w:lastRenderedPageBreak/>
               <w:t>2:30-2:50</w:t>
             </w:r>
           </w:p>
         </w:tc>
         <w:tc>
           <w:tcPr>
-            <w:tcW w:w="2900" w:type="dxa"/>
-            <w:shd w:val="clear" w:color="auto" w:fill="auto"/>
+            <w:tcW w:w="3081" w:type="dxa"/>
             <w:vAlign w:val="center"/>
           </w:tcPr>
           <w:p>
@@ -10166,8 +10166,7 @@
         </w:tc>
         <w:tc>
           <w:tcPr>
-            <w:tcW w:w="4720" w:type="dxa"/>
-            <w:shd w:val="clear" w:color="auto" w:fill="auto"/>
+            <w:tcW w:w="3081" w:type="dxa"/>
             <w:vAlign w:val="center"/>
           </w:tcPr>
           <w:p>
@@ -10189,19 +10188,21 @@
               <w:rPr>
                 <w:sz w:val="17"/>
               </w:rPr>
-              <w:t>AgentEvent 共享 UI，展示 13 passed; 0 failed 和 Clippy 清零</w:t>
+              <w:t>AgentEvent 共享 UI，展示 16 passed; 0 failed 和 Clippy 清零</w:t>
             </w:r>
           </w:p>
         </w:tc>
       </w:tr>
       <w:tr>
-        <w:trPr>
-          <w:cantSplit/>
-        </w:trPr>
-        <w:tc>
-          <w:tcPr>
-            <w:tcW w:w="1400" w:type="dxa"/>
-            <w:shd w:val="clear" w:color="auto" w:fill="auto"/>
+        <w:tblPrEx>
+          <w:tblCellMar>
+            <w:top w:w="0" w:type="dxa"/>
+            <w:bottom w:w="0" w:type="dxa"/>
+          </w:tblCellMar>
+        </w:tblPrEx>
+        <w:tc>
+          <w:tcPr>
+            <w:tcW w:w="3080" w:type="dxa"/>
             <w:vAlign w:val="center"/>
           </w:tcPr>
           <w:p>
@@ -10222,8 +10223,7 @@
         </w:tc>
         <w:tc>
           <w:tcPr>
-            <w:tcW w:w="2900" w:type="dxa"/>
-            <w:shd w:val="clear" w:color="auto" w:fill="auto"/>
+            <w:tcW w:w="3081" w:type="dxa"/>
             <w:vAlign w:val="center"/>
           </w:tcPr>
           <w:p>
@@ -10245,8 +10245,7 @@
         </w:tc>
         <w:tc>
           <w:tcPr>
-            <w:tcW w:w="4720" w:type="dxa"/>
-            <w:shd w:val="clear" w:color="auto" w:fill="auto"/>
+            <w:tcW w:w="3081" w:type="dxa"/>
             <w:vAlign w:val="center"/>
           </w:tcPr>
           <w:p>
@@ -10288,7 +10287,7 @@
         <w:ind w:left="420"/>
         <w:jc w:val="left"/>
       </w:pPr>
-      <w:bookmarkStart w:id="30" w:name="_Toc235222001"/>
+      <w:bookmarkStart w:id="30" w:name="_Toc235225822"/>
       <w:r>
         <w:rPr>
           <w:rFonts w:hint="eastAsia"/>
@@ -10651,7 +10650,7 @@
 <file path=word/numbering.xml><?xml version="1.0" encoding="utf-8"?>
 <w:numbering xmlns:wpc="http://schemas.microsoft.com/office/word/2010/wordprocessingCanvas" xmlns:cx="http://schemas.microsoft.com/office/drawing/2014/chartex" xmlns:cx1="http://schemas.microsoft.com/office/drawing/2015/9/8/chartex" xmlns:cx2="http://schemas.microsoft.com/office/drawing/2015/10/21/chartex" xmlns:cx3="http://schemas.microsoft.com/office/drawing/2016/5/9/chartex" xmlns:cx4="http://schemas.microsoft.com/office/drawing/2016/5/10/chartex" xmlns:cx5="http://schemas.microsoft.com/office/drawing/2016/5/11/chartex" xmlns:cx6="http://schemas.microsoft.com/office/drawing/2016/5/12/chartex" xmlns:cx7="http://schemas.microsoft.com/office/drawing/2016/5/13/chartex" xmlns:cx8="http://schemas.microsoft.com/office/drawing/2016/5/14/chartex" xmlns:mc="http://schemas.openxmlformats.org/markup-compatibility/2006" xmlns:aink="http://schemas.microsoft.com/office/drawing/2016/ink" xmlns:am3d="http://schemas.microsoft.com/office/drawing/2017/model3d" xmlns:o="urn:schemas-microsoft-com:office:office" xmlns:r="http://schemas.openxmlformats.org/officeDocument/2006/relationships" xmlns:m="http://schemas.openxmlformats.org/officeDocument/2006/math" xmlns:v="urn:schemas-microsoft-com:vml" xmlns:wp14="http://schemas.microsoft.com/office/word/2010/wordprocessingDrawing" xmlns:wp="http://schemas.openxmlformats.org/drawingml/2006/wordprocessingDrawing" xmlns:w10="urn:schemas-microsoft-com:office:word" xmlns:w="http://schemas.openxmlformats.org/wordprocessingml/2006/main" xmlns:w14="http://schemas.microsoft.com/office/word/2010/wordml" xmlns:w15="http://schemas.microsoft.com/office/word/2012/wordml" xmlns:w16cex="http://schemas.microsoft.com/office/word/2018/wordml/cex" xmlns:w16cid="http://schemas.microsoft.com/office/word/2016/wordml/cid" xmlns:w16="http://schemas.microsoft.com/office/word/2018/wordml" xmlns:w16sdtdh="http://schemas.microsoft.com/office/word/2020/wordml/sdtdatahash" xmlns:w16se="http://schemas.microsoft.com/office/word/2015/wordml/symex" xmlns:wpg="http://schemas.microsoft.com/office/word/2010/wordprocessingGroup" xmlns:wpi="http://schemas.microsoft.com/office/word/2010/wordprocessingInk" xmlns:wne="http://schemas.microsoft.com/office/word/2006/wordml" xmlns:wps="http://schemas.microsoft.com/office/word/2010/wordprocessingShape" mc:Ignorable="w14 w15 w16se w16cid w16 w16cex w16sdtdh wp14">
   <w:abstractNum w:abstractNumId="0" w15:restartNumberingAfterBreak="0">
-    <w:nsid w:val="030E5289"/>
+    <w:nsid w:val="004F0EF0"/>
     <w:multiLevelType w:val="singleLevel"/>
     <w:tmpl w:val="04090001"/>
     <w:lvl w:ilvl="0">
@@ -10668,7 +10667,7 @@
     </w:lvl>
   </w:abstractNum>
   <w:abstractNum w:abstractNumId="1" w15:restartNumberingAfterBreak="0">
-    <w:nsid w:val="06CC6272"/>
+    <w:nsid w:val="01A424FA"/>
     <w:multiLevelType w:val="singleLevel"/>
     <w:tmpl w:val="04090001"/>
     <w:lvl w:ilvl="0">
@@ -10685,7 +10684,7 @@
     </w:lvl>
   </w:abstractNum>
   <w:abstractNum w:abstractNumId="2" w15:restartNumberingAfterBreak="0">
-    <w:nsid w:val="08363CB4"/>
+    <w:nsid w:val="02150C0F"/>
     <w:multiLevelType w:val="singleLevel"/>
     <w:tmpl w:val="04090001"/>
     <w:lvl w:ilvl="0">
@@ -10702,7 +10701,7 @@
     </w:lvl>
   </w:abstractNum>
   <w:abstractNum w:abstractNumId="3" w15:restartNumberingAfterBreak="0">
-    <w:nsid w:val="0AD84219"/>
+    <w:nsid w:val="04572921"/>
     <w:multiLevelType w:val="singleLevel"/>
     <w:tmpl w:val="04090001"/>
     <w:lvl w:ilvl="0">
@@ -10719,7 +10718,7 @@
     </w:lvl>
   </w:abstractNum>
   <w:abstractNum w:abstractNumId="4" w15:restartNumberingAfterBreak="0">
-    <w:nsid w:val="0B137C3F"/>
+    <w:nsid w:val="060E7703"/>
     <w:multiLevelType w:val="singleLevel"/>
     <w:tmpl w:val="04090001"/>
     <w:lvl w:ilvl="0">
@@ -10736,7 +10735,7 @@
     </w:lvl>
   </w:abstractNum>
   <w:abstractNum w:abstractNumId="5" w15:restartNumberingAfterBreak="0">
-    <w:nsid w:val="0C6D739D"/>
+    <w:nsid w:val="089C79A8"/>
     <w:multiLevelType w:val="singleLevel"/>
     <w:tmpl w:val="04090001"/>
     <w:lvl w:ilvl="0">
@@ -10753,7 +10752,7 @@
     </w:lvl>
   </w:abstractNum>
   <w:abstractNum w:abstractNumId="6" w15:restartNumberingAfterBreak="0">
-    <w:nsid w:val="1689498F"/>
+    <w:nsid w:val="090A778F"/>
     <w:multiLevelType w:val="singleLevel"/>
     <w:tmpl w:val="04090001"/>
     <w:lvl w:ilvl="0">
@@ -10770,7 +10769,7 @@
     </w:lvl>
   </w:abstractNum>
   <w:abstractNum w:abstractNumId="7" w15:restartNumberingAfterBreak="0">
-    <w:nsid w:val="189669FB"/>
+    <w:nsid w:val="0A0041DA"/>
     <w:multiLevelType w:val="singleLevel"/>
     <w:tmpl w:val="04090001"/>
     <w:lvl w:ilvl="0">
@@ -10787,7 +10786,7 @@
     </w:lvl>
   </w:abstractNum>
   <w:abstractNum w:abstractNumId="8" w15:restartNumberingAfterBreak="0">
-    <w:nsid w:val="1AD460AE"/>
+    <w:nsid w:val="0DDE22DB"/>
     <w:multiLevelType w:val="singleLevel"/>
     <w:tmpl w:val="04090001"/>
     <w:lvl w:ilvl="0">
@@ -10804,7 +10803,7 @@
     </w:lvl>
   </w:abstractNum>
   <w:abstractNum w:abstractNumId="9" w15:restartNumberingAfterBreak="0">
-    <w:nsid w:val="1B4A2072"/>
+    <w:nsid w:val="130B453F"/>
     <w:multiLevelType w:val="singleLevel"/>
     <w:tmpl w:val="04090001"/>
     <w:lvl w:ilvl="0">
@@ -10821,7 +10820,7 @@
     </w:lvl>
   </w:abstractNum>
   <w:abstractNum w:abstractNumId="10" w15:restartNumberingAfterBreak="0">
-    <w:nsid w:val="1BAE18F8"/>
+    <w:nsid w:val="13D3436B"/>
     <w:multiLevelType w:val="singleLevel"/>
     <w:tmpl w:val="04090001"/>
     <w:lvl w:ilvl="0">
@@ -10838,7 +10837,7 @@
     </w:lvl>
   </w:abstractNum>
   <w:abstractNum w:abstractNumId="11" w15:restartNumberingAfterBreak="0">
-    <w:nsid w:val="1C701964"/>
+    <w:nsid w:val="168365B3"/>
     <w:multiLevelType w:val="singleLevel"/>
     <w:tmpl w:val="04090001"/>
     <w:lvl w:ilvl="0">
@@ -10855,7 +10854,7 @@
     </w:lvl>
   </w:abstractNum>
   <w:abstractNum w:abstractNumId="12" w15:restartNumberingAfterBreak="0">
-    <w:nsid w:val="223046F2"/>
+    <w:nsid w:val="1BB82A77"/>
     <w:multiLevelType w:val="singleLevel"/>
     <w:tmpl w:val="04090001"/>
     <w:lvl w:ilvl="0">
@@ -10872,7 +10871,7 @@
     </w:lvl>
   </w:abstractNum>
   <w:abstractNum w:abstractNumId="13" w15:restartNumberingAfterBreak="0">
-    <w:nsid w:val="223874BB"/>
+    <w:nsid w:val="20CB4C24"/>
     <w:multiLevelType w:val="singleLevel"/>
     <w:tmpl w:val="04090001"/>
     <w:lvl w:ilvl="0">
@@ -10889,7 +10888,7 @@
     </w:lvl>
   </w:abstractNum>
   <w:abstractNum w:abstractNumId="14" w15:restartNumberingAfterBreak="0">
-    <w:nsid w:val="2B5212A4"/>
+    <w:nsid w:val="234017D0"/>
     <w:multiLevelType w:val="singleLevel"/>
     <w:tmpl w:val="04090001"/>
     <w:lvl w:ilvl="0">
@@ -10906,7 +10905,7 @@
     </w:lvl>
   </w:abstractNum>
   <w:abstractNum w:abstractNumId="15" w15:restartNumberingAfterBreak="0">
-    <w:nsid w:val="2FAB74DE"/>
+    <w:nsid w:val="24C12F02"/>
     <w:multiLevelType w:val="singleLevel"/>
     <w:tmpl w:val="04090001"/>
     <w:lvl w:ilvl="0">
@@ -10923,7 +10922,7 @@
     </w:lvl>
   </w:abstractNum>
   <w:abstractNum w:abstractNumId="16" w15:restartNumberingAfterBreak="0">
-    <w:nsid w:val="2FF17FE3"/>
+    <w:nsid w:val="27232C3F"/>
     <w:multiLevelType w:val="singleLevel"/>
     <w:tmpl w:val="04090001"/>
     <w:lvl w:ilvl="0">
@@ -10940,7 +10939,7 @@
     </w:lvl>
   </w:abstractNum>
   <w:abstractNum w:abstractNumId="17" w15:restartNumberingAfterBreak="0">
-    <w:nsid w:val="329F4BB1"/>
+    <w:nsid w:val="2725722C"/>
     <w:multiLevelType w:val="singleLevel"/>
     <w:tmpl w:val="04090001"/>
     <w:lvl w:ilvl="0">
@@ -10957,7 +10956,7 @@
     </w:lvl>
   </w:abstractNum>
   <w:abstractNum w:abstractNumId="18" w15:restartNumberingAfterBreak="0">
-    <w:nsid w:val="3CBA6EB0"/>
+    <w:nsid w:val="28F33DA7"/>
     <w:multiLevelType w:val="singleLevel"/>
     <w:tmpl w:val="04090001"/>
     <w:lvl w:ilvl="0">
@@ -10974,7 +10973,7 @@
     </w:lvl>
   </w:abstractNum>
   <w:abstractNum w:abstractNumId="19" w15:restartNumberingAfterBreak="0">
-    <w:nsid w:val="3E8113D9"/>
+    <w:nsid w:val="291A7660"/>
     <w:multiLevelType w:val="singleLevel"/>
     <w:tmpl w:val="04090001"/>
     <w:lvl w:ilvl="0">
@@ -10991,7 +10990,7 @@
     </w:lvl>
   </w:abstractNum>
   <w:abstractNum w:abstractNumId="20" w15:restartNumberingAfterBreak="0">
-    <w:nsid w:val="3F920CEF"/>
+    <w:nsid w:val="2D4D1B04"/>
     <w:multiLevelType w:val="singleLevel"/>
     <w:tmpl w:val="04090001"/>
     <w:lvl w:ilvl="0">
@@ -11008,7 +11007,7 @@
     </w:lvl>
   </w:abstractNum>
   <w:abstractNum w:abstractNumId="21" w15:restartNumberingAfterBreak="0">
-    <w:nsid w:val="409728C8"/>
+    <w:nsid w:val="31497733"/>
     <w:multiLevelType w:val="singleLevel"/>
     <w:tmpl w:val="04090001"/>
     <w:lvl w:ilvl="0">
@@ -11025,7 +11024,7 @@
     </w:lvl>
   </w:abstractNum>
   <w:abstractNum w:abstractNumId="22" w15:restartNumberingAfterBreak="0">
-    <w:nsid w:val="42AF7289"/>
+    <w:nsid w:val="32442150"/>
     <w:multiLevelType w:val="singleLevel"/>
     <w:tmpl w:val="04090001"/>
     <w:lvl w:ilvl="0">
@@ -11042,7 +11041,7 @@
     </w:lvl>
   </w:abstractNum>
   <w:abstractNum w:abstractNumId="23" w15:restartNumberingAfterBreak="0">
-    <w:nsid w:val="44BC2BD9"/>
+    <w:nsid w:val="330A3F5D"/>
     <w:multiLevelType w:val="singleLevel"/>
     <w:tmpl w:val="04090001"/>
     <w:lvl w:ilvl="0">
@@ -11059,7 +11058,7 @@
     </w:lvl>
   </w:abstractNum>
   <w:abstractNum w:abstractNumId="24" w15:restartNumberingAfterBreak="0">
-    <w:nsid w:val="45A765F5"/>
+    <w:nsid w:val="38FC5206"/>
     <w:multiLevelType w:val="singleLevel"/>
     <w:tmpl w:val="04090001"/>
     <w:lvl w:ilvl="0">
@@ -11076,7 +11075,7 @@
     </w:lvl>
   </w:abstractNum>
   <w:abstractNum w:abstractNumId="25" w15:restartNumberingAfterBreak="0">
-    <w:nsid w:val="47AE177E"/>
+    <w:nsid w:val="408A2F82"/>
     <w:multiLevelType w:val="singleLevel"/>
     <w:tmpl w:val="04090001"/>
     <w:lvl w:ilvl="0">
@@ -11093,7 +11092,7 @@
     </w:lvl>
   </w:abstractNum>
   <w:abstractNum w:abstractNumId="26" w15:restartNumberingAfterBreak="0">
-    <w:nsid w:val="489A0B94"/>
+    <w:nsid w:val="46963819"/>
     <w:multiLevelType w:val="singleLevel"/>
     <w:tmpl w:val="04090001"/>
     <w:lvl w:ilvl="0">
@@ -11110,7 +11109,7 @@
     </w:lvl>
   </w:abstractNum>
   <w:abstractNum w:abstractNumId="27" w15:restartNumberingAfterBreak="0">
-    <w:nsid w:val="48D9627D"/>
+    <w:nsid w:val="46BD0F4B"/>
     <w:multiLevelType w:val="singleLevel"/>
     <w:tmpl w:val="04090001"/>
     <w:lvl w:ilvl="0">
@@ -11127,7 +11126,7 @@
     </w:lvl>
   </w:abstractNum>
   <w:abstractNum w:abstractNumId="28" w15:restartNumberingAfterBreak="0">
-    <w:nsid w:val="4C6D2854"/>
+    <w:nsid w:val="490C07B4"/>
     <w:multiLevelType w:val="singleLevel"/>
     <w:tmpl w:val="04090001"/>
     <w:lvl w:ilvl="0">
@@ -11144,7 +11143,7 @@
     </w:lvl>
   </w:abstractNum>
   <w:abstractNum w:abstractNumId="29" w15:restartNumberingAfterBreak="0">
-    <w:nsid w:val="5167347A"/>
+    <w:nsid w:val="53702EE2"/>
     <w:multiLevelType w:val="singleLevel"/>
     <w:tmpl w:val="04090001"/>
     <w:lvl w:ilvl="0">
@@ -11161,7 +11160,7 @@
     </w:lvl>
   </w:abstractNum>
   <w:abstractNum w:abstractNumId="30" w15:restartNumberingAfterBreak="0">
-    <w:nsid w:val="53506183"/>
+    <w:nsid w:val="537916C2"/>
     <w:multiLevelType w:val="singleLevel"/>
     <w:tmpl w:val="04090001"/>
     <w:lvl w:ilvl="0">
@@ -11178,7 +11177,7 @@
     </w:lvl>
   </w:abstractNum>
   <w:abstractNum w:abstractNumId="31" w15:restartNumberingAfterBreak="0">
-    <w:nsid w:val="54B27566"/>
+    <w:nsid w:val="544C3D76"/>
     <w:multiLevelType w:val="singleLevel"/>
     <w:tmpl w:val="04090001"/>
     <w:lvl w:ilvl="0">
@@ -11195,7 +11194,7 @@
     </w:lvl>
   </w:abstractNum>
   <w:abstractNum w:abstractNumId="32" w15:restartNumberingAfterBreak="0">
-    <w:nsid w:val="57B46FC5"/>
+    <w:nsid w:val="5A7D3D70"/>
     <w:multiLevelType w:val="singleLevel"/>
     <w:tmpl w:val="04090001"/>
     <w:lvl w:ilvl="0">
@@ -11212,7 +11211,7 @@
     </w:lvl>
   </w:abstractNum>
   <w:abstractNum w:abstractNumId="33" w15:restartNumberingAfterBreak="0">
-    <w:nsid w:val="57DE3540"/>
+    <w:nsid w:val="5BDF52C0"/>
     <w:multiLevelType w:val="singleLevel"/>
     <w:tmpl w:val="04090001"/>
     <w:lvl w:ilvl="0">
@@ -11229,7 +11228,7 @@
     </w:lvl>
   </w:abstractNum>
   <w:abstractNum w:abstractNumId="34" w15:restartNumberingAfterBreak="0">
-    <w:nsid w:val="587961B7"/>
+    <w:nsid w:val="5C2A0225"/>
     <w:multiLevelType w:val="singleLevel"/>
     <w:tmpl w:val="04090001"/>
     <w:lvl w:ilvl="0">
@@ -11246,7 +11245,7 @@
     </w:lvl>
   </w:abstractNum>
   <w:abstractNum w:abstractNumId="35" w15:restartNumberingAfterBreak="0">
-    <w:nsid w:val="5976585B"/>
+    <w:nsid w:val="62482E78"/>
     <w:multiLevelType w:val="singleLevel"/>
     <w:tmpl w:val="04090001"/>
     <w:lvl w:ilvl="0">
@@ -11263,7 +11262,7 @@
     </w:lvl>
   </w:abstractNum>
   <w:abstractNum w:abstractNumId="36" w15:restartNumberingAfterBreak="0">
-    <w:nsid w:val="5D5251FD"/>
+    <w:nsid w:val="62A0568A"/>
     <w:multiLevelType w:val="singleLevel"/>
     <w:tmpl w:val="04090001"/>
     <w:lvl w:ilvl="0">
@@ -11280,7 +11279,7 @@
     </w:lvl>
   </w:abstractNum>
   <w:abstractNum w:abstractNumId="37" w15:restartNumberingAfterBreak="0">
-    <w:nsid w:val="64474B0F"/>
+    <w:nsid w:val="662025EE"/>
     <w:multiLevelType w:val="singleLevel"/>
     <w:tmpl w:val="04090001"/>
     <w:lvl w:ilvl="0">
@@ -11297,7 +11296,7 @@
     </w:lvl>
   </w:abstractNum>
   <w:abstractNum w:abstractNumId="38" w15:restartNumberingAfterBreak="0">
-    <w:nsid w:val="68A679F5"/>
+    <w:nsid w:val="6B770ACE"/>
     <w:multiLevelType w:val="singleLevel"/>
     <w:tmpl w:val="04090001"/>
     <w:lvl w:ilvl="0">
@@ -11314,7 +11313,7 @@
     </w:lvl>
   </w:abstractNum>
   <w:abstractNum w:abstractNumId="39" w15:restartNumberingAfterBreak="0">
-    <w:nsid w:val="6B4B60DB"/>
+    <w:nsid w:val="6BA2704D"/>
     <w:multiLevelType w:val="singleLevel"/>
     <w:tmpl w:val="04090001"/>
     <w:lvl w:ilvl="0">
@@ -11331,7 +11330,7 @@
     </w:lvl>
   </w:abstractNum>
   <w:abstractNum w:abstractNumId="40" w15:restartNumberingAfterBreak="0">
-    <w:nsid w:val="6C596974"/>
+    <w:nsid w:val="72A90D89"/>
     <w:multiLevelType w:val="singleLevel"/>
     <w:tmpl w:val="04090001"/>
     <w:lvl w:ilvl="0">
@@ -11348,7 +11347,7 @@
     </w:lvl>
   </w:abstractNum>
   <w:abstractNum w:abstractNumId="41" w15:restartNumberingAfterBreak="0">
-    <w:nsid w:val="759A60F5"/>
+    <w:nsid w:val="738D4630"/>
     <w:multiLevelType w:val="singleLevel"/>
     <w:tmpl w:val="04090001"/>
     <w:lvl w:ilvl="0">
@@ -11365,7 +11364,7 @@
     </w:lvl>
   </w:abstractNum>
   <w:abstractNum w:abstractNumId="42" w15:restartNumberingAfterBreak="0">
-    <w:nsid w:val="7C6509F3"/>
+    <w:nsid w:val="76E04885"/>
     <w:multiLevelType w:val="singleLevel"/>
     <w:tmpl w:val="04090001"/>
     <w:lvl w:ilvl="0">
@@ -11382,7 +11381,7 @@
     </w:lvl>
   </w:abstractNum>
   <w:abstractNum w:abstractNumId="43" w15:restartNumberingAfterBreak="0">
-    <w:nsid w:val="7F622248"/>
+    <w:nsid w:val="79B5610F"/>
     <w:multiLevelType w:val="singleLevel"/>
     <w:tmpl w:val="04090001"/>
     <w:lvl w:ilvl="0">
@@ -11398,137 +11397,157 @@
       </w:rPr>
     </w:lvl>
   </w:abstractNum>
+  <w:abstractNum w:abstractNumId="44" w15:restartNumberingAfterBreak="0">
+    <w:nsid w:val="7E734CDC"/>
+    <w:multiLevelType w:val="singleLevel"/>
+    <w:tmpl w:val="04090001"/>
+    <w:lvl w:ilvl="0">
+      <w:start w:val="1"/>
+      <w:numFmt w:val="bullet"/>
+      <w:lvlText w:val=""/>
+      <w:lvlJc w:val="left"/>
+      <w:pPr>
+        <w:ind w:left="420" w:hanging="420"/>
+      </w:pPr>
+      <w:rPr>
+        <w:rFonts w:ascii="Wingdings" w:hAnsi="Wingdings" w:hint="default"/>
+      </w:rPr>
+    </w:lvl>
+  </w:abstractNum>
   <w:num w:numId="1">
+    <w:abstractNumId w:val="9"/>
+  </w:num>
+  <w:num w:numId="2">
+    <w:abstractNumId w:val="23"/>
+  </w:num>
+  <w:num w:numId="3">
+    <w:abstractNumId w:val="30"/>
+  </w:num>
+  <w:num w:numId="4">
+    <w:abstractNumId w:val="29"/>
+  </w:num>
+  <w:num w:numId="5">
+    <w:abstractNumId w:val="2"/>
+  </w:num>
+  <w:num w:numId="6">
+    <w:abstractNumId w:val="42"/>
+  </w:num>
+  <w:num w:numId="7">
+    <w:abstractNumId w:val="41"/>
+  </w:num>
+  <w:num w:numId="8">
+    <w:abstractNumId w:val="22"/>
+  </w:num>
+  <w:num w:numId="9">
+    <w:abstractNumId w:val="44"/>
+  </w:num>
+  <w:num w:numId="10">
+    <w:abstractNumId w:val="12"/>
+  </w:num>
+  <w:num w:numId="11">
+    <w:abstractNumId w:val="14"/>
+  </w:num>
+  <w:num w:numId="12">
+    <w:abstractNumId w:val="28"/>
+  </w:num>
+  <w:num w:numId="13">
+    <w:abstractNumId w:val="32"/>
+  </w:num>
+  <w:num w:numId="14">
+    <w:abstractNumId w:val="20"/>
+  </w:num>
+  <w:num w:numId="15">
+    <w:abstractNumId w:val="35"/>
+  </w:num>
+  <w:num w:numId="16">
+    <w:abstractNumId w:val="27"/>
+  </w:num>
+  <w:num w:numId="17">
+    <w:abstractNumId w:val="34"/>
+  </w:num>
+  <w:num w:numId="18">
+    <w:abstractNumId w:val="15"/>
+  </w:num>
+  <w:num w:numId="19">
+    <w:abstractNumId w:val="36"/>
+  </w:num>
+  <w:num w:numId="20">
+    <w:abstractNumId w:val="39"/>
+  </w:num>
+  <w:num w:numId="21">
+    <w:abstractNumId w:val="0"/>
+  </w:num>
+  <w:num w:numId="22">
+    <w:abstractNumId w:val="6"/>
+  </w:num>
+  <w:num w:numId="23">
+    <w:abstractNumId w:val="38"/>
+  </w:num>
+  <w:num w:numId="24">
+    <w:abstractNumId w:val="31"/>
+  </w:num>
+  <w:num w:numId="25">
+    <w:abstractNumId w:val="4"/>
+  </w:num>
+  <w:num w:numId="26">
+    <w:abstractNumId w:val="8"/>
+  </w:num>
+  <w:num w:numId="27">
+    <w:abstractNumId w:val="3"/>
+  </w:num>
+  <w:num w:numId="28">
+    <w:abstractNumId w:val="21"/>
+  </w:num>
+  <w:num w:numId="29">
+    <w:abstractNumId w:val="43"/>
+  </w:num>
+  <w:num w:numId="30">
     <w:abstractNumId w:val="7"/>
   </w:num>
-  <w:num w:numId="2">
-    <w:abstractNumId w:val="43"/>
-  </w:num>
-  <w:num w:numId="3">
-    <w:abstractNumId w:val="22"/>
-  </w:num>
-  <w:num w:numId="4">
-    <w:abstractNumId w:val="39"/>
-  </w:num>
-  <w:num w:numId="5">
-    <w:abstractNumId w:val="3"/>
-  </w:num>
-  <w:num w:numId="6">
-    <w:abstractNumId w:val="26"/>
-  </w:num>
-  <w:num w:numId="7">
-    <w:abstractNumId w:val="31"/>
-  </w:num>
-  <w:num w:numId="8">
-    <w:abstractNumId w:val="23"/>
-  </w:num>
-  <w:num w:numId="9">
-    <w:abstractNumId w:val="32"/>
-  </w:num>
-  <w:num w:numId="10">
-    <w:abstractNumId w:val="30"/>
-  </w:num>
-  <w:num w:numId="11">
-    <w:abstractNumId w:val="6"/>
-  </w:num>
-  <w:num w:numId="12">
-    <w:abstractNumId w:val="41"/>
-  </w:num>
-  <w:num w:numId="13">
-    <w:abstractNumId w:val="27"/>
-  </w:num>
-  <w:num w:numId="14">
-    <w:abstractNumId w:val="15"/>
-  </w:num>
-  <w:num w:numId="15">
-    <w:abstractNumId w:val="20"/>
-  </w:num>
-  <w:num w:numId="16">
-    <w:abstractNumId w:val="0"/>
-  </w:num>
-  <w:num w:numId="17">
+  <w:num w:numId="31">
     <w:abstractNumId w:val="18"/>
   </w:num>
-  <w:num w:numId="18">
+  <w:num w:numId="32">
     <w:abstractNumId w:val="5"/>
-  </w:num>
-  <w:num w:numId="19">
-    <w:abstractNumId w:val="13"/>
-  </w:num>
-  <w:num w:numId="20">
-    <w:abstractNumId w:val="29"/>
-  </w:num>
-  <w:num w:numId="21">
-    <w:abstractNumId w:val="34"/>
-  </w:num>
-  <w:num w:numId="22">
-    <w:abstractNumId w:val="42"/>
-  </w:num>
-  <w:num w:numId="23">
-    <w:abstractNumId w:val="37"/>
-  </w:num>
-  <w:num w:numId="24">
-    <w:abstractNumId w:val="38"/>
-  </w:num>
-  <w:num w:numId="25">
-    <w:abstractNumId w:val="16"/>
-  </w:num>
-  <w:num w:numId="26">
-    <w:abstractNumId w:val="12"/>
-  </w:num>
-  <w:num w:numId="27">
-    <w:abstractNumId w:val="21"/>
-  </w:num>
-  <w:num w:numId="28">
-    <w:abstractNumId w:val="14"/>
-  </w:num>
-  <w:num w:numId="29">
-    <w:abstractNumId w:val="4"/>
-  </w:num>
-  <w:num w:numId="30">
-    <w:abstractNumId w:val="11"/>
-  </w:num>
-  <w:num w:numId="31">
-    <w:abstractNumId w:val="28"/>
-  </w:num>
-  <w:num w:numId="32">
-    <w:abstractNumId w:val="24"/>
   </w:num>
   <w:num w:numId="33">
     <w:abstractNumId w:val="40"/>
   </w:num>
   <w:num w:numId="34">
+    <w:abstractNumId w:val="17"/>
+  </w:num>
+  <w:num w:numId="35">
+    <w:abstractNumId w:val="19"/>
+  </w:num>
+  <w:num w:numId="36">
+    <w:abstractNumId w:val="26"/>
+  </w:num>
+  <w:num w:numId="37">
+    <w:abstractNumId w:val="24"/>
+  </w:num>
+  <w:num w:numId="38">
+    <w:abstractNumId w:val="33"/>
+  </w:num>
+  <w:num w:numId="39">
+    <w:abstractNumId w:val="10"/>
+  </w:num>
+  <w:num w:numId="40">
     <w:abstractNumId w:val="1"/>
   </w:num>
-  <w:num w:numId="35">
-    <w:abstractNumId w:val="36"/>
+  <w:num w:numId="41">
+    <w:abstractNumId w:val="13"/>
   </w:num>
-  <w:num w:numId="36">
-    <w:abstractNumId w:val="10"/>
-  </w:num>
-  <w:num w:numId="37">
-    <w:abstractNumId w:val="35"/>
-  </w:num>
-  <w:num w:numId="38">
-    <w:abstractNumId w:val="2"/>
-  </w:num>
-  <w:num w:numId="39">
-    <w:abstractNumId w:val="9"/>
-  </w:num>
-  <w:num w:numId="40">
-    <w:abstractNumId w:val="19"/>
-  </w:num>
-  <w:num w:numId="41">
+  <w:num w:numId="42">
     <w:abstractNumId w:val="25"/>
   </w:num>
-  <w:num w:numId="42">
-    <w:abstractNumId w:val="17"/>
-  </w:num>
   <w:num w:numId="43">
-    <w:abstractNumId w:val="8"/>
+    <w:abstractNumId w:val="16"/>
   </w:num>
   <w:num w:numId="44">
-    <w:abstractNumId w:val="33"/>
+    <w:abstractNumId w:val="37"/>
+  </w:num>
+  <w:num w:numId="45">
+    <w:abstractNumId w:val="11"/>
   </w:num>
 </w:numbering>
 </file>
@@ -11948,7 +11967,7 @@
     <w:link w:val="10"/>
     <w:uiPriority w:val="9"/>
     <w:qFormat/>
-    <w:rsid w:val="00374065"/>
+    <w:rsid w:val="000F7E0A"/>
     <w:pPr>
       <w:keepNext/>
       <w:keepLines/>
@@ -11973,7 +11992,7 @@
     <w:uiPriority w:val="9"/>
     <w:unhideWhenUsed/>
     <w:qFormat/>
-    <w:rsid w:val="00374065"/>
+    <w:rsid w:val="000F7E0A"/>
     <w:pPr>
       <w:keepNext/>
       <w:keepLines/>
@@ -11997,7 +12016,7 @@
     <w:uiPriority w:val="9"/>
     <w:unhideWhenUsed/>
     <w:qFormat/>
-    <w:rsid w:val="00374065"/>
+    <w:rsid w:val="000F7E0A"/>
     <w:pPr>
       <w:keepNext/>
       <w:keepLines/>
@@ -12045,7 +12064,7 @@
     <w:basedOn w:val="a0"/>
     <w:link w:val="1"/>
     <w:uiPriority w:val="9"/>
-    <w:rsid w:val="00374065"/>
+    <w:rsid w:val="000F7E0A"/>
     <w:rPr>
       <w:rFonts w:ascii="微软雅黑" w:eastAsia="微软雅黑" w:hAnsi="SimSun"/>
       <w:b/>
@@ -12061,7 +12080,7 @@
     <w:basedOn w:val="a0"/>
     <w:link w:val="2"/>
     <w:uiPriority w:val="9"/>
-    <w:rsid w:val="00374065"/>
+    <w:rsid w:val="000F7E0A"/>
     <w:rPr>
       <w:rFonts w:ascii="微软雅黑" w:eastAsia="微软雅黑" w:hAnsi="微软雅黑" w:cstheme="majorBidi"/>
       <w:b/>
@@ -12076,7 +12095,7 @@
     <w:basedOn w:val="a0"/>
     <w:link w:val="3"/>
     <w:uiPriority w:val="9"/>
-    <w:rsid w:val="00374065"/>
+    <w:rsid w:val="000F7E0A"/>
     <w:rPr>
       <w:rFonts w:ascii="微软雅黑" w:eastAsia="微软雅黑" w:hAnsi="微软雅黑"/>
       <w:b/>
@@ -12092,7 +12111,7 @@
     <w:link w:val="a4"/>
     <w:uiPriority w:val="99"/>
     <w:unhideWhenUsed/>
-    <w:rsid w:val="00374065"/>
+    <w:rsid w:val="000F7E0A"/>
     <w:pPr>
       <w:pBdr>
         <w:bottom w:val="single" w:sz="6" w:space="1" w:color="auto"/>
@@ -12115,7 +12134,7 @@
     <w:basedOn w:val="a0"/>
     <w:link w:val="a3"/>
     <w:uiPriority w:val="99"/>
-    <w:rsid w:val="00374065"/>
+    <w:rsid w:val="000F7E0A"/>
     <w:rPr>
       <w:rFonts w:ascii="SimSun" w:eastAsia="SimSun" w:hAnsi="SimSun"/>
       <w:sz w:val="18"/>
@@ -12128,7 +12147,7 @@
     <w:link w:val="a6"/>
     <w:uiPriority w:val="99"/>
     <w:unhideWhenUsed/>
-    <w:rsid w:val="00374065"/>
+    <w:rsid w:val="000F7E0A"/>
     <w:pPr>
       <w:tabs>
         <w:tab w:val="center" w:pos="4153"/>
@@ -12148,7 +12167,7 @@
     <w:basedOn w:val="a0"/>
     <w:link w:val="a5"/>
     <w:uiPriority w:val="99"/>
-    <w:rsid w:val="00374065"/>
+    <w:rsid w:val="000F7E0A"/>
     <w:rPr>
       <w:rFonts w:ascii="SimSun" w:eastAsia="SimSun" w:hAnsi="SimSun"/>
       <w:sz w:val="18"/>
@@ -12161,7 +12180,7 @@
     <w:uiPriority w:val="99"/>
     <w:semiHidden/>
     <w:unhideWhenUsed/>
-    <w:rsid w:val="00374065"/>
+    <w:rsid w:val="000F7E0A"/>
   </w:style>
   <w:style w:type="paragraph" w:styleId="TOC1">
     <w:name w:val="toc 1"/>
@@ -12170,7 +12189,7 @@
     <w:autoRedefine/>
     <w:uiPriority w:val="39"/>
     <w:unhideWhenUsed/>
-    <w:rsid w:val="00374065"/>
+    <w:rsid w:val="000F7E0A"/>
     <w:pPr>
       <w:ind w:left="0"/>
     </w:pPr>
@@ -12180,7 +12199,7 @@
     <w:basedOn w:val="a"/>
     <w:uiPriority w:val="34"/>
     <w:qFormat/>
-    <w:rsid w:val="00374065"/>
+    <w:rsid w:val="000F7E0A"/>
     <w:pPr>
       <w:ind w:firstLineChars="200" w:firstLine="420"/>
     </w:pPr>
@@ -12192,7 +12211,7 @@
     <w:autoRedefine/>
     <w:uiPriority w:val="39"/>
     <w:unhideWhenUsed/>
-    <w:rsid w:val="00374065"/>
+    <w:rsid w:val="000F7E0A"/>
     <w:pPr>
       <w:ind w:left="420"/>
     </w:pPr>

</xml_diff>